<commit_message>
In-progress snapshot: VFA/ALST/asymmetry sweep and RIR fixes (agents still running)
</commit_message>
<xml_diff>
--- a/clients/august_olivia/August_Olivia_3Day_Training_Plan.docx
+++ b/clients/august_olivia/August_Olivia_3Day_Training_Plan.docx
@@ -1680,7 +1680,7 @@
                 <w:sz w:val="16"/>
                 <w:szCs w:val="16"/>
               </w:rPr>
-              <w:t xml:space="preserve">45–50 lb × 5 @ 1–2 RIR</w:t>
+              <w:t xml:space="preserve">45–50 lb × 5 @ 2 RIR</w:t>
             </w:r>
           </w:p>
         </w:tc>
@@ -1822,7 +1822,7 @@
                 <w:sz w:val="16"/>
                 <w:szCs w:val="16"/>
               </w:rPr>
-              <w:t xml:space="preserve">15 lb × 5 @ 1–2 RIR</w:t>
+              <w:t xml:space="preserve">15 lb × 5 @ 2 RIR</w:t>
             </w:r>
           </w:p>
         </w:tc>
@@ -2901,7 +2901,7 @@
           <w:sz w:val="17"/>
           <w:szCs w:val="17"/>
         </w:rPr>
-        <w:t xml:space="preserve">ALST Index below the 5.5 kg/m² sarcopenia-risk threshold. Prescribe 3–5g creatine monohydrate daily with food, no loading phase. Saturates in 3–4 weeks. Well-supported for strength, power, and cognition; bone-density evidence is mixed, not settled — a possible upside alongside LIFTMOR-style loading, not a substitute for it.</w:t>
+        <w:t xml:space="preserve">ALST Index below the 5.5 kg/m² sarcopenia-risk threshold. 3–5g creatine monohydrate daily with food, no loading phase. Saturates in 3–4 weeks. Well-supported for strength, power, and cognition; bone-density evidence is mixed, not settled — a possible upside alongside LIFTMOR-style loading, not a substitute for it.</w:t>
       </w:r>
     </w:p>
     <w:p>
@@ -2926,7 +2926,7 @@
           <w:sz w:val="17"/>
           <w:szCs w:val="17"/>
         </w:rPr>
-        <w:t xml:space="preserve">15g collagen peptides + 50mg Vitamin C, taken 30–60 minutes before the loading session. Doubles collagen synthesis markers when paired with mechanical load (Shaw et al. 2017).</w:t>
+        <w:t xml:space="preserve">15g collagen peptides + 50mg Vitamin C, taken 45–60 minutes before the loading session. A connective-tissue support protocol taken consistently on training days over 12+ weeks — the benefit is structural and builds over time, not a pre-workout performance boost. Requires mechanical load to work. Ranks below protein and creatine in priority (Shaw et al. 2017).</w:t>
       </w:r>
     </w:p>
     <w:p>
@@ -3684,6 +3684,17 @@
               </w:rPr>
               <w:t xml:space="preserve">Chest tall, sit hips back, knees track over toes.</w:t>
             </w:r>
+            <w:r>
+              <w:rPr>
+                <w:rFonts w:ascii="Arial" w:cs="Arial" w:eastAsia="Arial" w:hAnsi="Arial"/>
+                <w:i/>
+                <w:iCs/>
+                <w:color w:val="00695C"/>
+                <w:sz w:val="14"/>
+                <w:szCs w:val="14"/>
+              </w:rPr>
+              <w:t xml:space="preserve">  2 RIR</w:t>
+            </w:r>
           </w:p>
         </w:tc>
       </w:tr>
@@ -4477,7 +4488,7 @@
                 <w:sz w:val="14"/>
                 <w:szCs w:val="14"/>
               </w:rPr>
-              <w:t xml:space="preserve">  1–2 RIR</w:t>
+              <w:t xml:space="preserve">  2 RIR</w:t>
             </w:r>
           </w:p>
         </w:tc>
@@ -4707,6 +4718,17 @@
                 <w:szCs w:val="17"/>
               </w:rPr>
               <w:t xml:space="preserve">Soft knees, hinge hips back, feel hamstring stretch.</w:t>
+            </w:r>
+            <w:r>
+              <w:rPr>
+                <w:rFonts w:ascii="Arial" w:cs="Arial" w:eastAsia="Arial" w:hAnsi="Arial"/>
+                <w:i/>
+                <w:iCs/>
+                <w:color w:val="00695C"/>
+                <w:sz w:val="14"/>
+                <w:szCs w:val="14"/>
+              </w:rPr>
+              <w:t xml:space="preserve">  2 RIR</w:t>
             </w:r>
           </w:p>
         </w:tc>
@@ -5265,6 +5287,17 @@
               </w:rPr>
               <w:t xml:space="preserve">Ribs down, press straight overhead, avoid arching.</w:t>
             </w:r>
+            <w:r>
+              <w:rPr>
+                <w:rFonts w:ascii="Arial" w:cs="Arial" w:eastAsia="Arial" w:hAnsi="Arial"/>
+                <w:i/>
+                <w:iCs/>
+                <w:color w:val="00695C"/>
+                <w:sz w:val="14"/>
+                <w:szCs w:val="14"/>
+              </w:rPr>
+              <w:t xml:space="preserve">  3+ RIR — sub-maximal, flagged shoulder</w:t>
+            </w:r>
           </w:p>
         </w:tc>
       </w:tr>
@@ -5493,6 +5526,17 @@
                 <w:szCs w:val="17"/>
               </w:rPr>
               <w:t xml:space="preserve">Hands under shoulders, hips level, full lockout.</w:t>
+            </w:r>
+            <w:r>
+              <w:rPr>
+                <w:rFonts w:ascii="Arial" w:cs="Arial" w:eastAsia="Arial" w:hAnsi="Arial"/>
+                <w:i/>
+                <w:iCs/>
+                <w:color w:val="00695C"/>
+                <w:sz w:val="14"/>
+                <w:szCs w:val="14"/>
+              </w:rPr>
+              <w:t xml:space="preserve">  2 RIR</w:t>
             </w:r>
           </w:p>
         </w:tc>
@@ -7412,6 +7456,17 @@
               </w:rPr>
               <w:t xml:space="preserve">Left leg first. Torso tall, back knee soft-tap.</w:t>
             </w:r>
+            <w:r>
+              <w:rPr>
+                <w:rFonts w:ascii="Arial" w:cs="Arial" w:eastAsia="Arial" w:hAnsi="Arial"/>
+                <w:i/>
+                <w:iCs/>
+                <w:color w:val="00695C"/>
+                <w:sz w:val="14"/>
+                <w:szCs w:val="14"/>
+              </w:rPr>
+              <w:t xml:space="preserve">  3+ RIR — technique day, no PRs</w:t>
+            </w:r>
           </w:p>
         </w:tc>
       </w:tr>
@@ -8172,6 +8227,17 @@
                 <w:szCs w:val="17"/>
               </w:rPr>
               <w:t xml:space="preserve">Hinge from hip, square hips to the floor.</w:t>
+            </w:r>
+            <w:r>
+              <w:rPr>
+                <w:rFonts w:ascii="Arial" w:cs="Arial" w:eastAsia="Arial" w:hAnsi="Arial"/>
+                <w:i/>
+                <w:iCs/>
+                <w:color w:val="00695C"/>
+                <w:sz w:val="14"/>
+                <w:szCs w:val="14"/>
+              </w:rPr>
+              <w:t xml:space="preserve">  3+ RIR — technique day</w:t>
             </w:r>
           </w:p>
         </w:tc>
@@ -9314,7 +9380,7 @@
                 <w:sz w:val="14"/>
                 <w:szCs w:val="14"/>
               </w:rPr>
-              <w:t xml:space="preserve">  1–2 RIR</w:t>
+              <w:t xml:space="preserve">  2 RIR</w:t>
             </w:r>
           </w:p>
         </w:tc>
@@ -9544,6 +9610,17 @@
                 <w:szCs w:val="17"/>
               </w:rPr>
               <w:t xml:space="preserve">Lower bench height only if form holds clean.</w:t>
+            </w:r>
+            <w:r>
+              <w:rPr>
+                <w:rFonts w:ascii="Arial" w:cs="Arial" w:eastAsia="Arial" w:hAnsi="Arial"/>
+                <w:i/>
+                <w:iCs/>
+                <w:color w:val="00695C"/>
+                <w:sz w:val="14"/>
+                <w:szCs w:val="14"/>
+              </w:rPr>
+              <w:t xml:space="preserve">  1 RIR</w:t>
             </w:r>
           </w:p>
         </w:tc>
@@ -10101,6 +10178,17 @@
                 <w:szCs w:val="17"/>
               </w:rPr>
               <w:t xml:space="preserve">Right first. Flat back, pull elbow to hip.</w:t>
+            </w:r>
+            <w:r>
+              <w:rPr>
+                <w:rFonts w:ascii="Arial" w:cs="Arial" w:eastAsia="Arial" w:hAnsi="Arial"/>
+                <w:i/>
+                <w:iCs/>
+                <w:color w:val="00695C"/>
+                <w:sz w:val="14"/>
+                <w:szCs w:val="14"/>
+              </w:rPr>
+              <w:t xml:space="preserve">  2 RIR</w:t>
             </w:r>
           </w:p>
         </w:tc>
@@ -12008,7 +12096,7 @@
           <w:sz w:val="17"/>
           <w:szCs w:val="17"/>
         </w:rPr>
-        <w:t xml:space="preserve">Squat 40–42.5 lb × 5 @ 1–2 RIR. Hip thrust 55–60 lb × 5. Plank 60s. Right shoulder unilateral load within 20% of left on single-arm row.</w:t>
+        <w:t xml:space="preserve">Squat 40–42.5 lb × 5 @ 2 RIR. Hip thrust 55–60 lb × 5. Plank 60s. Right shoulder unilateral load within 20% of left on single-arm row.</w:t>
       </w:r>
     </w:p>
     <w:p>
@@ -12033,7 +12121,7 @@
           <w:sz w:val="17"/>
           <w:szCs w:val="17"/>
         </w:rPr>
-        <w:t xml:space="preserve">Squat 45–50 lb × 5 @ 1–2 RIR. Deadlift and lunge baselines established and progressing. Plank 70–75s. Left/right leg LST gap reduced from 0.7 lbs.</w:t>
+        <w:t xml:space="preserve">Squat 45–50 lb × 5 @ 2 RIR. Deadlift and lunge baselines established and progressing. Plank 70–75s. Left/right leg LST gap reduced from 0.7 lbs.</w:t>
       </w:r>
     </w:p>
     <w:p>

</xml_diff>

<commit_message>
Checkpoint: batch 3 docx regenerations (Nancy/Rena re-verified, August first build post-restructure); Petra + CLIENTS.md sections still in progress
Co-Authored-By: Claude Fable 5 <noreply@anthropic.com>
Claude-Session: https://claude.ai/code/session_01VTRA12TAy4P16NRVKS4SK5
</commit_message>
<xml_diff>
--- a/clients/august_olivia/August_Olivia_3Day_Training_Plan.docx
+++ b/clients/august_olivia/August_Olivia_3Day_Training_Plan.docx
@@ -2808,6 +2808,56 @@
           <w:szCs w:val="17"/>
         </w:rPr>
         <w:t xml:space="preserve">Not yet tested. Establish working loads under direct coach supervision in the Week 1 session, then add to the programmed baseline table above.</w:t>
+      </w:r>
+    </w:p>
+    <w:p>
+      <w:pPr>
+        <w:spacing w:after="100"/>
+      </w:pPr>
+      <w:r>
+        <w:rPr>
+          <w:rFonts w:ascii="Arial" w:cs="Arial" w:eastAsia="Arial" w:hAnsi="Arial"/>
+          <w:b/>
+          <w:bCs/>
+          <w:color w:val="1565C0"/>
+          <w:sz w:val="17"/>
+          <w:szCs w:val="17"/>
+        </w:rPr>
+        <w:t xml:space="preserve">Planned Lighter Week — Week 5, Flexible:  </w:t>
+      </w:r>
+      <w:r>
+        <w:rPr>
+          <w:rFonts w:ascii="Arial" w:cs="Arial" w:eastAsia="Arial" w:hAnsi="Arial"/>
+          <w:color w:val="2C2C2C"/>
+          <w:sz w:val="17"/>
+          <w:szCs w:val="17"/>
+        </w:rPr>
+        <w:t xml:space="preserve">One deliberately lighter week is built into this program's rhythm: Week 5, directly after the Week 4 strength check. Same exercises and movement patterns, sets reduced by roughly a third, every set held comfortably in the technique band (3 or more reps in reserve), loads held at Week 3-4 levels — the usual add-weight rule pauses for that one week, then Weeks 6-8 rebuild toward the 8-week targets. With recovery running well this lighter week is flexible rather than fixed: it can slide a week later if everything feels strong, or move up if sleep, soreness, or session quality dip — her coach makes that call with her. One light week costs nothing that matters for the muscle-building priority: muscle built over the previous month is not lost in a single reduced-volume week — only a small edge of peak strength dips, and it returns within days.</w:t>
+      </w:r>
+    </w:p>
+    <w:p>
+      <w:pPr>
+        <w:spacing w:after="100"/>
+      </w:pPr>
+      <w:r>
+        <w:rPr>
+          <w:rFonts w:ascii="Arial" w:cs="Arial" w:eastAsia="Arial" w:hAnsi="Arial"/>
+          <w:b/>
+          <w:bCs/>
+          <w:color w:val="C9A227"/>
+          <w:sz w:val="17"/>
+          <w:szCs w:val="17"/>
+        </w:rPr>
+        <w:t xml:space="preserve">Session Architecture — ICONS Block Method Restructure (8/19/2026):  </w:t>
+      </w:r>
+      <w:r>
+        <w:rPr>
+          <w:rFonts w:ascii="Arial" w:cs="Arial" w:eastAsia="Arial" w:hAnsi="Arial"/>
+          <w:color w:val="2C2C2C"/>
+          <w:sz w:val="17"/>
+          <w:szCs w:val="17"/>
+        </w:rPr>
+        <w:t xml:space="preserve">Restructured to the ICONS Block Method six-slot session architecture (Corrective → Primary Compound → Accessory → Jason's Exercise → Secondary Compound → Third Compound/Integration; see CLAUDE.md). Slot 4 omitted all days — no Jason Bethea relationship on file, re-verified. Slot 1: Day 2's existing corrective circuit; Day 3 opens with Band Pull-Apart resequenced out of the old pull block as scapular/cuff preparation before pressing (serves the clinical note's own "rotator cuff and scapular stability work every session" instruction with existing content); Day 1 omitted (warm-up activation only, legitimately in prose). One latent fix: Day 1's bodyweight pattern set now renders before the loaded goblet squat, matching its own cue. New Day 1 integration carry (20-25 lb/hand) anchors at/below the tested 25 lb/hand baseline. Wk1→Wk4 convention applied only where documented targets exist (Goblet 35→40-42.5, Hip Thrust 45→55-60 from milestones4wk; RDL 17.5→20-22.5 by Wk8 from the baselines table); shoulder-governed lifts deliberately keep flat controlled loads — their progression is capacity-governed by the right-shoulder protocol. Day 2 Block A intro's retired screening-as-risk-prediction ACL framing corrected to injury-prevention framing (Nicolette Scott precedent — exercises unchanged). Options menus constraint-filtered: every press option carries the right-leads/controlled-load rule and no near-maximal bilateral overhead option is listed; every unilateral lower option is left-led; KB goblet excluded (35 lb load &gt; 25 lb KB ceiling). Deload: autoregulated combined model (25, robust, moderate intensities, no rehab flags). Carry-hand policy unchanged: sides even — the arm LST gap is below the ≥10% trigger and the shoulder force deficit is governed by its own controlled-load rule, so no carry lead is fabricated.</w:t>
       </w:r>
     </w:p>
     <w:p>
@@ -3162,7 +3212,7 @@
           <w:sz w:val="17"/>
           <w:szCs w:val="17"/>
         </w:rPr>
-        <w:t xml:space="preserve">A — PRIMARY LOWER — SQUAT</w:t>
+        <w:t xml:space="preserve">A — PRIMARY COMPOUND — GOBLET SQUAT</w:t>
       </w:r>
     </w:p>
     <w:p>
@@ -3187,7 +3237,7 @@
           <w:sz w:val="17"/>
           <w:szCs w:val="17"/>
         </w:rPr>
-        <w:t xml:space="preserve">Goblet position, DB held at chest. Full-Body Foundation lift for the day — own the depth and bracing pattern before adding load.</w:t>
+        <w:t xml:space="preserve">Goblet position, DB held at chest. Full-Body Foundation lift for the day — the bodyweight pattern set runs first, then own the depth and bracing pattern under load. If the day calls for a variation, rotate between: a box squat (depth set by the box), a split-stance squat (left leg leads), or a landmine squat. The goblet squat stays the lift we track toward the 4-week check.</w:t>
       </w:r>
     </w:p>
     <w:tbl>
@@ -3487,7 +3537,7 @@
                 <w:sz w:val="18"/>
                 <w:szCs w:val="18"/>
               </w:rPr>
-              <w:t xml:space="preserve">DB Goblet Squat</w:t>
+              <w:t xml:space="preserve">Bodyweight Squat (pattern set)</w:t>
             </w:r>
           </w:p>
         </w:tc>
@@ -3520,7 +3570,7 @@
                 <w:sz w:val="15"/>
                 <w:szCs w:val="15"/>
               </w:rPr>
-              <w:t xml:space="preserve">3</w:t>
+              <w:t xml:space="preserve">1</w:t>
             </w:r>
           </w:p>
         </w:tc>
@@ -3553,7 +3603,7 @@
                 <w:sz w:val="15"/>
                 <w:szCs w:val="15"/>
               </w:rPr>
-              <w:t xml:space="preserve">5</w:t>
+              <w:t xml:space="preserve">10</w:t>
             </w:r>
           </w:p>
         </w:tc>
@@ -3586,7 +3636,7 @@
                 <w:sz w:val="15"/>
                 <w:szCs w:val="15"/>
               </w:rPr>
-              <w:t xml:space="preserve">35 lb</w:t>
+              <w:t xml:space="preserve">BW</w:t>
             </w:r>
           </w:p>
         </w:tc>
@@ -3619,7 +3669,7 @@
                 <w:sz w:val="15"/>
                 <w:szCs w:val="15"/>
               </w:rPr>
-              <w:t xml:space="preserve">3-1-1</w:t>
+              <w:t xml:space="preserve">2-0-1</w:t>
             </w:r>
           </w:p>
         </w:tc>
@@ -3652,7 +3702,7 @@
                 <w:sz w:val="15"/>
                 <w:szCs w:val="15"/>
               </w:rPr>
-              <w:t xml:space="preserve">90s</w:t>
+              <w:t xml:space="preserve">—</w:t>
             </w:r>
           </w:p>
         </w:tc>
@@ -3682,7 +3732,7 @@
                 <w:sz w:val="17"/>
                 <w:szCs w:val="17"/>
               </w:rPr>
-              <w:t xml:space="preserve">Chest tall, sit hips back, knees track over toes.</w:t>
+              <w:t xml:space="preserve">Warm-up pattern set before loaded work.</w:t>
             </w:r>
             <w:r>
               <w:rPr>
@@ -3693,7 +3743,7 @@
                 <w:sz w:val="14"/>
                 <w:szCs w:val="14"/>
               </w:rPr>
-              <w:t xml:space="preserve">  2 RIR</w:t>
+              <w:t xml:space="preserve">  3+ RIR</w:t>
             </w:r>
           </w:p>
         </w:tc>
@@ -3727,7 +3777,7 @@
                 <w:sz w:val="18"/>
                 <w:szCs w:val="18"/>
               </w:rPr>
-              <w:t xml:space="preserve">Bodyweight Squat (pattern set)</w:t>
+              <w:t xml:space="preserve">DB Goblet Squat</w:t>
             </w:r>
           </w:p>
         </w:tc>
@@ -3760,7 +3810,7 @@
                 <w:sz w:val="15"/>
                 <w:szCs w:val="15"/>
               </w:rPr>
-              <w:t xml:space="preserve">1</w:t>
+              <w:t xml:space="preserve">3</w:t>
             </w:r>
           </w:p>
         </w:tc>
@@ -3793,7 +3843,7 @@
                 <w:sz w:val="15"/>
                 <w:szCs w:val="15"/>
               </w:rPr>
-              <w:t xml:space="preserve">10</w:t>
+              <w:t xml:space="preserve">5</w:t>
             </w:r>
           </w:p>
         </w:tc>
@@ -3826,7 +3876,7 @@
                 <w:sz w:val="15"/>
                 <w:szCs w:val="15"/>
               </w:rPr>
-              <w:t xml:space="preserve">BW</w:t>
+              <w:t xml:space="preserve">Wk1: 35 lb → Wk4: 40–42.5 lb</w:t>
             </w:r>
           </w:p>
         </w:tc>
@@ -3859,7 +3909,7 @@
                 <w:sz w:val="15"/>
                 <w:szCs w:val="15"/>
               </w:rPr>
-              <w:t xml:space="preserve">2-0-1</w:t>
+              <w:t xml:space="preserve">3-1-1</w:t>
             </w:r>
           </w:p>
         </w:tc>
@@ -3892,7 +3942,7 @@
                 <w:sz w:val="15"/>
                 <w:szCs w:val="15"/>
               </w:rPr>
-              <w:t xml:space="preserve">—</w:t>
+              <w:t xml:space="preserve">90s</w:t>
             </w:r>
           </w:p>
         </w:tc>
@@ -3922,7 +3972,7 @@
                 <w:sz w:val="17"/>
                 <w:szCs w:val="17"/>
               </w:rPr>
-              <w:t xml:space="preserve">Warm-up pattern set before loaded work.</w:t>
+              <w:t xml:space="preserve">Baseline 35 lb ×5. Chest tall, sit hips back, knees track over toes.</w:t>
             </w:r>
             <w:r>
               <w:rPr>
@@ -3933,7 +3983,7 @@
                 <w:sz w:val="14"/>
                 <w:szCs w:val="14"/>
               </w:rPr>
-              <w:t xml:space="preserve">  3+ RIR</w:t>
+              <w:t xml:space="preserve">  2 RIR</w:t>
             </w:r>
           </w:p>
         </w:tc>
@@ -3957,7 +4007,7 @@
           <w:sz w:val="17"/>
           <w:szCs w:val="17"/>
         </w:rPr>
-        <w:t xml:space="preserve">B — POSTERIOR CHAIN</w:t>
+        <w:t xml:space="preserve">B — ACCESSORY — POSTERIOR CHAIN</w:t>
       </w:r>
     </w:p>
     <w:p>
@@ -3982,7 +4032,7 @@
           <w:sz w:val="17"/>
           <w:szCs w:val="17"/>
         </w:rPr>
-        <w:t xml:space="preserve">Hip thrust and RDL build the posterior chain that supports every lift on the baseline sheet.</w:t>
+        <w:t xml:space="preserve">Hip thrust and RDL build the posterior chain that supports every lift on the baseline sheet — the muscle-building accessory work directly behind the squat. Hip thrust variations when the day calls for one: a floor glute bridge, a single-leg glute bridge (left leg leads), or a B-stance hip thrust (left leg takes the working share) — the barbell hip thrust stays the lift we track.</w:t>
       </w:r>
     </w:p>
     <w:tbl>
@@ -4381,7 +4431,7 @@
                 <w:sz w:val="15"/>
                 <w:szCs w:val="15"/>
               </w:rPr>
-              <w:t xml:space="preserve">45 lb</w:t>
+              <w:t xml:space="preserve">Wk1: 45 lb → Wk4: 55–60 lb</w:t>
             </w:r>
           </w:p>
         </w:tc>
@@ -4477,7 +4527,7 @@
                 <w:sz w:val="17"/>
                 <w:szCs w:val="17"/>
               </w:rPr>
-              <w:t xml:space="preserve">Chin tucked, ribs down, drive through heels.</w:t>
+              <w:t xml:space="preserve">Baseline 45 lb ×5. Chin tucked, ribs down, drive through heels.</w:t>
             </w:r>
             <w:r>
               <w:rPr>
@@ -4621,7 +4671,7 @@
                 <w:sz w:val="15"/>
                 <w:szCs w:val="15"/>
               </w:rPr>
-              <w:t xml:space="preserve">17.5 lb/hand</w:t>
+              <w:t xml:space="preserve">Wk1: 17.5 lb/hand → 20–22.5 lb by Wk8</w:t>
             </w:r>
           </w:p>
         </w:tc>
@@ -4752,7 +4802,7 @@
           <w:sz w:val="17"/>
           <w:szCs w:val="17"/>
         </w:rPr>
-        <w:t xml:space="preserve">C — UPPER PRESS &amp; CORE</w:t>
+        <w:t xml:space="preserve">C — SECONDARY COMPOUND — UPPER PRESS</w:t>
       </w:r>
     </w:p>
     <w:p>
@@ -4777,7 +4827,7 @@
           <w:sz w:val="17"/>
           <w:szCs w:val="17"/>
         </w:rPr>
-        <w:t xml:space="preserve">Right shoulder leads at reduced load with strict control — see clinical flag above.</w:t>
+        <w:t xml:space="preserve">The day's second compound pattern — pressing, rotating off the lower-body work above. Right shoulder leads at reduced load with strict control — see clinical flag above. If the day calls for a press variation, rotate between: a half-kneeling single-arm DB press (right arm leads, reduced load) or a landmine press (the shoulder-friendly arc) — both live inside the same controlled-load shoulder rule, and heavy bilateral overhead loading stays off the menu until the deficit is reassessed. The seated press stays the movement we track.</w:t>
       </w:r>
     </w:p>
     <w:tbl>
@@ -5541,6 +5591,321 @@
           </w:p>
         </w:tc>
       </w:tr>
+    </w:tbl>
+    <w:p>
+      <w:pPr>
+        <w:spacing w:after="100"/>
+      </w:pPr>
+    </w:p>
+    <w:p>
+      <w:pPr>
+        <w:spacing w:after="60" w:before="120"/>
+      </w:pPr>
+      <w:r>
+        <w:rPr>
+          <w:rFonts w:ascii="Arial" w:cs="Arial" w:eastAsia="Arial" w:hAnsi="Arial"/>
+          <w:b/>
+          <w:bCs/>
+          <w:color w:val="C9A227"/>
+          <w:sz w:val="17"/>
+          <w:szCs w:val="17"/>
+        </w:rPr>
+        <w:t xml:space="preserve">D — FULL-BODY INTEGRATION — FARMER CARRY &amp; CORE</w:t>
+      </w:r>
+    </w:p>
+    <w:p>
+      <w:pPr>
+        <w:spacing w:after="80"/>
+      </w:pPr>
+      <w:r>
+        <w:rPr>
+          <w:rFonts w:ascii="Arial" w:cs="Arial" w:eastAsia="Arial" w:hAnsi="Arial"/>
+          <w:b/>
+          <w:bCs/>
+          <w:color w:val="C9A227"/>
+          <w:sz w:val="17"/>
+          <w:szCs w:val="17"/>
+        </w:rPr>
+        <w:t xml:space="preserve">Why:  </w:t>
+      </w:r>
+      <w:r>
+        <w:rPr>
+          <w:rFonts w:ascii="Arial" w:cs="Arial" w:eastAsia="Arial" w:hAnsi="Arial"/>
+          <w:color w:val="2C2C2C"/>
+          <w:sz w:val="17"/>
+          <w:szCs w:val="17"/>
+        </w:rPr>
+        <w:t xml:space="preserve">The session's closing compound — a light loaded walk pulling the day's squat depth, hip drive, and pressing posture together under gait, then core under load. Loads start at or below the tested 25 lb/hand carry baseline. Distance and quality govern the carry, not a rep count. A suitcase carry (one side at a time, alternating evenly) covers the same closing ground when variety suits the day.</w:t>
+      </w:r>
+    </w:p>
+    <w:tbl>
+      <w:tblPr>
+        <w:tblW w:type="dxa" w:w="10440"/>
+        <w:tblBorders>
+          <w:top w:val="none" w:color="FFFFFF" w:sz="0"/>
+          <w:left w:val="none" w:color="FFFFFF" w:sz="0"/>
+          <w:bottom w:val="none" w:color="FFFFFF" w:sz="0"/>
+          <w:right w:val="none" w:color="FFFFFF" w:sz="0"/>
+          <w:insideH w:val="single" w:color="auto" w:sz="4"/>
+          <w:insideV w:val="single" w:color="auto" w:sz="4"/>
+        </w:tblBorders>
+      </w:tblPr>
+      <w:tblGrid>
+        <w:gridCol w:w="2400"/>
+        <w:gridCol w:w="380"/>
+        <w:gridCol w:w="420"/>
+        <w:gridCol w:w="680"/>
+        <w:gridCol w:w="540"/>
+        <w:gridCol w:w="440"/>
+        <w:gridCol w:w="5580"/>
+      </w:tblGrid>
+      <w:tr>
+        <w:tc>
+          <w:tcPr>
+            <w:tcW w:type="dxa" w:w="2400"/>
+            <w:tcBorders>
+              <w:top w:val="none" w:color="FFFFFF" w:sz="0"/>
+              <w:left w:val="none" w:color="FFFFFF" w:sz="0"/>
+              <w:bottom w:val="none" w:color="FFFFFF" w:sz="0"/>
+              <w:right w:val="none" w:color="FFFFFF" w:sz="0"/>
+            </w:tcBorders>
+            <w:shd w:fill="F5E8C0" w:color="auto" w:val="clear"/>
+            <w:tcMar>
+              <w:top w:type="dxa" w:w="40"/>
+              <w:left w:type="dxa" w:w="80"/>
+              <w:bottom w:type="dxa" w:w="40"/>
+              <w:right w:type="dxa" w:w="80"/>
+            </w:tcMar>
+            <w:vAlign w:val="center"/>
+          </w:tcPr>
+          <w:p>
+            <w:pPr>
+              <w:jc w:val="left"/>
+            </w:pPr>
+            <w:r>
+              <w:rPr>
+                <w:rFonts w:ascii="Arial" w:cs="Arial" w:eastAsia="Arial" w:hAnsi="Arial"/>
+                <w:b/>
+                <w:bCs/>
+                <w:color w:val="C9A227"/>
+                <w:sz w:val="15"/>
+                <w:szCs w:val="15"/>
+              </w:rPr>
+              <w:t xml:space="preserve">EXERCISE</w:t>
+            </w:r>
+          </w:p>
+        </w:tc>
+        <w:tc>
+          <w:tcPr>
+            <w:tcW w:type="dxa" w:w="380"/>
+            <w:tcBorders>
+              <w:top w:val="none" w:color="FFFFFF" w:sz="0"/>
+              <w:left w:val="none" w:color="FFFFFF" w:sz="0"/>
+              <w:bottom w:val="none" w:color="FFFFFF" w:sz="0"/>
+              <w:right w:val="none" w:color="FFFFFF" w:sz="0"/>
+            </w:tcBorders>
+            <w:shd w:fill="F5E8C0" w:color="auto" w:val="clear"/>
+            <w:tcMar>
+              <w:top w:type="dxa" w:w="40"/>
+              <w:left w:type="dxa" w:w="80"/>
+              <w:bottom w:type="dxa" w:w="40"/>
+              <w:right w:type="dxa" w:w="80"/>
+            </w:tcMar>
+            <w:vAlign w:val="center"/>
+          </w:tcPr>
+          <w:p>
+            <w:pPr>
+              <w:jc w:val="center"/>
+            </w:pPr>
+            <w:r>
+              <w:rPr>
+                <w:rFonts w:ascii="Arial" w:cs="Arial" w:eastAsia="Arial" w:hAnsi="Arial"/>
+                <w:b/>
+                <w:bCs/>
+                <w:color w:val="C9A227"/>
+                <w:sz w:val="13"/>
+                <w:szCs w:val="13"/>
+              </w:rPr>
+              <w:t xml:space="preserve">SETS</w:t>
+            </w:r>
+          </w:p>
+        </w:tc>
+        <w:tc>
+          <w:tcPr>
+            <w:tcW w:type="dxa" w:w="420"/>
+            <w:tcBorders>
+              <w:top w:val="none" w:color="FFFFFF" w:sz="0"/>
+              <w:left w:val="none" w:color="FFFFFF" w:sz="0"/>
+              <w:bottom w:val="none" w:color="FFFFFF" w:sz="0"/>
+              <w:right w:val="none" w:color="FFFFFF" w:sz="0"/>
+            </w:tcBorders>
+            <w:shd w:fill="F5E8C0" w:color="auto" w:val="clear"/>
+            <w:tcMar>
+              <w:top w:type="dxa" w:w="40"/>
+              <w:left w:type="dxa" w:w="80"/>
+              <w:bottom w:type="dxa" w:w="40"/>
+              <w:right w:type="dxa" w:w="80"/>
+            </w:tcMar>
+            <w:vAlign w:val="center"/>
+          </w:tcPr>
+          <w:p>
+            <w:pPr>
+              <w:jc w:val="center"/>
+            </w:pPr>
+            <w:r>
+              <w:rPr>
+                <w:rFonts w:ascii="Arial" w:cs="Arial" w:eastAsia="Arial" w:hAnsi="Arial"/>
+                <w:b/>
+                <w:bCs/>
+                <w:color w:val="C9A227"/>
+                <w:sz w:val="13"/>
+                <w:szCs w:val="13"/>
+              </w:rPr>
+              <w:t xml:space="preserve">REPS</w:t>
+            </w:r>
+          </w:p>
+        </w:tc>
+        <w:tc>
+          <w:tcPr>
+            <w:tcW w:type="dxa" w:w="680"/>
+            <w:tcBorders>
+              <w:top w:val="none" w:color="FFFFFF" w:sz="0"/>
+              <w:left w:val="none" w:color="FFFFFF" w:sz="0"/>
+              <w:bottom w:val="none" w:color="FFFFFF" w:sz="0"/>
+              <w:right w:val="none" w:color="FFFFFF" w:sz="0"/>
+            </w:tcBorders>
+            <w:shd w:fill="F5E8C0" w:color="auto" w:val="clear"/>
+            <w:tcMar>
+              <w:top w:type="dxa" w:w="40"/>
+              <w:left w:type="dxa" w:w="80"/>
+              <w:bottom w:type="dxa" w:w="40"/>
+              <w:right w:type="dxa" w:w="80"/>
+            </w:tcMar>
+            <w:vAlign w:val="center"/>
+          </w:tcPr>
+          <w:p>
+            <w:pPr>
+              <w:jc w:val="center"/>
+            </w:pPr>
+            <w:r>
+              <w:rPr>
+                <w:rFonts w:ascii="Arial" w:cs="Arial" w:eastAsia="Arial" w:hAnsi="Arial"/>
+                <w:b/>
+                <w:bCs/>
+                <w:color w:val="C9A227"/>
+                <w:sz w:val="13"/>
+                <w:szCs w:val="13"/>
+              </w:rPr>
+              <w:t xml:space="preserve">LOAD</w:t>
+            </w:r>
+          </w:p>
+        </w:tc>
+        <w:tc>
+          <w:tcPr>
+            <w:tcW w:type="dxa" w:w="540"/>
+            <w:tcBorders>
+              <w:top w:val="none" w:color="FFFFFF" w:sz="0"/>
+              <w:left w:val="none" w:color="FFFFFF" w:sz="0"/>
+              <w:bottom w:val="none" w:color="FFFFFF" w:sz="0"/>
+              <w:right w:val="none" w:color="FFFFFF" w:sz="0"/>
+            </w:tcBorders>
+            <w:shd w:fill="F5E8C0" w:color="auto" w:val="clear"/>
+            <w:tcMar>
+              <w:top w:type="dxa" w:w="40"/>
+              <w:left w:type="dxa" w:w="80"/>
+              <w:bottom w:type="dxa" w:w="40"/>
+              <w:right w:type="dxa" w:w="80"/>
+            </w:tcMar>
+            <w:vAlign w:val="center"/>
+          </w:tcPr>
+          <w:p>
+            <w:pPr>
+              <w:jc w:val="center"/>
+            </w:pPr>
+            <w:r>
+              <w:rPr>
+                <w:rFonts w:ascii="Arial" w:cs="Arial" w:eastAsia="Arial" w:hAnsi="Arial"/>
+                <w:b/>
+                <w:bCs/>
+                <w:color w:val="C9A227"/>
+                <w:sz w:val="13"/>
+                <w:szCs w:val="13"/>
+              </w:rPr>
+              <w:t xml:space="preserve">TEMPO</w:t>
+            </w:r>
+          </w:p>
+        </w:tc>
+        <w:tc>
+          <w:tcPr>
+            <w:tcW w:type="dxa" w:w="440"/>
+            <w:tcBorders>
+              <w:top w:val="none" w:color="FFFFFF" w:sz="0"/>
+              <w:left w:val="none" w:color="FFFFFF" w:sz="0"/>
+              <w:bottom w:val="none" w:color="FFFFFF" w:sz="0"/>
+              <w:right w:val="none" w:color="FFFFFF" w:sz="0"/>
+            </w:tcBorders>
+            <w:shd w:fill="F5E8C0" w:color="auto" w:val="clear"/>
+            <w:tcMar>
+              <w:top w:type="dxa" w:w="40"/>
+              <w:left w:type="dxa" w:w="80"/>
+              <w:bottom w:type="dxa" w:w="40"/>
+              <w:right w:type="dxa" w:w="80"/>
+            </w:tcMar>
+            <w:vAlign w:val="center"/>
+          </w:tcPr>
+          <w:p>
+            <w:pPr>
+              <w:jc w:val="center"/>
+            </w:pPr>
+            <w:r>
+              <w:rPr>
+                <w:rFonts w:ascii="Arial" w:cs="Arial" w:eastAsia="Arial" w:hAnsi="Arial"/>
+                <w:b/>
+                <w:bCs/>
+                <w:color w:val="C9A227"/>
+                <w:sz w:val="13"/>
+                <w:szCs w:val="13"/>
+              </w:rPr>
+              <w:t xml:space="preserve">REST</w:t>
+            </w:r>
+          </w:p>
+        </w:tc>
+        <w:tc>
+          <w:tcPr>
+            <w:tcW w:type="dxa" w:w="5580"/>
+            <w:tcBorders>
+              <w:top w:val="none" w:color="FFFFFF" w:sz="0"/>
+              <w:left w:val="none" w:color="FFFFFF" w:sz="0"/>
+              <w:bottom w:val="none" w:color="FFFFFF" w:sz="0"/>
+              <w:right w:val="none" w:color="FFFFFF" w:sz="0"/>
+            </w:tcBorders>
+            <w:shd w:fill="F5E8C0" w:color="auto" w:val="clear"/>
+            <w:tcMar>
+              <w:top w:type="dxa" w:w="40"/>
+              <w:left w:type="dxa" w:w="80"/>
+              <w:bottom w:type="dxa" w:w="40"/>
+              <w:right w:type="dxa" w:w="80"/>
+            </w:tcMar>
+            <w:vAlign w:val="center"/>
+          </w:tcPr>
+          <w:p>
+            <w:pPr>
+              <w:jc w:val="left"/>
+            </w:pPr>
+            <w:r>
+              <w:rPr>
+                <w:rFonts w:ascii="Arial" w:cs="Arial" w:eastAsia="Arial" w:hAnsi="Arial"/>
+                <w:b/>
+                <w:bCs/>
+                <w:color w:val="C9A227"/>
+                <w:sz w:val="15"/>
+                <w:szCs w:val="15"/>
+              </w:rPr>
+              <w:t xml:space="preserve">COACHING CUE</w:t>
+            </w:r>
+          </w:p>
+        </w:tc>
+      </w:tr>
       <w:tr>
         <w:tc>
           <w:tcPr>
@@ -5570,7 +5935,7 @@
                 <w:sz w:val="18"/>
                 <w:szCs w:val="18"/>
               </w:rPr>
-              <w:t xml:space="preserve">Plank Hold</w:t>
+              <w:t xml:space="preserve">DB Farmer Carry (Light)</w:t>
             </w:r>
           </w:p>
         </w:tc>
@@ -5603,7 +5968,7 @@
                 <w:sz w:val="15"/>
                 <w:szCs w:val="15"/>
               </w:rPr>
-              <w:t xml:space="preserve">3</w:t>
+              <w:t xml:space="preserve">2</w:t>
             </w:r>
           </w:p>
         </w:tc>
@@ -5636,7 +6001,7 @@
                 <w:sz w:val="15"/>
                 <w:szCs w:val="15"/>
               </w:rPr>
-              <w:t xml:space="preserve">40–45s</w:t>
+              <w:t xml:space="preserve">20–25 yd</w:t>
             </w:r>
           </w:p>
         </w:tc>
@@ -5669,7 +6034,7 @@
                 <w:sz w:val="15"/>
                 <w:szCs w:val="15"/>
               </w:rPr>
-              <w:t xml:space="preserve">BW</w:t>
+              <w:t xml:space="preserve">20–25 lb/hand</w:t>
             </w:r>
           </w:p>
         </w:tc>
@@ -5735,6 +6100,246 @@
                 <w:sz w:val="15"/>
                 <w:szCs w:val="15"/>
               </w:rPr>
+              <w:t xml:space="preserve">60s</w:t>
+            </w:r>
+          </w:p>
+        </w:tc>
+        <w:tc>
+          <w:tcPr>
+            <w:tcW w:type="dxa" w:w="5580"/>
+            <w:tcBorders>
+              <w:top w:val="none" w:color="FFFFFF" w:sz="0"/>
+              <w:left w:val="none" w:color="FFFFFF" w:sz="0"/>
+              <w:bottom w:val="none" w:color="FFFFFF" w:sz="0"/>
+              <w:right w:val="none" w:color="FFFFFF" w:sz="0"/>
+            </w:tcBorders>
+            <w:shd w:fill="FAF3E0" w:color="auto" w:val="clear"/>
+            <w:tcMar>
+              <w:top w:type="dxa" w:w="40"/>
+              <w:left w:type="dxa" w:w="80"/>
+              <w:bottom w:type="dxa" w:w="40"/>
+              <w:right w:type="dxa" w:w="80"/>
+            </w:tcMar>
+            <w:vAlign w:val="center"/>
+          </w:tcPr>
+          <w:p>
+            <w:r>
+              <w:rPr>
+                <w:rFonts w:ascii="Arial" w:cs="Arial" w:eastAsia="Arial" w:hAnsi="Arial"/>
+                <w:color w:val="6B6B6B"/>
+                <w:sz w:val="17"/>
+                <w:szCs w:val="17"/>
+              </w:rPr>
+              <w:t xml:space="preserve">Tested 25 lb/hand. Tall posture, ribs stacked, quiet shoulders.</w:t>
+            </w:r>
+            <w:r>
+              <w:rPr>
+                <w:rFonts w:ascii="Arial" w:cs="Arial" w:eastAsia="Arial" w:hAnsi="Arial"/>
+                <w:i/>
+                <w:iCs/>
+                <w:color w:val="00695C"/>
+                <w:sz w:val="14"/>
+                <w:szCs w:val="14"/>
+              </w:rPr>
+              <w:t xml:space="preserve">  Distance &amp; quality governed — no RIR target</w:t>
+            </w:r>
+          </w:p>
+        </w:tc>
+      </w:tr>
+      <w:tr>
+        <w:tc>
+          <w:tcPr>
+            <w:tcW w:type="dxa" w:w="2400"/>
+            <w:tcBorders>
+              <w:top w:val="none" w:color="FFFFFF" w:sz="0"/>
+              <w:left w:val="none" w:color="FFFFFF" w:sz="0"/>
+              <w:bottom w:val="none" w:color="FFFFFF" w:sz="0"/>
+              <w:right w:val="none" w:color="FFFFFF" w:sz="0"/>
+            </w:tcBorders>
+            <w:shd w:fill="FFFFFF" w:color="auto" w:val="clear"/>
+            <w:tcMar>
+              <w:top w:type="dxa" w:w="40"/>
+              <w:left w:type="dxa" w:w="80"/>
+              <w:bottom w:type="dxa" w:w="40"/>
+              <w:right w:type="dxa" w:w="80"/>
+            </w:tcMar>
+            <w:vAlign w:val="center"/>
+          </w:tcPr>
+          <w:p>
+            <w:r>
+              <w:rPr>
+                <w:rFonts w:ascii="Arial" w:cs="Arial" w:eastAsia="Arial" w:hAnsi="Arial"/>
+                <w:b/>
+                <w:bCs/>
+                <w:color w:val="2C2C2C"/>
+                <w:sz w:val="18"/>
+                <w:szCs w:val="18"/>
+              </w:rPr>
+              <w:t xml:space="preserve">Plank Hold</w:t>
+            </w:r>
+          </w:p>
+        </w:tc>
+        <w:tc>
+          <w:tcPr>
+            <w:tcW w:type="dxa" w:w="380"/>
+            <w:tcBorders>
+              <w:top w:val="none" w:color="FFFFFF" w:sz="0"/>
+              <w:left w:val="none" w:color="FFFFFF" w:sz="0"/>
+              <w:bottom w:val="none" w:color="FFFFFF" w:sz="0"/>
+              <w:right w:val="none" w:color="FFFFFF" w:sz="0"/>
+            </w:tcBorders>
+            <w:shd w:fill="FFFFFF" w:color="auto" w:val="clear"/>
+            <w:tcMar>
+              <w:top w:type="dxa" w:w="40"/>
+              <w:left w:type="dxa" w:w="80"/>
+              <w:bottom w:type="dxa" w:w="40"/>
+              <w:right w:type="dxa" w:w="80"/>
+            </w:tcMar>
+            <w:vAlign w:val="center"/>
+          </w:tcPr>
+          <w:p>
+            <w:pPr>
+              <w:jc w:val="center"/>
+            </w:pPr>
+            <w:r>
+              <w:rPr>
+                <w:rFonts w:ascii="Arial" w:cs="Arial" w:eastAsia="Arial" w:hAnsi="Arial"/>
+                <w:color w:val="6B6B6B"/>
+                <w:sz w:val="15"/>
+                <w:szCs w:val="15"/>
+              </w:rPr>
+              <w:t xml:space="preserve">3</w:t>
+            </w:r>
+          </w:p>
+        </w:tc>
+        <w:tc>
+          <w:tcPr>
+            <w:tcW w:type="dxa" w:w="420"/>
+            <w:tcBorders>
+              <w:top w:val="none" w:color="FFFFFF" w:sz="0"/>
+              <w:left w:val="none" w:color="FFFFFF" w:sz="0"/>
+              <w:bottom w:val="none" w:color="FFFFFF" w:sz="0"/>
+              <w:right w:val="none" w:color="FFFFFF" w:sz="0"/>
+            </w:tcBorders>
+            <w:shd w:fill="FFFFFF" w:color="auto" w:val="clear"/>
+            <w:tcMar>
+              <w:top w:type="dxa" w:w="40"/>
+              <w:left w:type="dxa" w:w="80"/>
+              <w:bottom w:type="dxa" w:w="40"/>
+              <w:right w:type="dxa" w:w="80"/>
+            </w:tcMar>
+            <w:vAlign w:val="center"/>
+          </w:tcPr>
+          <w:p>
+            <w:pPr>
+              <w:jc w:val="center"/>
+            </w:pPr>
+            <w:r>
+              <w:rPr>
+                <w:rFonts w:ascii="Arial" w:cs="Arial" w:eastAsia="Arial" w:hAnsi="Arial"/>
+                <w:color w:val="6B6B6B"/>
+                <w:sz w:val="15"/>
+                <w:szCs w:val="15"/>
+              </w:rPr>
+              <w:t xml:space="preserve">40–45s</w:t>
+            </w:r>
+          </w:p>
+        </w:tc>
+        <w:tc>
+          <w:tcPr>
+            <w:tcW w:type="dxa" w:w="680"/>
+            <w:tcBorders>
+              <w:top w:val="none" w:color="FFFFFF" w:sz="0"/>
+              <w:left w:val="none" w:color="FFFFFF" w:sz="0"/>
+              <w:bottom w:val="none" w:color="FFFFFF" w:sz="0"/>
+              <w:right w:val="none" w:color="FFFFFF" w:sz="0"/>
+            </w:tcBorders>
+            <w:shd w:fill="FFFFFF" w:color="auto" w:val="clear"/>
+            <w:tcMar>
+              <w:top w:type="dxa" w:w="40"/>
+              <w:left w:type="dxa" w:w="80"/>
+              <w:bottom w:type="dxa" w:w="40"/>
+              <w:right w:type="dxa" w:w="80"/>
+            </w:tcMar>
+            <w:vAlign w:val="center"/>
+          </w:tcPr>
+          <w:p>
+            <w:pPr>
+              <w:jc w:val="center"/>
+            </w:pPr>
+            <w:r>
+              <w:rPr>
+                <w:rFonts w:ascii="Arial" w:cs="Arial" w:eastAsia="Arial" w:hAnsi="Arial"/>
+                <w:color w:val="6B6B6B"/>
+                <w:sz w:val="15"/>
+                <w:szCs w:val="15"/>
+              </w:rPr>
+              <w:t xml:space="preserve">BW</w:t>
+            </w:r>
+          </w:p>
+        </w:tc>
+        <w:tc>
+          <w:tcPr>
+            <w:tcW w:type="dxa" w:w="540"/>
+            <w:tcBorders>
+              <w:top w:val="none" w:color="FFFFFF" w:sz="0"/>
+              <w:left w:val="none" w:color="FFFFFF" w:sz="0"/>
+              <w:bottom w:val="none" w:color="FFFFFF" w:sz="0"/>
+              <w:right w:val="none" w:color="FFFFFF" w:sz="0"/>
+            </w:tcBorders>
+            <w:shd w:fill="FFFFFF" w:color="auto" w:val="clear"/>
+            <w:tcMar>
+              <w:top w:type="dxa" w:w="40"/>
+              <w:left w:type="dxa" w:w="80"/>
+              <w:bottom w:type="dxa" w:w="40"/>
+              <w:right w:type="dxa" w:w="80"/>
+            </w:tcMar>
+            <w:vAlign w:val="center"/>
+          </w:tcPr>
+          <w:p>
+            <w:pPr>
+              <w:jc w:val="center"/>
+            </w:pPr>
+            <w:r>
+              <w:rPr>
+                <w:rFonts w:ascii="Arial" w:cs="Arial" w:eastAsia="Arial" w:hAnsi="Arial"/>
+                <w:color w:val="6B6B6B"/>
+                <w:sz w:val="15"/>
+                <w:szCs w:val="15"/>
+              </w:rPr>
+              <w:t xml:space="preserve">—</w:t>
+            </w:r>
+          </w:p>
+        </w:tc>
+        <w:tc>
+          <w:tcPr>
+            <w:tcW w:type="dxa" w:w="440"/>
+            <w:tcBorders>
+              <w:top w:val="none" w:color="FFFFFF" w:sz="0"/>
+              <w:left w:val="none" w:color="FFFFFF" w:sz="0"/>
+              <w:bottom w:val="none" w:color="FFFFFF" w:sz="0"/>
+              <w:right w:val="none" w:color="FFFFFF" w:sz="0"/>
+            </w:tcBorders>
+            <w:shd w:fill="FFFFFF" w:color="auto" w:val="clear"/>
+            <w:tcMar>
+              <w:top w:type="dxa" w:w="40"/>
+              <w:left w:type="dxa" w:w="80"/>
+              <w:bottom w:type="dxa" w:w="40"/>
+              <w:right w:type="dxa" w:w="80"/>
+            </w:tcMar>
+            <w:vAlign w:val="center"/>
+          </w:tcPr>
+          <w:p>
+            <w:pPr>
+              <w:jc w:val="center"/>
+            </w:pPr>
+            <w:r>
+              <w:rPr>
+                <w:rFonts w:ascii="Arial" w:cs="Arial" w:eastAsia="Arial" w:hAnsi="Arial"/>
+                <w:color w:val="6B6B6B"/>
+                <w:sz w:val="15"/>
+                <w:szCs w:val="15"/>
+              </w:rPr>
               <w:t xml:space="preserve">45s</w:t>
             </w:r>
           </w:p>
@@ -5748,7 +6353,7 @@
               <w:bottom w:val="none" w:color="FFFFFF" w:sz="0"/>
               <w:right w:val="none" w:color="FFFFFF" w:sz="0"/>
             </w:tcBorders>
-            <w:shd w:fill="FAF3E0" w:color="auto" w:val="clear"/>
+            <w:shd w:fill="FFFFFF" w:color="auto" w:val="clear"/>
             <w:tcMar>
               <w:top w:type="dxa" w:w="40"/>
               <w:left w:type="dxa" w:w="80"/>

</xml_diff>

<commit_message>
Checkpoint: batch 3 August Olivia restructure iteration + CLIENTS.md sections (agent still working; Petra pending)
Co-Authored-By: Claude Fable 5 <noreply@anthropic.com>
Claude-Session: https://claude.ai/code/session_01VTRA12TAy4P16NRVKS4SK5
</commit_message>
<xml_diff>
--- a/clients/august_olivia/August_Olivia_3Day_Training_Plan.docx
+++ b/clients/august_olivia/August_Olivia_3Day_Training_Plan.docx
@@ -6765,7 +6765,7 @@
           <w:sz w:val="17"/>
           <w:szCs w:val="17"/>
         </w:rPr>
-        <w:t xml:space="preserve">Hip abductor / glute med activation before loaded unilateral work — standard screen for women's ACL/knee-valgus risk on single-leg patterns, and the entry point for closing the flagged leg asymmetry.</w:t>
+        <w:t xml:space="preserve">Hip abductor / glute med activation before loaded unilateral work — the same lower-limb injury-prevention work that protects knee tracking on every single-leg pattern, and the entry point for closing the flagged leg asymmetry. This circuit earns its place for every session, not because of any one test result.</w:t>
       </w:r>
     </w:p>
     <w:tbl>
@@ -7526,7 +7526,7 @@
           <w:sz w:val="17"/>
           <w:szCs w:val="17"/>
         </w:rPr>
-        <w:t xml:space="preserve">B — PRIMARY UNILATERAL</w:t>
+        <w:t xml:space="preserve">B — PRIMARY COMPOUND — DB SPLIT SQUAT (LEFT-LED)</w:t>
       </w:r>
     </w:p>
     <w:p>
@@ -7551,7 +7551,7 @@
           <w:sz w:val="17"/>
           <w:szCs w:val="17"/>
         </w:rPr>
-        <w:t xml:space="preserve">Left leg leads every set — always perform the left-side rep first while freshest.</w:t>
+        <w:t xml:space="preserve">The day's primary lift, worked one leg at a time — left leg leads every set, always performing the left-side reps first while freshest. If the day calls for a variation, rotate between: a supported split squat (hand on a rail or bench for balance), a reverse lunge, or a low-box step-up — every option is left-led and stays in the same technique band as the split squat itself. The split squat stays the movement we track.</w:t>
       </w:r>
     </w:p>
     <w:tbl>
@@ -8075,235 +8075,6 @@
           </w:p>
         </w:tc>
       </w:tr>
-      <w:tr>
-        <w:tc>
-          <w:tcPr>
-            <w:tcW w:type="dxa" w:w="2400"/>
-            <w:tcBorders>
-              <w:top w:val="none" w:color="FFFFFF" w:sz="0"/>
-              <w:left w:val="none" w:color="FFFFFF" w:sz="0"/>
-              <w:bottom w:val="none" w:color="FFFFFF" w:sz="0"/>
-              <w:right w:val="none" w:color="FFFFFF" w:sz="0"/>
-            </w:tcBorders>
-            <w:shd w:fill="FFFFFF" w:color="auto" w:val="clear"/>
-            <w:tcMar>
-              <w:top w:type="dxa" w:w="40"/>
-              <w:left w:type="dxa" w:w="80"/>
-              <w:bottom w:type="dxa" w:w="40"/>
-              <w:right w:type="dxa" w:w="80"/>
-            </w:tcMar>
-            <w:vAlign w:val="center"/>
-          </w:tcPr>
-          <w:p>
-            <w:r>
-              <w:rPr>
-                <w:rFonts w:ascii="Arial" w:cs="Arial" w:eastAsia="Arial" w:hAnsi="Arial"/>
-                <w:b/>
-                <w:bCs/>
-                <w:color w:val="2C2C2C"/>
-                <w:sz w:val="18"/>
-                <w:szCs w:val="18"/>
-              </w:rPr>
-              <w:t xml:space="preserve">DB Suitcase Farmer Carry</w:t>
-            </w:r>
-          </w:p>
-        </w:tc>
-        <w:tc>
-          <w:tcPr>
-            <w:tcW w:type="dxa" w:w="380"/>
-            <w:tcBorders>
-              <w:top w:val="none" w:color="FFFFFF" w:sz="0"/>
-              <w:left w:val="none" w:color="FFFFFF" w:sz="0"/>
-              <w:bottom w:val="none" w:color="FFFFFF" w:sz="0"/>
-              <w:right w:val="none" w:color="FFFFFF" w:sz="0"/>
-            </w:tcBorders>
-            <w:shd w:fill="FFFFFF" w:color="auto" w:val="clear"/>
-            <w:tcMar>
-              <w:top w:type="dxa" w:w="40"/>
-              <w:left w:type="dxa" w:w="80"/>
-              <w:bottom w:type="dxa" w:w="40"/>
-              <w:right w:type="dxa" w:w="80"/>
-            </w:tcMar>
-            <w:vAlign w:val="center"/>
-          </w:tcPr>
-          <w:p>
-            <w:pPr>
-              <w:jc w:val="center"/>
-            </w:pPr>
-            <w:r>
-              <w:rPr>
-                <w:rFonts w:ascii="Arial" w:cs="Arial" w:eastAsia="Arial" w:hAnsi="Arial"/>
-                <w:color w:val="6B6B6B"/>
-                <w:sz w:val="15"/>
-                <w:szCs w:val="15"/>
-              </w:rPr>
-              <w:t xml:space="preserve">3</w:t>
-            </w:r>
-          </w:p>
-        </w:tc>
-        <w:tc>
-          <w:tcPr>
-            <w:tcW w:type="dxa" w:w="420"/>
-            <w:tcBorders>
-              <w:top w:val="none" w:color="FFFFFF" w:sz="0"/>
-              <w:left w:val="none" w:color="FFFFFF" w:sz="0"/>
-              <w:bottom w:val="none" w:color="FFFFFF" w:sz="0"/>
-              <w:right w:val="none" w:color="FFFFFF" w:sz="0"/>
-            </w:tcBorders>
-            <w:shd w:fill="FFFFFF" w:color="auto" w:val="clear"/>
-            <w:tcMar>
-              <w:top w:type="dxa" w:w="40"/>
-              <w:left w:type="dxa" w:w="80"/>
-              <w:bottom w:type="dxa" w:w="40"/>
-              <w:right w:type="dxa" w:w="80"/>
-            </w:tcMar>
-            <w:vAlign w:val="center"/>
-          </w:tcPr>
-          <w:p>
-            <w:pPr>
-              <w:jc w:val="center"/>
-            </w:pPr>
-            <w:r>
-              <w:rPr>
-                <w:rFonts w:ascii="Arial" w:cs="Arial" w:eastAsia="Arial" w:hAnsi="Arial"/>
-                <w:color w:val="6B6B6B"/>
-                <w:sz w:val="15"/>
-                <w:szCs w:val="15"/>
-              </w:rPr>
-              <w:t xml:space="preserve">20 yd each hand</w:t>
-            </w:r>
-          </w:p>
-        </w:tc>
-        <w:tc>
-          <w:tcPr>
-            <w:tcW w:type="dxa" w:w="680"/>
-            <w:tcBorders>
-              <w:top w:val="none" w:color="FFFFFF" w:sz="0"/>
-              <w:left w:val="none" w:color="FFFFFF" w:sz="0"/>
-              <w:bottom w:val="none" w:color="FFFFFF" w:sz="0"/>
-              <w:right w:val="none" w:color="FFFFFF" w:sz="0"/>
-            </w:tcBorders>
-            <w:shd w:fill="FFFFFF" w:color="auto" w:val="clear"/>
-            <w:tcMar>
-              <w:top w:type="dxa" w:w="40"/>
-              <w:left w:type="dxa" w:w="80"/>
-              <w:bottom w:type="dxa" w:w="40"/>
-              <w:right w:type="dxa" w:w="80"/>
-            </w:tcMar>
-            <w:vAlign w:val="center"/>
-          </w:tcPr>
-          <w:p>
-            <w:pPr>
-              <w:jc w:val="center"/>
-            </w:pPr>
-            <w:r>
-              <w:rPr>
-                <w:rFonts w:ascii="Arial" w:cs="Arial" w:eastAsia="Arial" w:hAnsi="Arial"/>
-                <w:color w:val="6B6B6B"/>
-                <w:sz w:val="15"/>
-                <w:szCs w:val="15"/>
-              </w:rPr>
-              <w:t xml:space="preserve">25 lb</w:t>
-            </w:r>
-          </w:p>
-        </w:tc>
-        <w:tc>
-          <w:tcPr>
-            <w:tcW w:type="dxa" w:w="540"/>
-            <w:tcBorders>
-              <w:top w:val="none" w:color="FFFFFF" w:sz="0"/>
-              <w:left w:val="none" w:color="FFFFFF" w:sz="0"/>
-              <w:bottom w:val="none" w:color="FFFFFF" w:sz="0"/>
-              <w:right w:val="none" w:color="FFFFFF" w:sz="0"/>
-            </w:tcBorders>
-            <w:shd w:fill="FFFFFF" w:color="auto" w:val="clear"/>
-            <w:tcMar>
-              <w:top w:type="dxa" w:w="40"/>
-              <w:left w:type="dxa" w:w="80"/>
-              <w:bottom w:type="dxa" w:w="40"/>
-              <w:right w:type="dxa" w:w="80"/>
-            </w:tcMar>
-            <w:vAlign w:val="center"/>
-          </w:tcPr>
-          <w:p>
-            <w:pPr>
-              <w:jc w:val="center"/>
-            </w:pPr>
-            <w:r>
-              <w:rPr>
-                <w:rFonts w:ascii="Arial" w:cs="Arial" w:eastAsia="Arial" w:hAnsi="Arial"/>
-                <w:color w:val="6B6B6B"/>
-                <w:sz w:val="15"/>
-                <w:szCs w:val="15"/>
-              </w:rPr>
-              <w:t xml:space="preserve">—</w:t>
-            </w:r>
-          </w:p>
-        </w:tc>
-        <w:tc>
-          <w:tcPr>
-            <w:tcW w:type="dxa" w:w="440"/>
-            <w:tcBorders>
-              <w:top w:val="none" w:color="FFFFFF" w:sz="0"/>
-              <w:left w:val="none" w:color="FFFFFF" w:sz="0"/>
-              <w:bottom w:val="none" w:color="FFFFFF" w:sz="0"/>
-              <w:right w:val="none" w:color="FFFFFF" w:sz="0"/>
-            </w:tcBorders>
-            <w:shd w:fill="FFFFFF" w:color="auto" w:val="clear"/>
-            <w:tcMar>
-              <w:top w:type="dxa" w:w="40"/>
-              <w:left w:type="dxa" w:w="80"/>
-              <w:bottom w:type="dxa" w:w="40"/>
-              <w:right w:type="dxa" w:w="80"/>
-            </w:tcMar>
-            <w:vAlign w:val="center"/>
-          </w:tcPr>
-          <w:p>
-            <w:pPr>
-              <w:jc w:val="center"/>
-            </w:pPr>
-            <w:r>
-              <w:rPr>
-                <w:rFonts w:ascii="Arial" w:cs="Arial" w:eastAsia="Arial" w:hAnsi="Arial"/>
-                <w:color w:val="6B6B6B"/>
-                <w:sz w:val="15"/>
-                <w:szCs w:val="15"/>
-              </w:rPr>
-              <w:t xml:space="preserve">60s</w:t>
-            </w:r>
-          </w:p>
-        </w:tc>
-        <w:tc>
-          <w:tcPr>
-            <w:tcW w:type="dxa" w:w="5580"/>
-            <w:tcBorders>
-              <w:top w:val="none" w:color="FFFFFF" w:sz="0"/>
-              <w:left w:val="none" w:color="FFFFFF" w:sz="0"/>
-              <w:bottom w:val="none" w:color="FFFFFF" w:sz="0"/>
-              <w:right w:val="none" w:color="FFFFFF" w:sz="0"/>
-            </w:tcBorders>
-            <w:shd w:fill="FFFFFF" w:color="auto" w:val="clear"/>
-            <w:tcMar>
-              <w:top w:type="dxa" w:w="40"/>
-              <w:left w:type="dxa" w:w="80"/>
-              <w:bottom w:type="dxa" w:w="40"/>
-              <w:right w:type="dxa" w:w="80"/>
-            </w:tcMar>
-            <w:vAlign w:val="center"/>
-          </w:tcPr>
-          <w:p>
-            <w:r>
-              <w:rPr>
-                <w:rFonts w:ascii="Arial" w:cs="Arial" w:eastAsia="Arial" w:hAnsi="Arial"/>
-                <w:color w:val="6B6B6B"/>
-                <w:sz w:val="17"/>
-                <w:szCs w:val="17"/>
-              </w:rPr>
-              <w:t xml:space="preserve">Ribs stacked over hips, no side lean, tight grip.</w:t>
-            </w:r>
-          </w:p>
-        </w:tc>
-      </w:tr>
     </w:tbl>
     <w:p>
       <w:pPr>
@@ -8323,7 +8094,32 @@
           <w:sz w:val="17"/>
           <w:szCs w:val="17"/>
         </w:rPr>
-        <w:t xml:space="preserve">C — ACCESSORY</w:t>
+        <w:t xml:space="preserve">C — ACCESSORY — ADDUCTOR STRENGTH</w:t>
+      </w:r>
+    </w:p>
+    <w:p>
+      <w:pPr>
+        <w:spacing w:after="80"/>
+      </w:pPr>
+      <w:r>
+        <w:rPr>
+          <w:rFonts w:ascii="Arial" w:cs="Arial" w:eastAsia="Arial" w:hAnsi="Arial"/>
+          <w:b/>
+          <w:bCs/>
+          <w:color w:val="C9A227"/>
+          <w:sz w:val="17"/>
+          <w:szCs w:val="17"/>
+        </w:rPr>
+        <w:t xml:space="preserve">Why:  </w:t>
+      </w:r>
+      <w:r>
+        <w:rPr>
+          <w:rFonts w:ascii="Arial" w:cs="Arial" w:eastAsia="Arial" w:hAnsi="Arial"/>
+          <w:color w:val="2C2C2C"/>
+          <w:sz w:val="17"/>
+          <w:szCs w:val="17"/>
+        </w:rPr>
+        <w:t xml:space="preserve">Inner-thigh strength directly supports knee tracking and single-leg control — quiet, high-value accessory work between the two main lifts.</w:t>
       </w:r>
     </w:p>
     <w:tbl>
@@ -8623,20 +8419,7 @@
                 <w:sz w:val="18"/>
                 <w:szCs w:val="18"/>
               </w:rPr>
-              <w:t xml:space="preserve">Single-Leg RDL (hand-supported)</w:t>
-            </w:r>
-          </w:p>
-          <w:p>
-            <w:r>
-              <w:rPr>
-                <w:rFonts w:ascii="Arial" w:cs="Arial" w:eastAsia="Arial" w:hAnsi="Arial"/>
-                <w:i/>
-                <w:iCs/>
-                <w:color w:val="B71C1C"/>
-                <w:sz w:val="14"/>
-                <w:szCs w:val="14"/>
-              </w:rPr>
-              <w:t xml:space="preserve">Left leg leads.</w:t>
+              <w:t xml:space="preserve">Copenhagen Plank (bench, top leg)</w:t>
             </w:r>
           </w:p>
         </w:tc>
@@ -8702,7 +8485,7 @@
                 <w:sz w:val="15"/>
                 <w:szCs w:val="15"/>
               </w:rPr>
-              <w:t xml:space="preserve">5 each leg</w:t>
+              <w:t xml:space="preserve">15–20s each side</w:t>
             </w:r>
           </w:p>
         </w:tc>
@@ -8735,7 +8518,7 @@
                 <w:sz w:val="15"/>
                 <w:szCs w:val="15"/>
               </w:rPr>
-              <w:t xml:space="preserve">BW / light DB</w:t>
+              <w:t xml:space="preserve">BW</w:t>
             </w:r>
           </w:p>
         </w:tc>
@@ -8768,7 +8551,7 @@
                 <w:sz w:val="15"/>
                 <w:szCs w:val="15"/>
               </w:rPr>
-              <w:t xml:space="preserve">3-1-1</w:t>
+              <w:t xml:space="preserve">—</w:t>
             </w:r>
           </w:p>
         </w:tc>
@@ -8801,7 +8584,7 @@
                 <w:sz w:val="15"/>
                 <w:szCs w:val="15"/>
               </w:rPr>
-              <w:t xml:space="preserve">60s</w:t>
+              <w:t xml:space="preserve">30s</w:t>
             </w:r>
           </w:p>
         </w:tc>
@@ -8815,246 +8598,6 @@
               <w:right w:val="none" w:color="FFFFFF" w:sz="0"/>
             </w:tcBorders>
             <w:shd w:fill="FAF3E0" w:color="auto" w:val="clear"/>
-            <w:tcMar>
-              <w:top w:type="dxa" w:w="40"/>
-              <w:left w:type="dxa" w:w="80"/>
-              <w:bottom w:type="dxa" w:w="40"/>
-              <w:right w:type="dxa" w:w="80"/>
-            </w:tcMar>
-            <w:vAlign w:val="center"/>
-          </w:tcPr>
-          <w:p>
-            <w:r>
-              <w:rPr>
-                <w:rFonts w:ascii="Arial" w:cs="Arial" w:eastAsia="Arial" w:hAnsi="Arial"/>
-                <w:color w:val="6B6B6B"/>
-                <w:sz w:val="17"/>
-                <w:szCs w:val="17"/>
-              </w:rPr>
-              <w:t xml:space="preserve">Hinge from hip, square hips to the floor.</w:t>
-            </w:r>
-            <w:r>
-              <w:rPr>
-                <w:rFonts w:ascii="Arial" w:cs="Arial" w:eastAsia="Arial" w:hAnsi="Arial"/>
-                <w:i/>
-                <w:iCs/>
-                <w:color w:val="00695C"/>
-                <w:sz w:val="14"/>
-                <w:szCs w:val="14"/>
-              </w:rPr>
-              <w:t xml:space="preserve">  3+ RIR — technique day</w:t>
-            </w:r>
-          </w:p>
-        </w:tc>
-      </w:tr>
-      <w:tr>
-        <w:tc>
-          <w:tcPr>
-            <w:tcW w:type="dxa" w:w="2400"/>
-            <w:tcBorders>
-              <w:top w:val="none" w:color="FFFFFF" w:sz="0"/>
-              <w:left w:val="none" w:color="FFFFFF" w:sz="0"/>
-              <w:bottom w:val="none" w:color="FFFFFF" w:sz="0"/>
-              <w:right w:val="none" w:color="FFFFFF" w:sz="0"/>
-            </w:tcBorders>
-            <w:shd w:fill="FFFFFF" w:color="auto" w:val="clear"/>
-            <w:tcMar>
-              <w:top w:type="dxa" w:w="40"/>
-              <w:left w:type="dxa" w:w="80"/>
-              <w:bottom w:type="dxa" w:w="40"/>
-              <w:right w:type="dxa" w:w="80"/>
-            </w:tcMar>
-            <w:vAlign w:val="center"/>
-          </w:tcPr>
-          <w:p>
-            <w:r>
-              <w:rPr>
-                <w:rFonts w:ascii="Arial" w:cs="Arial" w:eastAsia="Arial" w:hAnsi="Arial"/>
-                <w:b/>
-                <w:bCs/>
-                <w:color w:val="2C2C2C"/>
-                <w:sz w:val="18"/>
-                <w:szCs w:val="18"/>
-              </w:rPr>
-              <w:t xml:space="preserve">Copenhagen Plank (bench, top leg)</w:t>
-            </w:r>
-          </w:p>
-        </w:tc>
-        <w:tc>
-          <w:tcPr>
-            <w:tcW w:type="dxa" w:w="380"/>
-            <w:tcBorders>
-              <w:top w:val="none" w:color="FFFFFF" w:sz="0"/>
-              <w:left w:val="none" w:color="FFFFFF" w:sz="0"/>
-              <w:bottom w:val="none" w:color="FFFFFF" w:sz="0"/>
-              <w:right w:val="none" w:color="FFFFFF" w:sz="0"/>
-            </w:tcBorders>
-            <w:shd w:fill="FFFFFF" w:color="auto" w:val="clear"/>
-            <w:tcMar>
-              <w:top w:type="dxa" w:w="40"/>
-              <w:left w:type="dxa" w:w="80"/>
-              <w:bottom w:type="dxa" w:w="40"/>
-              <w:right w:type="dxa" w:w="80"/>
-            </w:tcMar>
-            <w:vAlign w:val="center"/>
-          </w:tcPr>
-          <w:p>
-            <w:pPr>
-              <w:jc w:val="center"/>
-            </w:pPr>
-            <w:r>
-              <w:rPr>
-                <w:rFonts w:ascii="Arial" w:cs="Arial" w:eastAsia="Arial" w:hAnsi="Arial"/>
-                <w:color w:val="6B6B6B"/>
-                <w:sz w:val="15"/>
-                <w:szCs w:val="15"/>
-              </w:rPr>
-              <w:t xml:space="preserve">2</w:t>
-            </w:r>
-          </w:p>
-        </w:tc>
-        <w:tc>
-          <w:tcPr>
-            <w:tcW w:type="dxa" w:w="420"/>
-            <w:tcBorders>
-              <w:top w:val="none" w:color="FFFFFF" w:sz="0"/>
-              <w:left w:val="none" w:color="FFFFFF" w:sz="0"/>
-              <w:bottom w:val="none" w:color="FFFFFF" w:sz="0"/>
-              <w:right w:val="none" w:color="FFFFFF" w:sz="0"/>
-            </w:tcBorders>
-            <w:shd w:fill="FFFFFF" w:color="auto" w:val="clear"/>
-            <w:tcMar>
-              <w:top w:type="dxa" w:w="40"/>
-              <w:left w:type="dxa" w:w="80"/>
-              <w:bottom w:type="dxa" w:w="40"/>
-              <w:right w:type="dxa" w:w="80"/>
-            </w:tcMar>
-            <w:vAlign w:val="center"/>
-          </w:tcPr>
-          <w:p>
-            <w:pPr>
-              <w:jc w:val="center"/>
-            </w:pPr>
-            <w:r>
-              <w:rPr>
-                <w:rFonts w:ascii="Arial" w:cs="Arial" w:eastAsia="Arial" w:hAnsi="Arial"/>
-                <w:color w:val="6B6B6B"/>
-                <w:sz w:val="15"/>
-                <w:szCs w:val="15"/>
-              </w:rPr>
-              <w:t xml:space="preserve">15–20s each side</w:t>
-            </w:r>
-          </w:p>
-        </w:tc>
-        <w:tc>
-          <w:tcPr>
-            <w:tcW w:type="dxa" w:w="680"/>
-            <w:tcBorders>
-              <w:top w:val="none" w:color="FFFFFF" w:sz="0"/>
-              <w:left w:val="none" w:color="FFFFFF" w:sz="0"/>
-              <w:bottom w:val="none" w:color="FFFFFF" w:sz="0"/>
-              <w:right w:val="none" w:color="FFFFFF" w:sz="0"/>
-            </w:tcBorders>
-            <w:shd w:fill="FFFFFF" w:color="auto" w:val="clear"/>
-            <w:tcMar>
-              <w:top w:type="dxa" w:w="40"/>
-              <w:left w:type="dxa" w:w="80"/>
-              <w:bottom w:type="dxa" w:w="40"/>
-              <w:right w:type="dxa" w:w="80"/>
-            </w:tcMar>
-            <w:vAlign w:val="center"/>
-          </w:tcPr>
-          <w:p>
-            <w:pPr>
-              <w:jc w:val="center"/>
-            </w:pPr>
-            <w:r>
-              <w:rPr>
-                <w:rFonts w:ascii="Arial" w:cs="Arial" w:eastAsia="Arial" w:hAnsi="Arial"/>
-                <w:color w:val="6B6B6B"/>
-                <w:sz w:val="15"/>
-                <w:szCs w:val="15"/>
-              </w:rPr>
-              <w:t xml:space="preserve">BW</w:t>
-            </w:r>
-          </w:p>
-        </w:tc>
-        <w:tc>
-          <w:tcPr>
-            <w:tcW w:type="dxa" w:w="540"/>
-            <w:tcBorders>
-              <w:top w:val="none" w:color="FFFFFF" w:sz="0"/>
-              <w:left w:val="none" w:color="FFFFFF" w:sz="0"/>
-              <w:bottom w:val="none" w:color="FFFFFF" w:sz="0"/>
-              <w:right w:val="none" w:color="FFFFFF" w:sz="0"/>
-            </w:tcBorders>
-            <w:shd w:fill="FFFFFF" w:color="auto" w:val="clear"/>
-            <w:tcMar>
-              <w:top w:type="dxa" w:w="40"/>
-              <w:left w:type="dxa" w:w="80"/>
-              <w:bottom w:type="dxa" w:w="40"/>
-              <w:right w:type="dxa" w:w="80"/>
-            </w:tcMar>
-            <w:vAlign w:val="center"/>
-          </w:tcPr>
-          <w:p>
-            <w:pPr>
-              <w:jc w:val="center"/>
-            </w:pPr>
-            <w:r>
-              <w:rPr>
-                <w:rFonts w:ascii="Arial" w:cs="Arial" w:eastAsia="Arial" w:hAnsi="Arial"/>
-                <w:color w:val="6B6B6B"/>
-                <w:sz w:val="15"/>
-                <w:szCs w:val="15"/>
-              </w:rPr>
-              <w:t xml:space="preserve">—</w:t>
-            </w:r>
-          </w:p>
-        </w:tc>
-        <w:tc>
-          <w:tcPr>
-            <w:tcW w:type="dxa" w:w="440"/>
-            <w:tcBorders>
-              <w:top w:val="none" w:color="FFFFFF" w:sz="0"/>
-              <w:left w:val="none" w:color="FFFFFF" w:sz="0"/>
-              <w:bottom w:val="none" w:color="FFFFFF" w:sz="0"/>
-              <w:right w:val="none" w:color="FFFFFF" w:sz="0"/>
-            </w:tcBorders>
-            <w:shd w:fill="FFFFFF" w:color="auto" w:val="clear"/>
-            <w:tcMar>
-              <w:top w:type="dxa" w:w="40"/>
-              <w:left w:type="dxa" w:w="80"/>
-              <w:bottom w:type="dxa" w:w="40"/>
-              <w:right w:type="dxa" w:w="80"/>
-            </w:tcMar>
-            <w:vAlign w:val="center"/>
-          </w:tcPr>
-          <w:p>
-            <w:pPr>
-              <w:jc w:val="center"/>
-            </w:pPr>
-            <w:r>
-              <w:rPr>
-                <w:rFonts w:ascii="Arial" w:cs="Arial" w:eastAsia="Arial" w:hAnsi="Arial"/>
-                <w:color w:val="6B6B6B"/>
-                <w:sz w:val="15"/>
-                <w:szCs w:val="15"/>
-              </w:rPr>
-              <w:t xml:space="preserve">30s</w:t>
-            </w:r>
-          </w:p>
-        </w:tc>
-        <w:tc>
-          <w:tcPr>
-            <w:tcW w:type="dxa" w:w="5580"/>
-            <w:tcBorders>
-              <w:top w:val="none" w:color="FFFFFF" w:sz="0"/>
-              <w:left w:val="none" w:color="FFFFFF" w:sz="0"/>
-              <w:bottom w:val="none" w:color="FFFFFF" w:sz="0"/>
-              <w:right w:val="none" w:color="FFFFFF" w:sz="0"/>
-            </w:tcBorders>
-            <w:shd w:fill="FFFFFF" w:color="auto" w:val="clear"/>
             <w:tcMar>
               <w:top w:type="dxa" w:w="40"/>
               <w:left w:type="dxa" w:w="80"/>
@@ -9084,57 +8627,7 @@
     </w:p>
     <w:p>
       <w:pPr>
-        <w:spacing w:after="100"/>
-      </w:pPr>
-      <w:r>
-        <w:rPr>
-          <w:rFonts w:ascii="Arial" w:cs="Arial" w:eastAsia="Arial" w:hAnsi="Arial"/>
-          <w:b/>
-          <w:bCs/>
-          <w:color w:val="1565C0"/>
-          <w:sz w:val="17"/>
-          <w:szCs w:val="17"/>
-        </w:rPr>
-        <w:t xml:space="preserve">Cool-Down:  </w:t>
-      </w:r>
-      <w:r>
-        <w:rPr>
-          <w:rFonts w:ascii="Arial" w:cs="Arial" w:eastAsia="Arial" w:hAnsi="Arial"/>
-          <w:color w:val="2C2C2C"/>
-          <w:sz w:val="17"/>
-          <w:szCs w:val="17"/>
-        </w:rPr>
-        <w:t xml:space="preserve">90/90 hip stretch 30s/side. Standing adductor stretch 20s/side. Figure-4 glute stretch 30s/side.</w:t>
-      </w:r>
-    </w:p>
-    <w:p>
-      <w:pPr>
-        <w:spacing w:after="100"/>
-      </w:pPr>
-      <w:r>
-        <w:rPr>
-          <w:rFonts w:ascii="Arial" w:cs="Arial" w:eastAsia="Arial" w:hAnsi="Arial"/>
-          <w:b/>
-          <w:bCs/>
-          <w:color w:val="C9A227"/>
-          <w:sz w:val="17"/>
-          <w:szCs w:val="17"/>
-        </w:rPr>
-        <w:t xml:space="preserve">ICONS Note:  </w:t>
-      </w:r>
-      <w:r>
-        <w:rPr>
-          <w:rFonts w:ascii="Arial" w:cs="Arial" w:eastAsia="Arial" w:hAnsi="Arial"/>
-          <w:color w:val="2C2C2C"/>
-          <w:sz w:val="17"/>
-          <w:szCs w:val="17"/>
-        </w:rPr>
-        <w:t xml:space="preserve">No PRs today — this session exists to close the left/right leg gap. Every left-side rep goes first, at full attention, before the right.</w:t>
-      </w:r>
-    </w:p>
-    <w:p>
-      <w:pPr>
-        <w:spacing w:after="100"/>
+        <w:spacing w:after="60" w:before="120"/>
       </w:pPr>
       <w:r>
         <w:rPr>
@@ -9145,18 +8638,23 @@
           <w:sz w:val="17"/>
           <w:szCs w:val="17"/>
         </w:rPr>
-        <w:t xml:space="preserve">Progression Rule — RIR Model:  </w:t>
-      </w:r>
+        <w:t xml:space="preserve">D — SECONDARY COMPOUND — SINGLE-LEG RDL (LEFT-LED)</w:t>
+      </w:r>
+    </w:p>
+    <w:p>
+      <w:pPr>
+        <w:spacing w:after="80"/>
+      </w:pPr>
       <w:r>
         <w:rPr>
           <w:rFonts w:ascii="Arial" w:cs="Arial" w:eastAsia="Arial" w:hAnsi="Arial"/>
           <w:b/>
           <w:bCs/>
-          <w:color w:val="2C2C2C"/>
+          <w:color w:val="00695C"/>
           <w:sz w:val="17"/>
           <w:szCs w:val="17"/>
         </w:rPr>
-        <w:t xml:space="preserve">Add weight </w:t>
+        <w:t xml:space="preserve">Load Target:  </w:t>
       </w:r>
       <w:r>
         <w:rPr>
@@ -9165,308 +8663,7 @@
           <w:sz w:val="17"/>
           <w:szCs w:val="17"/>
         </w:rPr>
-        <w:t xml:space="preserve">at top of rep range + 2 RIR + clean form. </w:t>
-      </w:r>
-      <w:r>
-        <w:rPr>
-          <w:rFonts w:ascii="Arial" w:cs="Arial" w:eastAsia="Arial" w:hAnsi="Arial"/>
-          <w:b/>
-          <w:bCs/>
-          <w:color w:val="2C2C2C"/>
-          <w:sz w:val="17"/>
-          <w:szCs w:val="17"/>
-        </w:rPr>
-        <w:t xml:space="preserve">Same weight </w:t>
-      </w:r>
-      <w:r>
-        <w:rPr>
-          <w:rFonts w:ascii="Arial" w:cs="Arial" w:eastAsia="Arial" w:hAnsi="Arial"/>
-          <w:color w:val="2C2C2C"/>
-          <w:sz w:val="17"/>
-          <w:szCs w:val="17"/>
-        </w:rPr>
-        <w:t xml:space="preserve">if form degraded on final reps. </w:t>
-      </w:r>
-      <w:r>
-        <w:rPr>
-          <w:rFonts w:ascii="Arial" w:cs="Arial" w:eastAsia="Arial" w:hAnsi="Arial"/>
-          <w:b/>
-          <w:bCs/>
-          <w:color w:val="2C2C2C"/>
-          <w:sz w:val="17"/>
-          <w:szCs w:val="17"/>
-        </w:rPr>
-        <w:t xml:space="preserve">Drop weight </w:t>
-      </w:r>
-      <w:r>
-        <w:rPr>
-          <w:rFonts w:ascii="Arial" w:cs="Arial" w:eastAsia="Arial" w:hAnsi="Arial"/>
-          <w:color w:val="2C2C2C"/>
-          <w:sz w:val="17"/>
-          <w:szCs w:val="17"/>
-        </w:rPr>
-        <w:t xml:space="preserve">on missed reps, pain, or excess fatigue.</w:t>
-      </w:r>
-    </w:p>
-    <w:p>
-      <w:r>
-        <w:br w:type="page"/>
-      </w:r>
-    </w:p>
-    <w:tbl>
-      <w:tblPr>
-        <w:tblW w:type="dxa" w:w="10440"/>
-        <w:tblBorders>
-          <w:top w:val="none" w:color="FFFFFF" w:sz="0"/>
-          <w:left w:val="none" w:color="FFFFFF" w:sz="0"/>
-          <w:bottom w:val="none" w:color="FFFFFF" w:sz="0"/>
-          <w:right w:val="none" w:color="FFFFFF" w:sz="0"/>
-          <w:insideH w:val="single" w:color="auto" w:sz="4"/>
-          <w:insideV w:val="single" w:color="auto" w:sz="4"/>
-        </w:tblBorders>
-      </w:tblPr>
-      <w:tblGrid>
-        <w:gridCol w:w="1600"/>
-        <w:gridCol w:w="8840"/>
-      </w:tblGrid>
-      <w:tr>
-        <w:tc>
-          <w:tcPr>
-            <w:tcW w:type="dxa" w:w="1600"/>
-            <w:tcBorders>
-              <w:top w:val="none" w:color="FFFFFF" w:sz="0"/>
-              <w:left w:val="none" w:color="FFFFFF" w:sz="0"/>
-              <w:bottom w:val="none" w:color="FFFFFF" w:sz="0"/>
-              <w:right w:val="none" w:color="FFFFFF" w:sz="0"/>
-            </w:tcBorders>
-            <w:shd w:fill="C9A227" w:color="auto" w:val="clear"/>
-            <w:tcMar>
-              <w:top w:type="dxa" w:w="40"/>
-              <w:left w:type="dxa" w:w="80"/>
-              <w:bottom w:type="dxa" w:w="40"/>
-              <w:right w:type="dxa" w:w="80"/>
-            </w:tcMar>
-            <w:vAlign w:val="center"/>
-          </w:tcPr>
-          <w:p>
-            <w:pPr>
-              <w:spacing w:after="20"/>
-              <w:jc w:val="center"/>
-            </w:pPr>
-            <w:r>
-              <w:rPr>
-                <w:rFonts w:ascii="Arial" w:cs="Arial" w:eastAsia="Arial" w:hAnsi="Arial"/>
-                <w:b/>
-                <w:bCs/>
-                <w:color w:val="FFFFFF"/>
-                <w:sz w:val="36"/>
-                <w:szCs w:val="36"/>
-              </w:rPr>
-              <w:t xml:space="preserve">80%</w:t>
-            </w:r>
-          </w:p>
-          <w:p>
-            <w:pPr>
-              <w:jc w:val="center"/>
-            </w:pPr>
-            <w:r>
-              <w:rPr>
-                <w:rFonts w:ascii="Arial" w:cs="Arial" w:eastAsia="Arial" w:hAnsi="Arial"/>
-                <w:b/>
-                <w:bCs/>
-                <w:color w:val="FFFFFF"/>
-                <w:sz w:val="13"/>
-                <w:szCs w:val="13"/>
-              </w:rPr>
-              <w:t xml:space="preserve">INTENSITY</w:t>
-            </w:r>
-          </w:p>
-        </w:tc>
-        <w:tc>
-          <w:tcPr>
-            <w:tcW w:type="dxa" w:w="8840"/>
-            <w:tcBorders>
-              <w:top w:val="none" w:color="FFFFFF" w:sz="0"/>
-              <w:left w:val="none" w:color="FFFFFF" w:sz="0"/>
-              <w:bottom w:val="none" w:color="FFFFFF" w:sz="0"/>
-              <w:right w:val="none" w:color="FFFFFF" w:sz="0"/>
-            </w:tcBorders>
-            <w:shd w:fill="FAF3E0" w:color="auto" w:val="clear"/>
-            <w:tcMar>
-              <w:top w:type="dxa" w:w="60"/>
-              <w:left w:type="dxa" w:w="120"/>
-              <w:bottom w:type="dxa" w:w="60"/>
-              <w:right w:type="dxa" w:w="120"/>
-            </w:tcMar>
-            <w:vAlign w:val="center"/>
-          </w:tcPr>
-          <w:p>
-            <w:pPr>
-              <w:spacing w:after="30"/>
-            </w:pPr>
-            <w:r>
-              <w:rPr>
-                <w:rFonts w:ascii="Arial" w:cs="Arial" w:eastAsia="Arial" w:hAnsi="Arial"/>
-                <w:b/>
-                <w:bCs/>
-                <w:color w:val="C9A227"/>
-                <w:sz w:val="26"/>
-                <w:szCs w:val="26"/>
-              </w:rPr>
-              <w:t xml:space="preserve">DAY 3 — SATURDAY</w:t>
-            </w:r>
-          </w:p>
-          <w:p>
-            <w:pPr>
-              <w:spacing w:after="30"/>
-            </w:pPr>
-            <w:r>
-              <w:rPr>
-                <w:rFonts w:ascii="Arial" w:cs="Arial" w:eastAsia="Arial" w:hAnsi="Arial"/>
-                <w:b/>
-                <w:bCs/>
-                <w:color w:val="2C2C2C"/>
-                <w:sz w:val="19"/>
-                <w:szCs w:val="19"/>
-              </w:rPr>
-              <w:t xml:space="preserve">Upper Push/Pull + Core — Primary Strength</w:t>
-            </w:r>
-          </w:p>
-          <w:p>
-            <w:r>
-              <w:rPr>
-                <w:rFonts w:ascii="Arial" w:cs="Arial" w:eastAsia="Arial" w:hAnsi="Arial"/>
-                <w:b/>
-                <w:bCs/>
-                <w:color w:val="C9A227"/>
-                <w:sz w:val="14"/>
-                <w:szCs w:val="14"/>
-              </w:rPr>
-              <w:t xml:space="preserve">PRIMARY STRENGTH DAY — LAST 1–2 REPS HARD, ACHIEVABLE</w:t>
-            </w:r>
-          </w:p>
-        </w:tc>
-      </w:tr>
-    </w:tbl>
-    <w:p>
-      <w:pPr>
-        <w:spacing w:after="100"/>
-      </w:pPr>
-    </w:p>
-    <w:p>
-      <w:pPr>
-        <w:spacing w:after="100"/>
-      </w:pPr>
-      <w:r>
-        <w:rPr>
-          <w:rFonts w:ascii="Arial" w:cs="Arial" w:eastAsia="Arial" w:hAnsi="Arial"/>
-          <w:b/>
-          <w:bCs/>
-          <w:color w:val="C9A227"/>
-          <w:sz w:val="17"/>
-          <w:szCs w:val="17"/>
-        </w:rPr>
-        <w:t xml:space="preserve">80% Day:  </w:t>
-      </w:r>
-      <w:r>
-        <w:rPr>
-          <w:rFonts w:ascii="Arial" w:cs="Arial" w:eastAsia="Arial" w:hAnsi="Arial"/>
-          <w:color w:val="2C2C2C"/>
-          <w:sz w:val="17"/>
-          <w:szCs w:val="17"/>
-        </w:rPr>
-        <w:t xml:space="preserve">Saturday is this week's primary strength stimulus for the upper body. Right shoulder still leads all pressing and pulling at a controlled load — build capacity without overloading the deficit side.</w:t>
-      </w:r>
-    </w:p>
-    <w:p>
-      <w:pPr>
-        <w:spacing w:after="100"/>
-      </w:pPr>
-      <w:r>
-        <w:rPr>
-          <w:rFonts w:ascii="Arial" w:cs="Arial" w:eastAsia="Arial" w:hAnsi="Arial"/>
-          <w:b/>
-          <w:bCs/>
-          <w:color w:val="C9A227"/>
-          <w:sz w:val="17"/>
-          <w:szCs w:val="17"/>
-        </w:rPr>
-        <w:t xml:space="preserve">Protein Reminder:  </w:t>
-      </w:r>
-      <w:r>
-        <w:rPr>
-          <w:rFonts w:ascii="Arial" w:cs="Arial" w:eastAsia="Arial" w:hAnsi="Arial"/>
-          <w:color w:val="2C2C2C"/>
-          <w:sz w:val="17"/>
-          <w:szCs w:val="17"/>
-        </w:rPr>
-        <w:t xml:space="preserve">Target 99–109g today, 4+ meals. Creatine 3–5g with a meal.</w:t>
-      </w:r>
-    </w:p>
-    <w:p>
-      <w:pPr>
-        <w:spacing w:after="100"/>
-      </w:pPr>
-      <w:r>
-        <w:rPr>
-          <w:rFonts w:ascii="Arial" w:cs="Arial" w:eastAsia="Arial" w:hAnsi="Arial"/>
-          <w:b/>
-          <w:bCs/>
-          <w:color w:val="2E7D32"/>
-          <w:sz w:val="17"/>
-          <w:szCs w:val="17"/>
-        </w:rPr>
-        <w:t xml:space="preserve">Warm-Up:  </w:t>
-      </w:r>
-      <w:r>
-        <w:rPr>
-          <w:rFonts w:ascii="Arial" w:cs="Arial" w:eastAsia="Arial" w:hAnsi="Arial"/>
-          <w:color w:val="2C2C2C"/>
-          <w:sz w:val="17"/>
-          <w:szCs w:val="17"/>
-        </w:rPr>
-        <w:t xml:space="preserve">5 min row or bike. 2 rounds: 10 band pull-aparts, 10 scap push-ups, 10 arm circles each direction (both arms).</w:t>
-      </w:r>
-    </w:p>
-    <w:p>
-      <w:pPr>
-        <w:spacing w:after="60" w:before="120"/>
-      </w:pPr>
-      <w:r>
-        <w:rPr>
-          <w:rFonts w:ascii="Arial" w:cs="Arial" w:eastAsia="Arial" w:hAnsi="Arial"/>
-          <w:b/>
-          <w:bCs/>
-          <w:color w:val="C9A227"/>
-          <w:sz w:val="17"/>
-          <w:szCs w:val="17"/>
-        </w:rPr>
-        <w:t xml:space="preserve">A — PRIMARY PRESS</w:t>
-      </w:r>
-    </w:p>
-    <w:p>
-      <w:pPr>
-        <w:spacing w:after="80"/>
-      </w:pPr>
-      <w:r>
-        <w:rPr>
-          <w:rFonts w:ascii="Arial" w:cs="Arial" w:eastAsia="Arial" w:hAnsi="Arial"/>
-          <w:b/>
-          <w:bCs/>
-          <w:color w:val="C9A227"/>
-          <w:sz w:val="17"/>
-          <w:szCs w:val="17"/>
-        </w:rPr>
-        <w:t xml:space="preserve">Shoulder Note:  </w:t>
-      </w:r>
-      <w:r>
-        <w:rPr>
-          <w:rFonts w:ascii="Arial" w:cs="Arial" w:eastAsia="Arial" w:hAnsi="Arial"/>
-          <w:color w:val="2C2C2C"/>
-          <w:sz w:val="17"/>
-          <w:szCs w:val="17"/>
-        </w:rPr>
-        <w:t xml:space="preserve">Right shoulder leads every set at a reduced, controlled load — see clinical flag on page 1.</w:t>
+        <w:t xml:space="preserve">The day's second compound pattern — a hip hinge, rotating off the knee-dominant work above. Left leg leads. If the day calls for a variation, rotate between: a B-stance RDL (rear foot down for balance, left leg takes the working share) or a hip hinge to a bench or target (shortened range) — both left-led, both in the same technique band. The single-leg RDL stays the movement we track.</w:t>
       </w:r>
     </w:p>
     <w:tbl>
@@ -9500,7 +8697,7 @@
               <w:bottom w:val="none" w:color="FFFFFF" w:sz="0"/>
               <w:right w:val="none" w:color="FFFFFF" w:sz="0"/>
             </w:tcBorders>
-            <w:shd w:fill="F5E8C0" w:color="auto" w:val="clear"/>
+            <w:shd w:fill="E0F2F1" w:color="auto" w:val="clear"/>
             <w:tcMar>
               <w:top w:type="dxa" w:w="40"/>
               <w:left w:type="dxa" w:w="80"/>
@@ -9518,7 +8715,7 @@
                 <w:rFonts w:ascii="Arial" w:cs="Arial" w:eastAsia="Arial" w:hAnsi="Arial"/>
                 <w:b/>
                 <w:bCs/>
-                <w:color w:val="C9A227"/>
+                <w:color w:val="00695C"/>
                 <w:sz w:val="15"/>
                 <w:szCs w:val="15"/>
               </w:rPr>
@@ -9535,25 +8732,25 @@
               <w:bottom w:val="none" w:color="FFFFFF" w:sz="0"/>
               <w:right w:val="none" w:color="FFFFFF" w:sz="0"/>
             </w:tcBorders>
-            <w:shd w:fill="F5E8C0" w:color="auto" w:val="clear"/>
-            <w:tcMar>
-              <w:top w:type="dxa" w:w="40"/>
-              <w:left w:type="dxa" w:w="80"/>
-              <w:bottom w:type="dxa" w:w="40"/>
-              <w:right w:type="dxa" w:w="80"/>
-            </w:tcMar>
-            <w:vAlign w:val="center"/>
-          </w:tcPr>
-          <w:p>
-            <w:pPr>
-              <w:jc w:val="center"/>
-            </w:pPr>
-            <w:r>
-              <w:rPr>
-                <w:rFonts w:ascii="Arial" w:cs="Arial" w:eastAsia="Arial" w:hAnsi="Arial"/>
-                <w:b/>
-                <w:bCs/>
-                <w:color w:val="C9A227"/>
+            <w:shd w:fill="E0F2F1" w:color="auto" w:val="clear"/>
+            <w:tcMar>
+              <w:top w:type="dxa" w:w="40"/>
+              <w:left w:type="dxa" w:w="80"/>
+              <w:bottom w:type="dxa" w:w="40"/>
+              <w:right w:type="dxa" w:w="80"/>
+            </w:tcMar>
+            <w:vAlign w:val="center"/>
+          </w:tcPr>
+          <w:p>
+            <w:pPr>
+              <w:jc w:val="center"/>
+            </w:pPr>
+            <w:r>
+              <w:rPr>
+                <w:rFonts w:ascii="Arial" w:cs="Arial" w:eastAsia="Arial" w:hAnsi="Arial"/>
+                <w:b/>
+                <w:bCs/>
+                <w:color w:val="00695C"/>
                 <w:sz w:val="13"/>
                 <w:szCs w:val="13"/>
               </w:rPr>
@@ -9570,25 +8767,25 @@
               <w:bottom w:val="none" w:color="FFFFFF" w:sz="0"/>
               <w:right w:val="none" w:color="FFFFFF" w:sz="0"/>
             </w:tcBorders>
-            <w:shd w:fill="F5E8C0" w:color="auto" w:val="clear"/>
-            <w:tcMar>
-              <w:top w:type="dxa" w:w="40"/>
-              <w:left w:type="dxa" w:w="80"/>
-              <w:bottom w:type="dxa" w:w="40"/>
-              <w:right w:type="dxa" w:w="80"/>
-            </w:tcMar>
-            <w:vAlign w:val="center"/>
-          </w:tcPr>
-          <w:p>
-            <w:pPr>
-              <w:jc w:val="center"/>
-            </w:pPr>
-            <w:r>
-              <w:rPr>
-                <w:rFonts w:ascii="Arial" w:cs="Arial" w:eastAsia="Arial" w:hAnsi="Arial"/>
-                <w:b/>
-                <w:bCs/>
-                <w:color w:val="C9A227"/>
+            <w:shd w:fill="E0F2F1" w:color="auto" w:val="clear"/>
+            <w:tcMar>
+              <w:top w:type="dxa" w:w="40"/>
+              <w:left w:type="dxa" w:w="80"/>
+              <w:bottom w:type="dxa" w:w="40"/>
+              <w:right w:type="dxa" w:w="80"/>
+            </w:tcMar>
+            <w:vAlign w:val="center"/>
+          </w:tcPr>
+          <w:p>
+            <w:pPr>
+              <w:jc w:val="center"/>
+            </w:pPr>
+            <w:r>
+              <w:rPr>
+                <w:rFonts w:ascii="Arial" w:cs="Arial" w:eastAsia="Arial" w:hAnsi="Arial"/>
+                <w:b/>
+                <w:bCs/>
+                <w:color w:val="00695C"/>
                 <w:sz w:val="13"/>
                 <w:szCs w:val="13"/>
               </w:rPr>
@@ -9605,25 +8802,25 @@
               <w:bottom w:val="none" w:color="FFFFFF" w:sz="0"/>
               <w:right w:val="none" w:color="FFFFFF" w:sz="0"/>
             </w:tcBorders>
-            <w:shd w:fill="F5E8C0" w:color="auto" w:val="clear"/>
-            <w:tcMar>
-              <w:top w:type="dxa" w:w="40"/>
-              <w:left w:type="dxa" w:w="80"/>
-              <w:bottom w:type="dxa" w:w="40"/>
-              <w:right w:type="dxa" w:w="80"/>
-            </w:tcMar>
-            <w:vAlign w:val="center"/>
-          </w:tcPr>
-          <w:p>
-            <w:pPr>
-              <w:jc w:val="center"/>
-            </w:pPr>
-            <w:r>
-              <w:rPr>
-                <w:rFonts w:ascii="Arial" w:cs="Arial" w:eastAsia="Arial" w:hAnsi="Arial"/>
-                <w:b/>
-                <w:bCs/>
-                <w:color w:val="C9A227"/>
+            <w:shd w:fill="E0F2F1" w:color="auto" w:val="clear"/>
+            <w:tcMar>
+              <w:top w:type="dxa" w:w="40"/>
+              <w:left w:type="dxa" w:w="80"/>
+              <w:bottom w:type="dxa" w:w="40"/>
+              <w:right w:type="dxa" w:w="80"/>
+            </w:tcMar>
+            <w:vAlign w:val="center"/>
+          </w:tcPr>
+          <w:p>
+            <w:pPr>
+              <w:jc w:val="center"/>
+            </w:pPr>
+            <w:r>
+              <w:rPr>
+                <w:rFonts w:ascii="Arial" w:cs="Arial" w:eastAsia="Arial" w:hAnsi="Arial"/>
+                <w:b/>
+                <w:bCs/>
+                <w:color w:val="00695C"/>
                 <w:sz w:val="13"/>
                 <w:szCs w:val="13"/>
               </w:rPr>
@@ -9640,25 +8837,25 @@
               <w:bottom w:val="none" w:color="FFFFFF" w:sz="0"/>
               <w:right w:val="none" w:color="FFFFFF" w:sz="0"/>
             </w:tcBorders>
-            <w:shd w:fill="F5E8C0" w:color="auto" w:val="clear"/>
-            <w:tcMar>
-              <w:top w:type="dxa" w:w="40"/>
-              <w:left w:type="dxa" w:w="80"/>
-              <w:bottom w:type="dxa" w:w="40"/>
-              <w:right w:type="dxa" w:w="80"/>
-            </w:tcMar>
-            <w:vAlign w:val="center"/>
-          </w:tcPr>
-          <w:p>
-            <w:pPr>
-              <w:jc w:val="center"/>
-            </w:pPr>
-            <w:r>
-              <w:rPr>
-                <w:rFonts w:ascii="Arial" w:cs="Arial" w:eastAsia="Arial" w:hAnsi="Arial"/>
-                <w:b/>
-                <w:bCs/>
-                <w:color w:val="C9A227"/>
+            <w:shd w:fill="E0F2F1" w:color="auto" w:val="clear"/>
+            <w:tcMar>
+              <w:top w:type="dxa" w:w="40"/>
+              <w:left w:type="dxa" w:w="80"/>
+              <w:bottom w:type="dxa" w:w="40"/>
+              <w:right w:type="dxa" w:w="80"/>
+            </w:tcMar>
+            <w:vAlign w:val="center"/>
+          </w:tcPr>
+          <w:p>
+            <w:pPr>
+              <w:jc w:val="center"/>
+            </w:pPr>
+            <w:r>
+              <w:rPr>
+                <w:rFonts w:ascii="Arial" w:cs="Arial" w:eastAsia="Arial" w:hAnsi="Arial"/>
+                <w:b/>
+                <w:bCs/>
+                <w:color w:val="00695C"/>
                 <w:sz w:val="13"/>
                 <w:szCs w:val="13"/>
               </w:rPr>
@@ -9675,25 +8872,25 @@
               <w:bottom w:val="none" w:color="FFFFFF" w:sz="0"/>
               <w:right w:val="none" w:color="FFFFFF" w:sz="0"/>
             </w:tcBorders>
-            <w:shd w:fill="F5E8C0" w:color="auto" w:val="clear"/>
-            <w:tcMar>
-              <w:top w:type="dxa" w:w="40"/>
-              <w:left w:type="dxa" w:w="80"/>
-              <w:bottom w:type="dxa" w:w="40"/>
-              <w:right w:type="dxa" w:w="80"/>
-            </w:tcMar>
-            <w:vAlign w:val="center"/>
-          </w:tcPr>
-          <w:p>
-            <w:pPr>
-              <w:jc w:val="center"/>
-            </w:pPr>
-            <w:r>
-              <w:rPr>
-                <w:rFonts w:ascii="Arial" w:cs="Arial" w:eastAsia="Arial" w:hAnsi="Arial"/>
-                <w:b/>
-                <w:bCs/>
-                <w:color w:val="C9A227"/>
+            <w:shd w:fill="E0F2F1" w:color="auto" w:val="clear"/>
+            <w:tcMar>
+              <w:top w:type="dxa" w:w="40"/>
+              <w:left w:type="dxa" w:w="80"/>
+              <w:bottom w:type="dxa" w:w="40"/>
+              <w:right w:type="dxa" w:w="80"/>
+            </w:tcMar>
+            <w:vAlign w:val="center"/>
+          </w:tcPr>
+          <w:p>
+            <w:pPr>
+              <w:jc w:val="center"/>
+            </w:pPr>
+            <w:r>
+              <w:rPr>
+                <w:rFonts w:ascii="Arial" w:cs="Arial" w:eastAsia="Arial" w:hAnsi="Arial"/>
+                <w:b/>
+                <w:bCs/>
+                <w:color w:val="00695C"/>
                 <w:sz w:val="13"/>
                 <w:szCs w:val="13"/>
               </w:rPr>
@@ -9710,7 +8907,7 @@
               <w:bottom w:val="none" w:color="FFFFFF" w:sz="0"/>
               <w:right w:val="none" w:color="FFFFFF" w:sz="0"/>
             </w:tcBorders>
-            <w:shd w:fill="F5E8C0" w:color="auto" w:val="clear"/>
+            <w:shd w:fill="E0F2F1" w:color="auto" w:val="clear"/>
             <w:tcMar>
               <w:top w:type="dxa" w:w="40"/>
               <w:left w:type="dxa" w:w="80"/>
@@ -9728,7 +8925,7 @@
                 <w:rFonts w:ascii="Arial" w:cs="Arial" w:eastAsia="Arial" w:hAnsi="Arial"/>
                 <w:b/>
                 <w:bCs/>
-                <w:color w:val="C9A227"/>
+                <w:color w:val="00695C"/>
                 <w:sz w:val="15"/>
                 <w:szCs w:val="15"/>
               </w:rPr>
@@ -9747,7 +8944,7 @@
               <w:bottom w:val="none" w:color="FFFFFF" w:sz="0"/>
               <w:right w:val="none" w:color="FFFFFF" w:sz="0"/>
             </w:tcBorders>
-            <w:shd w:fill="FAF3E0" w:color="auto" w:val="clear"/>
+            <w:shd w:fill="F0FAFA" w:color="auto" w:val="clear"/>
             <w:tcMar>
               <w:top w:type="dxa" w:w="40"/>
               <w:left w:type="dxa" w:w="80"/>
@@ -9766,7 +8963,7 @@
                 <w:sz w:val="18"/>
                 <w:szCs w:val="18"/>
               </w:rPr>
-              <w:t xml:space="preserve">Seated DB OH Press</w:t>
+              <w:t xml:space="preserve">Single-Leg RDL (hand-supported)</w:t>
             </w:r>
           </w:p>
           <w:p>
@@ -9779,7 +8976,7 @@
                 <w:sz w:val="14"/>
                 <w:szCs w:val="14"/>
               </w:rPr>
-              <w:t xml:space="preserve">Right shoulder leads at reduced load — strict tempo.</w:t>
+              <w:t xml:space="preserve">Left leg leads.</w:t>
             </w:r>
           </w:p>
         </w:tc>
@@ -9792,7 +8989,7 @@
               <w:bottom w:val="none" w:color="FFFFFF" w:sz="0"/>
               <w:right w:val="none" w:color="FFFFFF" w:sz="0"/>
             </w:tcBorders>
-            <w:shd w:fill="FAF3E0" w:color="auto" w:val="clear"/>
+            <w:shd w:fill="F0FAFA" w:color="auto" w:val="clear"/>
             <w:tcMar>
               <w:top w:type="dxa" w:w="40"/>
               <w:left w:type="dxa" w:w="80"/>
@@ -9812,7 +9009,7 @@
                 <w:sz w:val="15"/>
                 <w:szCs w:val="15"/>
               </w:rPr>
-              <w:t xml:space="preserve">3</w:t>
+              <w:t xml:space="preserve">2</w:t>
             </w:r>
           </w:p>
         </w:tc>
@@ -9825,7 +9022,7 @@
               <w:bottom w:val="none" w:color="FFFFFF" w:sz="0"/>
               <w:right w:val="none" w:color="FFFFFF" w:sz="0"/>
             </w:tcBorders>
-            <w:shd w:fill="FAF3E0" w:color="auto" w:val="clear"/>
+            <w:shd w:fill="F0FAFA" w:color="auto" w:val="clear"/>
             <w:tcMar>
               <w:top w:type="dxa" w:w="40"/>
               <w:left w:type="dxa" w:w="80"/>
@@ -9845,7 +9042,7 @@
                 <w:sz w:val="15"/>
                 <w:szCs w:val="15"/>
               </w:rPr>
-              <w:t xml:space="preserve">5</w:t>
+              <w:t xml:space="preserve">5 each leg</w:t>
             </w:r>
           </w:p>
         </w:tc>
@@ -9858,7 +9055,7 @@
               <w:bottom w:val="none" w:color="FFFFFF" w:sz="0"/>
               <w:right w:val="none" w:color="FFFFFF" w:sz="0"/>
             </w:tcBorders>
-            <w:shd w:fill="FAF3E0" w:color="auto" w:val="clear"/>
+            <w:shd w:fill="F0FAFA" w:color="auto" w:val="clear"/>
             <w:tcMar>
               <w:top w:type="dxa" w:w="40"/>
               <w:left w:type="dxa" w:w="80"/>
@@ -9878,7 +9075,7 @@
                 <w:sz w:val="15"/>
                 <w:szCs w:val="15"/>
               </w:rPr>
-              <w:t xml:space="preserve">12–13 lb</w:t>
+              <w:t xml:space="preserve">BW / light DB</w:t>
             </w:r>
           </w:p>
         </w:tc>
@@ -9891,7 +9088,7 @@
               <w:bottom w:val="none" w:color="FFFFFF" w:sz="0"/>
               <w:right w:val="none" w:color="FFFFFF" w:sz="0"/>
             </w:tcBorders>
-            <w:shd w:fill="FAF3E0" w:color="auto" w:val="clear"/>
+            <w:shd w:fill="F0FAFA" w:color="auto" w:val="clear"/>
             <w:tcMar>
               <w:top w:type="dxa" w:w="40"/>
               <w:left w:type="dxa" w:w="80"/>
@@ -9911,7 +9108,7 @@
                 <w:sz w:val="15"/>
                 <w:szCs w:val="15"/>
               </w:rPr>
-              <w:t xml:space="preserve">2-0-2</w:t>
+              <w:t xml:space="preserve">3-1-1</w:t>
             </w:r>
           </w:p>
         </w:tc>
@@ -9924,7 +9121,7 @@
               <w:bottom w:val="none" w:color="FFFFFF" w:sz="0"/>
               <w:right w:val="none" w:color="FFFFFF" w:sz="0"/>
             </w:tcBorders>
-            <w:shd w:fill="FAF3E0" w:color="auto" w:val="clear"/>
+            <w:shd w:fill="F0FAFA" w:color="auto" w:val="clear"/>
             <w:tcMar>
               <w:top w:type="dxa" w:w="40"/>
               <w:left w:type="dxa" w:w="80"/>
@@ -9944,7 +9141,7 @@
                 <w:sz w:val="15"/>
                 <w:szCs w:val="15"/>
               </w:rPr>
-              <w:t xml:space="preserve">90s</w:t>
+              <w:t xml:space="preserve">60s</w:t>
             </w:r>
           </w:p>
         </w:tc>
@@ -9957,7 +9154,7 @@
               <w:bottom w:val="none" w:color="FFFFFF" w:sz="0"/>
               <w:right w:val="none" w:color="FFFFFF" w:sz="0"/>
             </w:tcBorders>
-            <w:shd w:fill="FAF3E0" w:color="auto" w:val="clear"/>
+            <w:shd w:fill="F0FAFA" w:color="auto" w:val="clear"/>
             <w:tcMar>
               <w:top w:type="dxa" w:w="40"/>
               <w:left w:type="dxa" w:w="80"/>
@@ -9974,7 +9171,7 @@
                 <w:sz w:val="17"/>
                 <w:szCs w:val="17"/>
               </w:rPr>
-              <w:t xml:space="preserve">Right arm first. Ribs down, straight overhead path.</w:t>
+              <w:t xml:space="preserve">Hinge from hip, square hips to the floor.</w:t>
             </w:r>
             <w:r>
               <w:rPr>
@@ -9985,247 +9182,7 @@
                 <w:sz w:val="14"/>
                 <w:szCs w:val="14"/>
               </w:rPr>
-              <w:t xml:space="preserve">  2 RIR</w:t>
-            </w:r>
-          </w:p>
-        </w:tc>
-      </w:tr>
-      <w:tr>
-        <w:tc>
-          <w:tcPr>
-            <w:tcW w:type="dxa" w:w="2400"/>
-            <w:tcBorders>
-              <w:top w:val="none" w:color="FFFFFF" w:sz="0"/>
-              <w:left w:val="none" w:color="FFFFFF" w:sz="0"/>
-              <w:bottom w:val="none" w:color="FFFFFF" w:sz="0"/>
-              <w:right w:val="none" w:color="FFFFFF" w:sz="0"/>
-            </w:tcBorders>
-            <w:shd w:fill="FFFFFF" w:color="auto" w:val="clear"/>
-            <w:tcMar>
-              <w:top w:type="dxa" w:w="40"/>
-              <w:left w:type="dxa" w:w="80"/>
-              <w:bottom w:type="dxa" w:w="40"/>
-              <w:right w:type="dxa" w:w="80"/>
-            </w:tcMar>
-            <w:vAlign w:val="center"/>
-          </w:tcPr>
-          <w:p>
-            <w:r>
-              <w:rPr>
-                <w:rFonts w:ascii="Arial" w:cs="Arial" w:eastAsia="Arial" w:hAnsi="Arial"/>
-                <w:b/>
-                <w:bCs/>
-                <w:color w:val="2C2C2C"/>
-                <w:sz w:val="18"/>
-                <w:szCs w:val="18"/>
-              </w:rPr>
-              <w:t xml:space="preserve">Incline Push-Up</w:t>
-            </w:r>
-          </w:p>
-        </w:tc>
-        <w:tc>
-          <w:tcPr>
-            <w:tcW w:type="dxa" w:w="380"/>
-            <w:tcBorders>
-              <w:top w:val="none" w:color="FFFFFF" w:sz="0"/>
-              <w:left w:val="none" w:color="FFFFFF" w:sz="0"/>
-              <w:bottom w:val="none" w:color="FFFFFF" w:sz="0"/>
-              <w:right w:val="none" w:color="FFFFFF" w:sz="0"/>
-            </w:tcBorders>
-            <w:shd w:fill="FFFFFF" w:color="auto" w:val="clear"/>
-            <w:tcMar>
-              <w:top w:type="dxa" w:w="40"/>
-              <w:left w:type="dxa" w:w="80"/>
-              <w:bottom w:type="dxa" w:w="40"/>
-              <w:right w:type="dxa" w:w="80"/>
-            </w:tcMar>
-            <w:vAlign w:val="center"/>
-          </w:tcPr>
-          <w:p>
-            <w:pPr>
-              <w:jc w:val="center"/>
-            </w:pPr>
-            <w:r>
-              <w:rPr>
-                <w:rFonts w:ascii="Arial" w:cs="Arial" w:eastAsia="Arial" w:hAnsi="Arial"/>
-                <w:color w:val="6B6B6B"/>
-                <w:sz w:val="15"/>
-                <w:szCs w:val="15"/>
-              </w:rPr>
-              <w:t xml:space="preserve">3</w:t>
-            </w:r>
-          </w:p>
-        </w:tc>
-        <w:tc>
-          <w:tcPr>
-            <w:tcW w:type="dxa" w:w="420"/>
-            <w:tcBorders>
-              <w:top w:val="none" w:color="FFFFFF" w:sz="0"/>
-              <w:left w:val="none" w:color="FFFFFF" w:sz="0"/>
-              <w:bottom w:val="none" w:color="FFFFFF" w:sz="0"/>
-              <w:right w:val="none" w:color="FFFFFF" w:sz="0"/>
-            </w:tcBorders>
-            <w:shd w:fill="FFFFFF" w:color="auto" w:val="clear"/>
-            <w:tcMar>
-              <w:top w:type="dxa" w:w="40"/>
-              <w:left w:type="dxa" w:w="80"/>
-              <w:bottom w:type="dxa" w:w="40"/>
-              <w:right w:type="dxa" w:w="80"/>
-            </w:tcMar>
-            <w:vAlign w:val="center"/>
-          </w:tcPr>
-          <w:p>
-            <w:pPr>
-              <w:jc w:val="center"/>
-            </w:pPr>
-            <w:r>
-              <w:rPr>
-                <w:rFonts w:ascii="Arial" w:cs="Arial" w:eastAsia="Arial" w:hAnsi="Arial"/>
-                <w:color w:val="6B6B6B"/>
-                <w:sz w:val="15"/>
-                <w:szCs w:val="15"/>
-              </w:rPr>
-              <w:t xml:space="preserve">6–8</w:t>
-            </w:r>
-          </w:p>
-        </w:tc>
-        <w:tc>
-          <w:tcPr>
-            <w:tcW w:type="dxa" w:w="680"/>
-            <w:tcBorders>
-              <w:top w:val="none" w:color="FFFFFF" w:sz="0"/>
-              <w:left w:val="none" w:color="FFFFFF" w:sz="0"/>
-              <w:bottom w:val="none" w:color="FFFFFF" w:sz="0"/>
-              <w:right w:val="none" w:color="FFFFFF" w:sz="0"/>
-            </w:tcBorders>
-            <w:shd w:fill="FFFFFF" w:color="auto" w:val="clear"/>
-            <w:tcMar>
-              <w:top w:type="dxa" w:w="40"/>
-              <w:left w:type="dxa" w:w="80"/>
-              <w:bottom w:type="dxa" w:w="40"/>
-              <w:right w:type="dxa" w:w="80"/>
-            </w:tcMar>
-            <w:vAlign w:val="center"/>
-          </w:tcPr>
-          <w:p>
-            <w:pPr>
-              <w:jc w:val="center"/>
-            </w:pPr>
-            <w:r>
-              <w:rPr>
-                <w:rFonts w:ascii="Arial" w:cs="Arial" w:eastAsia="Arial" w:hAnsi="Arial"/>
-                <w:color w:val="6B6B6B"/>
-                <w:sz w:val="15"/>
-                <w:szCs w:val="15"/>
-              </w:rPr>
-              <w:t xml:space="preserve">BW, bench</w:t>
-            </w:r>
-          </w:p>
-        </w:tc>
-        <w:tc>
-          <w:tcPr>
-            <w:tcW w:type="dxa" w:w="540"/>
-            <w:tcBorders>
-              <w:top w:val="none" w:color="FFFFFF" w:sz="0"/>
-              <w:left w:val="none" w:color="FFFFFF" w:sz="0"/>
-              <w:bottom w:val="none" w:color="FFFFFF" w:sz="0"/>
-              <w:right w:val="none" w:color="FFFFFF" w:sz="0"/>
-            </w:tcBorders>
-            <w:shd w:fill="FFFFFF" w:color="auto" w:val="clear"/>
-            <w:tcMar>
-              <w:top w:type="dxa" w:w="40"/>
-              <w:left w:type="dxa" w:w="80"/>
-              <w:bottom w:type="dxa" w:w="40"/>
-              <w:right w:type="dxa" w:w="80"/>
-            </w:tcMar>
-            <w:vAlign w:val="center"/>
-          </w:tcPr>
-          <w:p>
-            <w:pPr>
-              <w:jc w:val="center"/>
-            </w:pPr>
-            <w:r>
-              <w:rPr>
-                <w:rFonts w:ascii="Arial" w:cs="Arial" w:eastAsia="Arial" w:hAnsi="Arial"/>
-                <w:color w:val="6B6B6B"/>
-                <w:sz w:val="15"/>
-                <w:szCs w:val="15"/>
-              </w:rPr>
-              <w:t xml:space="preserve">3-0-1</w:t>
-            </w:r>
-          </w:p>
-        </w:tc>
-        <w:tc>
-          <w:tcPr>
-            <w:tcW w:type="dxa" w:w="440"/>
-            <w:tcBorders>
-              <w:top w:val="none" w:color="FFFFFF" w:sz="0"/>
-              <w:left w:val="none" w:color="FFFFFF" w:sz="0"/>
-              <w:bottom w:val="none" w:color="FFFFFF" w:sz="0"/>
-              <w:right w:val="none" w:color="FFFFFF" w:sz="0"/>
-            </w:tcBorders>
-            <w:shd w:fill="FFFFFF" w:color="auto" w:val="clear"/>
-            <w:tcMar>
-              <w:top w:type="dxa" w:w="40"/>
-              <w:left w:type="dxa" w:w="80"/>
-              <w:bottom w:type="dxa" w:w="40"/>
-              <w:right w:type="dxa" w:w="80"/>
-            </w:tcMar>
-            <w:vAlign w:val="center"/>
-          </w:tcPr>
-          <w:p>
-            <w:pPr>
-              <w:jc w:val="center"/>
-            </w:pPr>
-            <w:r>
-              <w:rPr>
-                <w:rFonts w:ascii="Arial" w:cs="Arial" w:eastAsia="Arial" w:hAnsi="Arial"/>
-                <w:color w:val="6B6B6B"/>
-                <w:sz w:val="15"/>
-                <w:szCs w:val="15"/>
-              </w:rPr>
-              <w:t xml:space="preserve">60s</w:t>
-            </w:r>
-          </w:p>
-        </w:tc>
-        <w:tc>
-          <w:tcPr>
-            <w:tcW w:type="dxa" w:w="5580"/>
-            <w:tcBorders>
-              <w:top w:val="none" w:color="FFFFFF" w:sz="0"/>
-              <w:left w:val="none" w:color="FFFFFF" w:sz="0"/>
-              <w:bottom w:val="none" w:color="FFFFFF" w:sz="0"/>
-              <w:right w:val="none" w:color="FFFFFF" w:sz="0"/>
-            </w:tcBorders>
-            <w:shd w:fill="FFFFFF" w:color="auto" w:val="clear"/>
-            <w:tcMar>
-              <w:top w:type="dxa" w:w="40"/>
-              <w:left w:type="dxa" w:w="80"/>
-              <w:bottom w:type="dxa" w:w="40"/>
-              <w:right w:type="dxa" w:w="80"/>
-            </w:tcMar>
-            <w:vAlign w:val="center"/>
-          </w:tcPr>
-          <w:p>
-            <w:r>
-              <w:rPr>
-                <w:rFonts w:ascii="Arial" w:cs="Arial" w:eastAsia="Arial" w:hAnsi="Arial"/>
-                <w:color w:val="6B6B6B"/>
-                <w:sz w:val="17"/>
-                <w:szCs w:val="17"/>
-              </w:rPr>
-              <w:t xml:space="preserve">Lower bench height only if form holds clean.</w:t>
-            </w:r>
-            <w:r>
-              <w:rPr>
-                <w:rFonts w:ascii="Arial" w:cs="Arial" w:eastAsia="Arial" w:hAnsi="Arial"/>
-                <w:i/>
-                <w:iCs/>
-                <w:color w:val="00695C"/>
-                <w:sz w:val="14"/>
-                <w:szCs w:val="14"/>
-              </w:rPr>
-              <w:t xml:space="preserve">  1 RIR</w:t>
+              <w:t xml:space="preserve">  3+ RIR — technique day</w:t>
             </w:r>
           </w:p>
         </w:tc>
@@ -10249,7 +9206,7 @@
           <w:sz w:val="17"/>
           <w:szCs w:val="17"/>
         </w:rPr>
-        <w:t xml:space="preserve">B — PULL</w:t>
+        <w:t xml:space="preserve">E — FULL-BODY INTEGRATION — SUITCASE CARRY</w:t>
       </w:r>
     </w:p>
     <w:p>
@@ -10274,7 +9231,7 @@
           <w:sz w:val="17"/>
           <w:szCs w:val="17"/>
         </w:rPr>
-        <w:t xml:space="preserve">Single-arm row trains the weaker right shoulder unilaterally under full control.</w:t>
+        <w:t xml:space="preserve">The session's closing compound — one loaded walk pulling the day's single-leg control and bracing together under gait, one hand at a time with both sides working evenly. Distance and quality govern this work, not a rep count.</w:t>
       </w:r>
     </w:p>
     <w:tbl>
@@ -10574,20 +9531,7 @@
                 <w:sz w:val="18"/>
                 <w:szCs w:val="18"/>
               </w:rPr>
-              <w:t xml:space="preserve">Single-Arm DB Row</w:t>
-            </w:r>
-          </w:p>
-          <w:p>
-            <w:r>
-              <w:rPr>
-                <w:rFonts w:ascii="Arial" w:cs="Arial" w:eastAsia="Arial" w:hAnsi="Arial"/>
-                <w:i/>
-                <w:iCs/>
-                <w:color w:val="B71C1C"/>
-                <w:sz w:val="14"/>
-                <w:szCs w:val="14"/>
-              </w:rPr>
-              <w:t xml:space="preserve">Right arm leads — log load L vs R separately.</w:t>
+              <w:t xml:space="preserve">DB Suitcase Farmer Carry</w:t>
             </w:r>
           </w:p>
         </w:tc>
@@ -10653,7 +9597,7 @@
                 <w:sz w:val="15"/>
                 <w:szCs w:val="15"/>
               </w:rPr>
-              <w:t xml:space="preserve">6 each arm</w:t>
+              <w:t xml:space="preserve">20 yd each hand</w:t>
             </w:r>
           </w:p>
         </w:tc>
@@ -10686,7 +9630,7 @@
                 <w:sz w:val="15"/>
                 <w:szCs w:val="15"/>
               </w:rPr>
-              <w:t xml:space="preserve">15–17.5 lb</w:t>
+              <w:t xml:space="preserve">25 lb</w:t>
             </w:r>
           </w:p>
         </w:tc>
@@ -10719,7 +9663,7 @@
                 <w:sz w:val="15"/>
                 <w:szCs w:val="15"/>
               </w:rPr>
-              <w:t xml:space="preserve">2-1-1</w:t>
+              <w:t xml:space="preserve">—</w:t>
             </w:r>
           </w:p>
         </w:tc>
@@ -10752,7 +9696,7 @@
                 <w:sz w:val="15"/>
                 <w:szCs w:val="15"/>
               </w:rPr>
-              <w:t xml:space="preserve">75s</w:t>
+              <w:t xml:space="preserve">60s</w:t>
             </w:r>
           </w:p>
         </w:tc>
@@ -10782,7 +9726,7 @@
                 <w:sz w:val="17"/>
                 <w:szCs w:val="17"/>
               </w:rPr>
-              <w:t xml:space="preserve">Right first. Flat back, pull elbow to hip.</w:t>
+              <w:t xml:space="preserve">Ribs stacked over hips, no side lean, tight grip.</w:t>
             </w:r>
             <w:r>
               <w:rPr>
@@ -10793,236 +9737,7 @@
                 <w:sz w:val="14"/>
                 <w:szCs w:val="14"/>
               </w:rPr>
-              <w:t xml:space="preserve">  2 RIR</w:t>
-            </w:r>
-          </w:p>
-        </w:tc>
-      </w:tr>
-      <w:tr>
-        <w:tc>
-          <w:tcPr>
-            <w:tcW w:type="dxa" w:w="2400"/>
-            <w:tcBorders>
-              <w:top w:val="none" w:color="FFFFFF" w:sz="0"/>
-              <w:left w:val="none" w:color="FFFFFF" w:sz="0"/>
-              <w:bottom w:val="none" w:color="FFFFFF" w:sz="0"/>
-              <w:right w:val="none" w:color="FFFFFF" w:sz="0"/>
-            </w:tcBorders>
-            <w:shd w:fill="FFFFFF" w:color="auto" w:val="clear"/>
-            <w:tcMar>
-              <w:top w:type="dxa" w:w="40"/>
-              <w:left w:type="dxa" w:w="80"/>
-              <w:bottom w:type="dxa" w:w="40"/>
-              <w:right w:type="dxa" w:w="80"/>
-            </w:tcMar>
-            <w:vAlign w:val="center"/>
-          </w:tcPr>
-          <w:p>
-            <w:r>
-              <w:rPr>
-                <w:rFonts w:ascii="Arial" w:cs="Arial" w:eastAsia="Arial" w:hAnsi="Arial"/>
-                <w:b/>
-                <w:bCs/>
-                <w:color w:val="2C2C2C"/>
-                <w:sz w:val="18"/>
-                <w:szCs w:val="18"/>
-              </w:rPr>
-              <w:t xml:space="preserve">Band Pull-Apart</w:t>
-            </w:r>
-          </w:p>
-        </w:tc>
-        <w:tc>
-          <w:tcPr>
-            <w:tcW w:type="dxa" w:w="380"/>
-            <w:tcBorders>
-              <w:top w:val="none" w:color="FFFFFF" w:sz="0"/>
-              <w:left w:val="none" w:color="FFFFFF" w:sz="0"/>
-              <w:bottom w:val="none" w:color="FFFFFF" w:sz="0"/>
-              <w:right w:val="none" w:color="FFFFFF" w:sz="0"/>
-            </w:tcBorders>
-            <w:shd w:fill="FFFFFF" w:color="auto" w:val="clear"/>
-            <w:tcMar>
-              <w:top w:type="dxa" w:w="40"/>
-              <w:left w:type="dxa" w:w="80"/>
-              <w:bottom w:type="dxa" w:w="40"/>
-              <w:right w:type="dxa" w:w="80"/>
-            </w:tcMar>
-            <w:vAlign w:val="center"/>
-          </w:tcPr>
-          <w:p>
-            <w:pPr>
-              <w:jc w:val="center"/>
-            </w:pPr>
-            <w:r>
-              <w:rPr>
-                <w:rFonts w:ascii="Arial" w:cs="Arial" w:eastAsia="Arial" w:hAnsi="Arial"/>
-                <w:color w:val="6B6B6B"/>
-                <w:sz w:val="15"/>
-                <w:szCs w:val="15"/>
-              </w:rPr>
-              <w:t xml:space="preserve">2</w:t>
-            </w:r>
-          </w:p>
-        </w:tc>
-        <w:tc>
-          <w:tcPr>
-            <w:tcW w:type="dxa" w:w="420"/>
-            <w:tcBorders>
-              <w:top w:val="none" w:color="FFFFFF" w:sz="0"/>
-              <w:left w:val="none" w:color="FFFFFF" w:sz="0"/>
-              <w:bottom w:val="none" w:color="FFFFFF" w:sz="0"/>
-              <w:right w:val="none" w:color="FFFFFF" w:sz="0"/>
-            </w:tcBorders>
-            <w:shd w:fill="FFFFFF" w:color="auto" w:val="clear"/>
-            <w:tcMar>
-              <w:top w:type="dxa" w:w="40"/>
-              <w:left w:type="dxa" w:w="80"/>
-              <w:bottom w:type="dxa" w:w="40"/>
-              <w:right w:type="dxa" w:w="80"/>
-            </w:tcMar>
-            <w:vAlign w:val="center"/>
-          </w:tcPr>
-          <w:p>
-            <w:pPr>
-              <w:jc w:val="center"/>
-            </w:pPr>
-            <w:r>
-              <w:rPr>
-                <w:rFonts w:ascii="Arial" w:cs="Arial" w:eastAsia="Arial" w:hAnsi="Arial"/>
-                <w:color w:val="6B6B6B"/>
-                <w:sz w:val="15"/>
-                <w:szCs w:val="15"/>
-              </w:rPr>
-              <w:t xml:space="preserve">12–15</w:t>
-            </w:r>
-          </w:p>
-        </w:tc>
-        <w:tc>
-          <w:tcPr>
-            <w:tcW w:type="dxa" w:w="680"/>
-            <w:tcBorders>
-              <w:top w:val="none" w:color="FFFFFF" w:sz="0"/>
-              <w:left w:val="none" w:color="FFFFFF" w:sz="0"/>
-              <w:bottom w:val="none" w:color="FFFFFF" w:sz="0"/>
-              <w:right w:val="none" w:color="FFFFFF" w:sz="0"/>
-            </w:tcBorders>
-            <w:shd w:fill="FFFFFF" w:color="auto" w:val="clear"/>
-            <w:tcMar>
-              <w:top w:type="dxa" w:w="40"/>
-              <w:left w:type="dxa" w:w="80"/>
-              <w:bottom w:type="dxa" w:w="40"/>
-              <w:right w:type="dxa" w:w="80"/>
-            </w:tcMar>
-            <w:vAlign w:val="center"/>
-          </w:tcPr>
-          <w:p>
-            <w:pPr>
-              <w:jc w:val="center"/>
-            </w:pPr>
-            <w:r>
-              <w:rPr>
-                <w:rFonts w:ascii="Arial" w:cs="Arial" w:eastAsia="Arial" w:hAnsi="Arial"/>
-                <w:color w:val="6B6B6B"/>
-                <w:sz w:val="15"/>
-                <w:szCs w:val="15"/>
-              </w:rPr>
-              <w:t xml:space="preserve">Light band</w:t>
-            </w:r>
-          </w:p>
-        </w:tc>
-        <w:tc>
-          <w:tcPr>
-            <w:tcW w:type="dxa" w:w="540"/>
-            <w:tcBorders>
-              <w:top w:val="none" w:color="FFFFFF" w:sz="0"/>
-              <w:left w:val="none" w:color="FFFFFF" w:sz="0"/>
-              <w:bottom w:val="none" w:color="FFFFFF" w:sz="0"/>
-              <w:right w:val="none" w:color="FFFFFF" w:sz="0"/>
-            </w:tcBorders>
-            <w:shd w:fill="FFFFFF" w:color="auto" w:val="clear"/>
-            <w:tcMar>
-              <w:top w:type="dxa" w:w="40"/>
-              <w:left w:type="dxa" w:w="80"/>
-              <w:bottom w:type="dxa" w:w="40"/>
-              <w:right w:type="dxa" w:w="80"/>
-            </w:tcMar>
-            <w:vAlign w:val="center"/>
-          </w:tcPr>
-          <w:p>
-            <w:pPr>
-              <w:jc w:val="center"/>
-            </w:pPr>
-            <w:r>
-              <w:rPr>
-                <w:rFonts w:ascii="Arial" w:cs="Arial" w:eastAsia="Arial" w:hAnsi="Arial"/>
-                <w:color w:val="6B6B6B"/>
-                <w:sz w:val="15"/>
-                <w:szCs w:val="15"/>
-              </w:rPr>
-              <w:t xml:space="preserve">2-1-2</w:t>
-            </w:r>
-          </w:p>
-        </w:tc>
-        <w:tc>
-          <w:tcPr>
-            <w:tcW w:type="dxa" w:w="440"/>
-            <w:tcBorders>
-              <w:top w:val="none" w:color="FFFFFF" w:sz="0"/>
-              <w:left w:val="none" w:color="FFFFFF" w:sz="0"/>
-              <w:bottom w:val="none" w:color="FFFFFF" w:sz="0"/>
-              <w:right w:val="none" w:color="FFFFFF" w:sz="0"/>
-            </w:tcBorders>
-            <w:shd w:fill="FFFFFF" w:color="auto" w:val="clear"/>
-            <w:tcMar>
-              <w:top w:type="dxa" w:w="40"/>
-              <w:left w:type="dxa" w:w="80"/>
-              <w:bottom w:type="dxa" w:w="40"/>
-              <w:right w:type="dxa" w:w="80"/>
-            </w:tcMar>
-            <w:vAlign w:val="center"/>
-          </w:tcPr>
-          <w:p>
-            <w:pPr>
-              <w:jc w:val="center"/>
-            </w:pPr>
-            <w:r>
-              <w:rPr>
-                <w:rFonts w:ascii="Arial" w:cs="Arial" w:eastAsia="Arial" w:hAnsi="Arial"/>
-                <w:color w:val="6B6B6B"/>
-                <w:sz w:val="15"/>
-                <w:szCs w:val="15"/>
-              </w:rPr>
-              <w:t xml:space="preserve">45s</w:t>
-            </w:r>
-          </w:p>
-        </w:tc>
-        <w:tc>
-          <w:tcPr>
-            <w:tcW w:type="dxa" w:w="5580"/>
-            <w:tcBorders>
-              <w:top w:val="none" w:color="FFFFFF" w:sz="0"/>
-              <w:left w:val="none" w:color="FFFFFF" w:sz="0"/>
-              <w:bottom w:val="none" w:color="FFFFFF" w:sz="0"/>
-              <w:right w:val="none" w:color="FFFFFF" w:sz="0"/>
-            </w:tcBorders>
-            <w:shd w:fill="FFFFFF" w:color="auto" w:val="clear"/>
-            <w:tcMar>
-              <w:top w:type="dxa" w:w="40"/>
-              <w:left w:type="dxa" w:w="80"/>
-              <w:bottom w:type="dxa" w:w="40"/>
-              <w:right w:type="dxa" w:w="80"/>
-            </w:tcMar>
-            <w:vAlign w:val="center"/>
-          </w:tcPr>
-          <w:p>
-            <w:r>
-              <w:rPr>
-                <w:rFonts w:ascii="Arial" w:cs="Arial" w:eastAsia="Arial" w:hAnsi="Arial"/>
-                <w:color w:val="6B6B6B"/>
-                <w:sz w:val="17"/>
-                <w:szCs w:val="17"/>
-              </w:rPr>
-              <w:t xml:space="preserve">Squeeze shoulder blades, control the return.</w:t>
+              <w:t xml:space="preserve">  Distance &amp; quality governed — no RIR target</w:t>
             </w:r>
           </w:p>
         </w:tc>
@@ -11035,7 +9750,32 @@
     </w:p>
     <w:p>
       <w:pPr>
-        <w:spacing w:after="60" w:before="120"/>
+        <w:spacing w:after="100"/>
+      </w:pPr>
+      <w:r>
+        <w:rPr>
+          <w:rFonts w:ascii="Arial" w:cs="Arial" w:eastAsia="Arial" w:hAnsi="Arial"/>
+          <w:b/>
+          <w:bCs/>
+          <w:color w:val="1565C0"/>
+          <w:sz w:val="17"/>
+          <w:szCs w:val="17"/>
+        </w:rPr>
+        <w:t xml:space="preserve">Cool-Down:  </w:t>
+      </w:r>
+      <w:r>
+        <w:rPr>
+          <w:rFonts w:ascii="Arial" w:cs="Arial" w:eastAsia="Arial" w:hAnsi="Arial"/>
+          <w:color w:val="2C2C2C"/>
+          <w:sz w:val="17"/>
+          <w:szCs w:val="17"/>
+        </w:rPr>
+        <w:t xml:space="preserve">90/90 hip stretch 30s/side. Standing adductor stretch 20s/side. Figure-4 glute stretch 30s/side.</w:t>
+      </w:r>
+    </w:p>
+    <w:p>
+      <w:pPr>
+        <w:spacing w:after="100"/>
       </w:pPr>
       <w:r>
         <w:rPr>
@@ -11046,7 +9786,353 @@
           <w:sz w:val="17"/>
           <w:szCs w:val="17"/>
         </w:rPr>
-        <w:t xml:space="preserve">C — CORE &amp; CARRY</w:t>
+        <w:t xml:space="preserve">ICONS Note:  </w:t>
+      </w:r>
+      <w:r>
+        <w:rPr>
+          <w:rFonts w:ascii="Arial" w:cs="Arial" w:eastAsia="Arial" w:hAnsi="Arial"/>
+          <w:color w:val="2C2C2C"/>
+          <w:sz w:val="17"/>
+          <w:szCs w:val="17"/>
+        </w:rPr>
+        <w:t xml:space="preserve">No PRs today — this session exists to close the left/right leg gap. Every left-side rep goes first, at full attention, before the right. The closing carry keeps that control working all the way out the door.</w:t>
+      </w:r>
+    </w:p>
+    <w:p>
+      <w:pPr>
+        <w:spacing w:after="100"/>
+      </w:pPr>
+      <w:r>
+        <w:rPr>
+          <w:rFonts w:ascii="Arial" w:cs="Arial" w:eastAsia="Arial" w:hAnsi="Arial"/>
+          <w:b/>
+          <w:bCs/>
+          <w:color w:val="00695C"/>
+          <w:sz w:val="17"/>
+          <w:szCs w:val="17"/>
+        </w:rPr>
+        <w:t xml:space="preserve">Progression Rule — RIR Model:  </w:t>
+      </w:r>
+      <w:r>
+        <w:rPr>
+          <w:rFonts w:ascii="Arial" w:cs="Arial" w:eastAsia="Arial" w:hAnsi="Arial"/>
+          <w:b/>
+          <w:bCs/>
+          <w:color w:val="2C2C2C"/>
+          <w:sz w:val="17"/>
+          <w:szCs w:val="17"/>
+        </w:rPr>
+        <w:t xml:space="preserve">Add weight </w:t>
+      </w:r>
+      <w:r>
+        <w:rPr>
+          <w:rFonts w:ascii="Arial" w:cs="Arial" w:eastAsia="Arial" w:hAnsi="Arial"/>
+          <w:color w:val="2C2C2C"/>
+          <w:sz w:val="17"/>
+          <w:szCs w:val="17"/>
+        </w:rPr>
+        <w:t xml:space="preserve">at top of rep range + 2 RIR + clean form. </w:t>
+      </w:r>
+      <w:r>
+        <w:rPr>
+          <w:rFonts w:ascii="Arial" w:cs="Arial" w:eastAsia="Arial" w:hAnsi="Arial"/>
+          <w:b/>
+          <w:bCs/>
+          <w:color w:val="2C2C2C"/>
+          <w:sz w:val="17"/>
+          <w:szCs w:val="17"/>
+        </w:rPr>
+        <w:t xml:space="preserve">Same weight </w:t>
+      </w:r>
+      <w:r>
+        <w:rPr>
+          <w:rFonts w:ascii="Arial" w:cs="Arial" w:eastAsia="Arial" w:hAnsi="Arial"/>
+          <w:color w:val="2C2C2C"/>
+          <w:sz w:val="17"/>
+          <w:szCs w:val="17"/>
+        </w:rPr>
+        <w:t xml:space="preserve">if form degraded on final reps. </w:t>
+      </w:r>
+      <w:r>
+        <w:rPr>
+          <w:rFonts w:ascii="Arial" w:cs="Arial" w:eastAsia="Arial" w:hAnsi="Arial"/>
+          <w:b/>
+          <w:bCs/>
+          <w:color w:val="2C2C2C"/>
+          <w:sz w:val="17"/>
+          <w:szCs w:val="17"/>
+        </w:rPr>
+        <w:t xml:space="preserve">Drop weight </w:t>
+      </w:r>
+      <w:r>
+        <w:rPr>
+          <w:rFonts w:ascii="Arial" w:cs="Arial" w:eastAsia="Arial" w:hAnsi="Arial"/>
+          <w:color w:val="2C2C2C"/>
+          <w:sz w:val="17"/>
+          <w:szCs w:val="17"/>
+        </w:rPr>
+        <w:t xml:space="preserve">on missed reps, pain, or excess fatigue.</w:t>
+      </w:r>
+    </w:p>
+    <w:p>
+      <w:r>
+        <w:br w:type="page"/>
+      </w:r>
+    </w:p>
+    <w:tbl>
+      <w:tblPr>
+        <w:tblW w:type="dxa" w:w="10440"/>
+        <w:tblBorders>
+          <w:top w:val="none" w:color="FFFFFF" w:sz="0"/>
+          <w:left w:val="none" w:color="FFFFFF" w:sz="0"/>
+          <w:bottom w:val="none" w:color="FFFFFF" w:sz="0"/>
+          <w:right w:val="none" w:color="FFFFFF" w:sz="0"/>
+          <w:insideH w:val="single" w:color="auto" w:sz="4"/>
+          <w:insideV w:val="single" w:color="auto" w:sz="4"/>
+        </w:tblBorders>
+      </w:tblPr>
+      <w:tblGrid>
+        <w:gridCol w:w="1600"/>
+        <w:gridCol w:w="8840"/>
+      </w:tblGrid>
+      <w:tr>
+        <w:tc>
+          <w:tcPr>
+            <w:tcW w:type="dxa" w:w="1600"/>
+            <w:tcBorders>
+              <w:top w:val="none" w:color="FFFFFF" w:sz="0"/>
+              <w:left w:val="none" w:color="FFFFFF" w:sz="0"/>
+              <w:bottom w:val="none" w:color="FFFFFF" w:sz="0"/>
+              <w:right w:val="none" w:color="FFFFFF" w:sz="0"/>
+            </w:tcBorders>
+            <w:shd w:fill="C9A227" w:color="auto" w:val="clear"/>
+            <w:tcMar>
+              <w:top w:type="dxa" w:w="40"/>
+              <w:left w:type="dxa" w:w="80"/>
+              <w:bottom w:type="dxa" w:w="40"/>
+              <w:right w:type="dxa" w:w="80"/>
+            </w:tcMar>
+            <w:vAlign w:val="center"/>
+          </w:tcPr>
+          <w:p>
+            <w:pPr>
+              <w:spacing w:after="20"/>
+              <w:jc w:val="center"/>
+            </w:pPr>
+            <w:r>
+              <w:rPr>
+                <w:rFonts w:ascii="Arial" w:cs="Arial" w:eastAsia="Arial" w:hAnsi="Arial"/>
+                <w:b/>
+                <w:bCs/>
+                <w:color w:val="FFFFFF"/>
+                <w:sz w:val="36"/>
+                <w:szCs w:val="36"/>
+              </w:rPr>
+              <w:t xml:space="preserve">80%</w:t>
+            </w:r>
+          </w:p>
+          <w:p>
+            <w:pPr>
+              <w:jc w:val="center"/>
+            </w:pPr>
+            <w:r>
+              <w:rPr>
+                <w:rFonts w:ascii="Arial" w:cs="Arial" w:eastAsia="Arial" w:hAnsi="Arial"/>
+                <w:b/>
+                <w:bCs/>
+                <w:color w:val="FFFFFF"/>
+                <w:sz w:val="13"/>
+                <w:szCs w:val="13"/>
+              </w:rPr>
+              <w:t xml:space="preserve">INTENSITY</w:t>
+            </w:r>
+          </w:p>
+        </w:tc>
+        <w:tc>
+          <w:tcPr>
+            <w:tcW w:type="dxa" w:w="8840"/>
+            <w:tcBorders>
+              <w:top w:val="none" w:color="FFFFFF" w:sz="0"/>
+              <w:left w:val="none" w:color="FFFFFF" w:sz="0"/>
+              <w:bottom w:val="none" w:color="FFFFFF" w:sz="0"/>
+              <w:right w:val="none" w:color="FFFFFF" w:sz="0"/>
+            </w:tcBorders>
+            <w:shd w:fill="FAF3E0" w:color="auto" w:val="clear"/>
+            <w:tcMar>
+              <w:top w:type="dxa" w:w="60"/>
+              <w:left w:type="dxa" w:w="120"/>
+              <w:bottom w:type="dxa" w:w="60"/>
+              <w:right w:type="dxa" w:w="120"/>
+            </w:tcMar>
+            <w:vAlign w:val="center"/>
+          </w:tcPr>
+          <w:p>
+            <w:pPr>
+              <w:spacing w:after="30"/>
+            </w:pPr>
+            <w:r>
+              <w:rPr>
+                <w:rFonts w:ascii="Arial" w:cs="Arial" w:eastAsia="Arial" w:hAnsi="Arial"/>
+                <w:b/>
+                <w:bCs/>
+                <w:color w:val="C9A227"/>
+                <w:sz w:val="26"/>
+                <w:szCs w:val="26"/>
+              </w:rPr>
+              <w:t xml:space="preserve">DAY 3 — SATURDAY</w:t>
+            </w:r>
+          </w:p>
+          <w:p>
+            <w:pPr>
+              <w:spacing w:after="30"/>
+            </w:pPr>
+            <w:r>
+              <w:rPr>
+                <w:rFonts w:ascii="Arial" w:cs="Arial" w:eastAsia="Arial" w:hAnsi="Arial"/>
+                <w:b/>
+                <w:bCs/>
+                <w:color w:val="2C2C2C"/>
+                <w:sz w:val="19"/>
+                <w:szCs w:val="19"/>
+              </w:rPr>
+              <w:t xml:space="preserve">Upper Push/Pull + Core — Primary Strength</w:t>
+            </w:r>
+          </w:p>
+          <w:p>
+            <w:r>
+              <w:rPr>
+                <w:rFonts w:ascii="Arial" w:cs="Arial" w:eastAsia="Arial" w:hAnsi="Arial"/>
+                <w:b/>
+                <w:bCs/>
+                <w:color w:val="C9A227"/>
+                <w:sz w:val="14"/>
+                <w:szCs w:val="14"/>
+              </w:rPr>
+              <w:t xml:space="preserve">PRIMARY STRENGTH DAY — LAST 1–2 REPS HARD, ACHIEVABLE</w:t>
+            </w:r>
+          </w:p>
+        </w:tc>
+      </w:tr>
+    </w:tbl>
+    <w:p>
+      <w:pPr>
+        <w:spacing w:after="100"/>
+      </w:pPr>
+    </w:p>
+    <w:p>
+      <w:pPr>
+        <w:spacing w:after="100"/>
+      </w:pPr>
+      <w:r>
+        <w:rPr>
+          <w:rFonts w:ascii="Arial" w:cs="Arial" w:eastAsia="Arial" w:hAnsi="Arial"/>
+          <w:b/>
+          <w:bCs/>
+          <w:color w:val="C9A227"/>
+          <w:sz w:val="17"/>
+          <w:szCs w:val="17"/>
+        </w:rPr>
+        <w:t xml:space="preserve">80% Day:  </w:t>
+      </w:r>
+      <w:r>
+        <w:rPr>
+          <w:rFonts w:ascii="Arial" w:cs="Arial" w:eastAsia="Arial" w:hAnsi="Arial"/>
+          <w:color w:val="2C2C2C"/>
+          <w:sz w:val="17"/>
+          <w:szCs w:val="17"/>
+        </w:rPr>
+        <w:t xml:space="preserve">Saturday is this week's primary strength stimulus for the upper body. Right shoulder still leads all pressing and pulling at a controlled load — build capacity without overloading the deficit side.</w:t>
+      </w:r>
+    </w:p>
+    <w:p>
+      <w:pPr>
+        <w:spacing w:after="100"/>
+      </w:pPr>
+      <w:r>
+        <w:rPr>
+          <w:rFonts w:ascii="Arial" w:cs="Arial" w:eastAsia="Arial" w:hAnsi="Arial"/>
+          <w:b/>
+          <w:bCs/>
+          <w:color w:val="C9A227"/>
+          <w:sz w:val="17"/>
+          <w:szCs w:val="17"/>
+        </w:rPr>
+        <w:t xml:space="preserve">Protein Reminder:  </w:t>
+      </w:r>
+      <w:r>
+        <w:rPr>
+          <w:rFonts w:ascii="Arial" w:cs="Arial" w:eastAsia="Arial" w:hAnsi="Arial"/>
+          <w:color w:val="2C2C2C"/>
+          <w:sz w:val="17"/>
+          <w:szCs w:val="17"/>
+        </w:rPr>
+        <w:t xml:space="preserve">Target 99–109g today, 4+ meals. Creatine 3–5g with a meal.</w:t>
+      </w:r>
+    </w:p>
+    <w:p>
+      <w:pPr>
+        <w:spacing w:after="100"/>
+      </w:pPr>
+      <w:r>
+        <w:rPr>
+          <w:rFonts w:ascii="Arial" w:cs="Arial" w:eastAsia="Arial" w:hAnsi="Arial"/>
+          <w:b/>
+          <w:bCs/>
+          <w:color w:val="2E7D32"/>
+          <w:sz w:val="17"/>
+          <w:szCs w:val="17"/>
+        </w:rPr>
+        <w:t xml:space="preserve">Warm-Up:  </w:t>
+      </w:r>
+      <w:r>
+        <w:rPr>
+          <w:rFonts w:ascii="Arial" w:cs="Arial" w:eastAsia="Arial" w:hAnsi="Arial"/>
+          <w:color w:val="2C2C2C"/>
+          <w:sz w:val="17"/>
+          <w:szCs w:val="17"/>
+        </w:rPr>
+        <w:t xml:space="preserve">5 min row or bike. 2 rounds: 10 band pull-aparts, 10 scap push-ups, 10 arm circles each direction (both arms).</w:t>
+      </w:r>
+    </w:p>
+    <w:p>
+      <w:pPr>
+        <w:spacing w:after="60" w:before="120"/>
+      </w:pPr>
+      <w:r>
+        <w:rPr>
+          <w:rFonts w:ascii="Arial" w:cs="Arial" w:eastAsia="Arial" w:hAnsi="Arial"/>
+          <w:b/>
+          <w:bCs/>
+          <w:color w:val="E53935"/>
+          <w:sz w:val="17"/>
+          <w:szCs w:val="17"/>
+        </w:rPr>
+        <w:t xml:space="preserve">A — SHOULDER CORRECTIVE — SCAPULAR SET</w:t>
+      </w:r>
+    </w:p>
+    <w:p>
+      <w:pPr>
+        <w:spacing w:after="80"/>
+      </w:pPr>
+      <w:r>
+        <w:rPr>
+          <w:rFonts w:ascii="Arial" w:cs="Arial" w:eastAsia="Arial" w:hAnsi="Arial"/>
+          <w:b/>
+          <w:bCs/>
+          <w:color w:val="E53935"/>
+          <w:sz w:val="17"/>
+          <w:szCs w:val="17"/>
+        </w:rPr>
+        <w:t xml:space="preserve">Why:  </w:t>
+      </w:r>
+      <w:r>
+        <w:rPr>
+          <w:rFonts w:ascii="Arial" w:cs="Arial" w:eastAsia="Arial" w:hAnsi="Arial"/>
+          <w:color w:val="2C2C2C"/>
+          <w:sz w:val="17"/>
+          <w:szCs w:val="17"/>
+        </w:rPr>
+        <w:t xml:space="preserve">Scapular and rotator-cuff preparation before any pressing — the standing rule for every session given the right-shoulder force deficit. Control precedes power: set the shoulder blades first, then load them.</w:t>
       </w:r>
     </w:p>
     <w:tbl>
@@ -11080,6 +10166,550 @@
               <w:bottom w:val="none" w:color="FFFFFF" w:sz="0"/>
               <w:right w:val="none" w:color="FFFFFF" w:sz="0"/>
             </w:tcBorders>
+            <w:shd w:fill="FFEBEE" w:color="auto" w:val="clear"/>
+            <w:tcMar>
+              <w:top w:type="dxa" w:w="40"/>
+              <w:left w:type="dxa" w:w="80"/>
+              <w:bottom w:type="dxa" w:w="40"/>
+              <w:right w:type="dxa" w:w="80"/>
+            </w:tcMar>
+            <w:vAlign w:val="center"/>
+          </w:tcPr>
+          <w:p>
+            <w:pPr>
+              <w:jc w:val="left"/>
+            </w:pPr>
+            <w:r>
+              <w:rPr>
+                <w:rFonts w:ascii="Arial" w:cs="Arial" w:eastAsia="Arial" w:hAnsi="Arial"/>
+                <w:b/>
+                <w:bCs/>
+                <w:color w:val="E53935"/>
+                <w:sz w:val="15"/>
+                <w:szCs w:val="15"/>
+              </w:rPr>
+              <w:t xml:space="preserve">EXERCISE</w:t>
+            </w:r>
+          </w:p>
+        </w:tc>
+        <w:tc>
+          <w:tcPr>
+            <w:tcW w:type="dxa" w:w="380"/>
+            <w:tcBorders>
+              <w:top w:val="none" w:color="FFFFFF" w:sz="0"/>
+              <w:left w:val="none" w:color="FFFFFF" w:sz="0"/>
+              <w:bottom w:val="none" w:color="FFFFFF" w:sz="0"/>
+              <w:right w:val="none" w:color="FFFFFF" w:sz="0"/>
+            </w:tcBorders>
+            <w:shd w:fill="FFEBEE" w:color="auto" w:val="clear"/>
+            <w:tcMar>
+              <w:top w:type="dxa" w:w="40"/>
+              <w:left w:type="dxa" w:w="80"/>
+              <w:bottom w:type="dxa" w:w="40"/>
+              <w:right w:type="dxa" w:w="80"/>
+            </w:tcMar>
+            <w:vAlign w:val="center"/>
+          </w:tcPr>
+          <w:p>
+            <w:pPr>
+              <w:jc w:val="center"/>
+            </w:pPr>
+            <w:r>
+              <w:rPr>
+                <w:rFonts w:ascii="Arial" w:cs="Arial" w:eastAsia="Arial" w:hAnsi="Arial"/>
+                <w:b/>
+                <w:bCs/>
+                <w:color w:val="E53935"/>
+                <w:sz w:val="13"/>
+                <w:szCs w:val="13"/>
+              </w:rPr>
+              <w:t xml:space="preserve">SETS</w:t>
+            </w:r>
+          </w:p>
+        </w:tc>
+        <w:tc>
+          <w:tcPr>
+            <w:tcW w:type="dxa" w:w="420"/>
+            <w:tcBorders>
+              <w:top w:val="none" w:color="FFFFFF" w:sz="0"/>
+              <w:left w:val="none" w:color="FFFFFF" w:sz="0"/>
+              <w:bottom w:val="none" w:color="FFFFFF" w:sz="0"/>
+              <w:right w:val="none" w:color="FFFFFF" w:sz="0"/>
+            </w:tcBorders>
+            <w:shd w:fill="FFEBEE" w:color="auto" w:val="clear"/>
+            <w:tcMar>
+              <w:top w:type="dxa" w:w="40"/>
+              <w:left w:type="dxa" w:w="80"/>
+              <w:bottom w:type="dxa" w:w="40"/>
+              <w:right w:type="dxa" w:w="80"/>
+            </w:tcMar>
+            <w:vAlign w:val="center"/>
+          </w:tcPr>
+          <w:p>
+            <w:pPr>
+              <w:jc w:val="center"/>
+            </w:pPr>
+            <w:r>
+              <w:rPr>
+                <w:rFonts w:ascii="Arial" w:cs="Arial" w:eastAsia="Arial" w:hAnsi="Arial"/>
+                <w:b/>
+                <w:bCs/>
+                <w:color w:val="E53935"/>
+                <w:sz w:val="13"/>
+                <w:szCs w:val="13"/>
+              </w:rPr>
+              <w:t xml:space="preserve">REPS</w:t>
+            </w:r>
+          </w:p>
+        </w:tc>
+        <w:tc>
+          <w:tcPr>
+            <w:tcW w:type="dxa" w:w="680"/>
+            <w:tcBorders>
+              <w:top w:val="none" w:color="FFFFFF" w:sz="0"/>
+              <w:left w:val="none" w:color="FFFFFF" w:sz="0"/>
+              <w:bottom w:val="none" w:color="FFFFFF" w:sz="0"/>
+              <w:right w:val="none" w:color="FFFFFF" w:sz="0"/>
+            </w:tcBorders>
+            <w:shd w:fill="FFEBEE" w:color="auto" w:val="clear"/>
+            <w:tcMar>
+              <w:top w:type="dxa" w:w="40"/>
+              <w:left w:type="dxa" w:w="80"/>
+              <w:bottom w:type="dxa" w:w="40"/>
+              <w:right w:type="dxa" w:w="80"/>
+            </w:tcMar>
+            <w:vAlign w:val="center"/>
+          </w:tcPr>
+          <w:p>
+            <w:pPr>
+              <w:jc w:val="center"/>
+            </w:pPr>
+            <w:r>
+              <w:rPr>
+                <w:rFonts w:ascii="Arial" w:cs="Arial" w:eastAsia="Arial" w:hAnsi="Arial"/>
+                <w:b/>
+                <w:bCs/>
+                <w:color w:val="E53935"/>
+                <w:sz w:val="13"/>
+                <w:szCs w:val="13"/>
+              </w:rPr>
+              <w:t xml:space="preserve">LOAD</w:t>
+            </w:r>
+          </w:p>
+        </w:tc>
+        <w:tc>
+          <w:tcPr>
+            <w:tcW w:type="dxa" w:w="540"/>
+            <w:tcBorders>
+              <w:top w:val="none" w:color="FFFFFF" w:sz="0"/>
+              <w:left w:val="none" w:color="FFFFFF" w:sz="0"/>
+              <w:bottom w:val="none" w:color="FFFFFF" w:sz="0"/>
+              <w:right w:val="none" w:color="FFFFFF" w:sz="0"/>
+            </w:tcBorders>
+            <w:shd w:fill="FFEBEE" w:color="auto" w:val="clear"/>
+            <w:tcMar>
+              <w:top w:type="dxa" w:w="40"/>
+              <w:left w:type="dxa" w:w="80"/>
+              <w:bottom w:type="dxa" w:w="40"/>
+              <w:right w:type="dxa" w:w="80"/>
+            </w:tcMar>
+            <w:vAlign w:val="center"/>
+          </w:tcPr>
+          <w:p>
+            <w:pPr>
+              <w:jc w:val="center"/>
+            </w:pPr>
+            <w:r>
+              <w:rPr>
+                <w:rFonts w:ascii="Arial" w:cs="Arial" w:eastAsia="Arial" w:hAnsi="Arial"/>
+                <w:b/>
+                <w:bCs/>
+                <w:color w:val="E53935"/>
+                <w:sz w:val="13"/>
+                <w:szCs w:val="13"/>
+              </w:rPr>
+              <w:t xml:space="preserve">TEMPO</w:t>
+            </w:r>
+          </w:p>
+        </w:tc>
+        <w:tc>
+          <w:tcPr>
+            <w:tcW w:type="dxa" w:w="440"/>
+            <w:tcBorders>
+              <w:top w:val="none" w:color="FFFFFF" w:sz="0"/>
+              <w:left w:val="none" w:color="FFFFFF" w:sz="0"/>
+              <w:bottom w:val="none" w:color="FFFFFF" w:sz="0"/>
+              <w:right w:val="none" w:color="FFFFFF" w:sz="0"/>
+            </w:tcBorders>
+            <w:shd w:fill="FFEBEE" w:color="auto" w:val="clear"/>
+            <w:tcMar>
+              <w:top w:type="dxa" w:w="40"/>
+              <w:left w:type="dxa" w:w="80"/>
+              <w:bottom w:type="dxa" w:w="40"/>
+              <w:right w:type="dxa" w:w="80"/>
+            </w:tcMar>
+            <w:vAlign w:val="center"/>
+          </w:tcPr>
+          <w:p>
+            <w:pPr>
+              <w:jc w:val="center"/>
+            </w:pPr>
+            <w:r>
+              <w:rPr>
+                <w:rFonts w:ascii="Arial" w:cs="Arial" w:eastAsia="Arial" w:hAnsi="Arial"/>
+                <w:b/>
+                <w:bCs/>
+                <w:color w:val="E53935"/>
+                <w:sz w:val="13"/>
+                <w:szCs w:val="13"/>
+              </w:rPr>
+              <w:t xml:space="preserve">REST</w:t>
+            </w:r>
+          </w:p>
+        </w:tc>
+        <w:tc>
+          <w:tcPr>
+            <w:tcW w:type="dxa" w:w="5580"/>
+            <w:tcBorders>
+              <w:top w:val="none" w:color="FFFFFF" w:sz="0"/>
+              <w:left w:val="none" w:color="FFFFFF" w:sz="0"/>
+              <w:bottom w:val="none" w:color="FFFFFF" w:sz="0"/>
+              <w:right w:val="none" w:color="FFFFFF" w:sz="0"/>
+            </w:tcBorders>
+            <w:shd w:fill="FFEBEE" w:color="auto" w:val="clear"/>
+            <w:tcMar>
+              <w:top w:type="dxa" w:w="40"/>
+              <w:left w:type="dxa" w:w="80"/>
+              <w:bottom w:type="dxa" w:w="40"/>
+              <w:right w:type="dxa" w:w="80"/>
+            </w:tcMar>
+            <w:vAlign w:val="center"/>
+          </w:tcPr>
+          <w:p>
+            <w:pPr>
+              <w:jc w:val="left"/>
+            </w:pPr>
+            <w:r>
+              <w:rPr>
+                <w:rFonts w:ascii="Arial" w:cs="Arial" w:eastAsia="Arial" w:hAnsi="Arial"/>
+                <w:b/>
+                <w:bCs/>
+                <w:color w:val="E53935"/>
+                <w:sz w:val="15"/>
+                <w:szCs w:val="15"/>
+              </w:rPr>
+              <w:t xml:space="preserve">COACHING CUE</w:t>
+            </w:r>
+          </w:p>
+        </w:tc>
+      </w:tr>
+      <w:tr>
+        <w:tc>
+          <w:tcPr>
+            <w:tcW w:type="dxa" w:w="2400"/>
+            <w:tcBorders>
+              <w:top w:val="none" w:color="FFFFFF" w:sz="0"/>
+              <w:left w:val="none" w:color="FFFFFF" w:sz="0"/>
+              <w:bottom w:val="none" w:color="FFFFFF" w:sz="0"/>
+              <w:right w:val="none" w:color="FFFFFF" w:sz="0"/>
+            </w:tcBorders>
+            <w:shd w:fill="FFF5F5" w:color="auto" w:val="clear"/>
+            <w:tcMar>
+              <w:top w:type="dxa" w:w="40"/>
+              <w:left w:type="dxa" w:w="80"/>
+              <w:bottom w:type="dxa" w:w="40"/>
+              <w:right w:type="dxa" w:w="80"/>
+            </w:tcMar>
+            <w:vAlign w:val="center"/>
+          </w:tcPr>
+          <w:p>
+            <w:r>
+              <w:rPr>
+                <w:rFonts w:ascii="Arial" w:cs="Arial" w:eastAsia="Arial" w:hAnsi="Arial"/>
+                <w:b/>
+                <w:bCs/>
+                <w:color w:val="2C2C2C"/>
+                <w:sz w:val="18"/>
+                <w:szCs w:val="18"/>
+              </w:rPr>
+              <w:t xml:space="preserve">Band Pull-Apart</w:t>
+            </w:r>
+          </w:p>
+        </w:tc>
+        <w:tc>
+          <w:tcPr>
+            <w:tcW w:type="dxa" w:w="380"/>
+            <w:tcBorders>
+              <w:top w:val="none" w:color="FFFFFF" w:sz="0"/>
+              <w:left w:val="none" w:color="FFFFFF" w:sz="0"/>
+              <w:bottom w:val="none" w:color="FFFFFF" w:sz="0"/>
+              <w:right w:val="none" w:color="FFFFFF" w:sz="0"/>
+            </w:tcBorders>
+            <w:shd w:fill="FFF5F5" w:color="auto" w:val="clear"/>
+            <w:tcMar>
+              <w:top w:type="dxa" w:w="40"/>
+              <w:left w:type="dxa" w:w="80"/>
+              <w:bottom w:type="dxa" w:w="40"/>
+              <w:right w:type="dxa" w:w="80"/>
+            </w:tcMar>
+            <w:vAlign w:val="center"/>
+          </w:tcPr>
+          <w:p>
+            <w:pPr>
+              <w:jc w:val="center"/>
+            </w:pPr>
+            <w:r>
+              <w:rPr>
+                <w:rFonts w:ascii="Arial" w:cs="Arial" w:eastAsia="Arial" w:hAnsi="Arial"/>
+                <w:color w:val="6B6B6B"/>
+                <w:sz w:val="15"/>
+                <w:szCs w:val="15"/>
+              </w:rPr>
+              <w:t xml:space="preserve">2</w:t>
+            </w:r>
+          </w:p>
+        </w:tc>
+        <w:tc>
+          <w:tcPr>
+            <w:tcW w:type="dxa" w:w="420"/>
+            <w:tcBorders>
+              <w:top w:val="none" w:color="FFFFFF" w:sz="0"/>
+              <w:left w:val="none" w:color="FFFFFF" w:sz="0"/>
+              <w:bottom w:val="none" w:color="FFFFFF" w:sz="0"/>
+              <w:right w:val="none" w:color="FFFFFF" w:sz="0"/>
+            </w:tcBorders>
+            <w:shd w:fill="FFF5F5" w:color="auto" w:val="clear"/>
+            <w:tcMar>
+              <w:top w:type="dxa" w:w="40"/>
+              <w:left w:type="dxa" w:w="80"/>
+              <w:bottom w:type="dxa" w:w="40"/>
+              <w:right w:type="dxa" w:w="80"/>
+            </w:tcMar>
+            <w:vAlign w:val="center"/>
+          </w:tcPr>
+          <w:p>
+            <w:pPr>
+              <w:jc w:val="center"/>
+            </w:pPr>
+            <w:r>
+              <w:rPr>
+                <w:rFonts w:ascii="Arial" w:cs="Arial" w:eastAsia="Arial" w:hAnsi="Arial"/>
+                <w:color w:val="6B6B6B"/>
+                <w:sz w:val="15"/>
+                <w:szCs w:val="15"/>
+              </w:rPr>
+              <w:t xml:space="preserve">12–15</w:t>
+            </w:r>
+          </w:p>
+        </w:tc>
+        <w:tc>
+          <w:tcPr>
+            <w:tcW w:type="dxa" w:w="680"/>
+            <w:tcBorders>
+              <w:top w:val="none" w:color="FFFFFF" w:sz="0"/>
+              <w:left w:val="none" w:color="FFFFFF" w:sz="0"/>
+              <w:bottom w:val="none" w:color="FFFFFF" w:sz="0"/>
+              <w:right w:val="none" w:color="FFFFFF" w:sz="0"/>
+            </w:tcBorders>
+            <w:shd w:fill="FFF5F5" w:color="auto" w:val="clear"/>
+            <w:tcMar>
+              <w:top w:type="dxa" w:w="40"/>
+              <w:left w:type="dxa" w:w="80"/>
+              <w:bottom w:type="dxa" w:w="40"/>
+              <w:right w:type="dxa" w:w="80"/>
+            </w:tcMar>
+            <w:vAlign w:val="center"/>
+          </w:tcPr>
+          <w:p>
+            <w:pPr>
+              <w:jc w:val="center"/>
+            </w:pPr>
+            <w:r>
+              <w:rPr>
+                <w:rFonts w:ascii="Arial" w:cs="Arial" w:eastAsia="Arial" w:hAnsi="Arial"/>
+                <w:color w:val="6B6B6B"/>
+                <w:sz w:val="15"/>
+                <w:szCs w:val="15"/>
+              </w:rPr>
+              <w:t xml:space="preserve">Light band</w:t>
+            </w:r>
+          </w:p>
+        </w:tc>
+        <w:tc>
+          <w:tcPr>
+            <w:tcW w:type="dxa" w:w="540"/>
+            <w:tcBorders>
+              <w:top w:val="none" w:color="FFFFFF" w:sz="0"/>
+              <w:left w:val="none" w:color="FFFFFF" w:sz="0"/>
+              <w:bottom w:val="none" w:color="FFFFFF" w:sz="0"/>
+              <w:right w:val="none" w:color="FFFFFF" w:sz="0"/>
+            </w:tcBorders>
+            <w:shd w:fill="FFF5F5" w:color="auto" w:val="clear"/>
+            <w:tcMar>
+              <w:top w:type="dxa" w:w="40"/>
+              <w:left w:type="dxa" w:w="80"/>
+              <w:bottom w:type="dxa" w:w="40"/>
+              <w:right w:type="dxa" w:w="80"/>
+            </w:tcMar>
+            <w:vAlign w:val="center"/>
+          </w:tcPr>
+          <w:p>
+            <w:pPr>
+              <w:jc w:val="center"/>
+            </w:pPr>
+            <w:r>
+              <w:rPr>
+                <w:rFonts w:ascii="Arial" w:cs="Arial" w:eastAsia="Arial" w:hAnsi="Arial"/>
+                <w:color w:val="6B6B6B"/>
+                <w:sz w:val="15"/>
+                <w:szCs w:val="15"/>
+              </w:rPr>
+              <w:t xml:space="preserve">2-1-2</w:t>
+            </w:r>
+          </w:p>
+        </w:tc>
+        <w:tc>
+          <w:tcPr>
+            <w:tcW w:type="dxa" w:w="440"/>
+            <w:tcBorders>
+              <w:top w:val="none" w:color="FFFFFF" w:sz="0"/>
+              <w:left w:val="none" w:color="FFFFFF" w:sz="0"/>
+              <w:bottom w:val="none" w:color="FFFFFF" w:sz="0"/>
+              <w:right w:val="none" w:color="FFFFFF" w:sz="0"/>
+            </w:tcBorders>
+            <w:shd w:fill="FFF5F5" w:color="auto" w:val="clear"/>
+            <w:tcMar>
+              <w:top w:type="dxa" w:w="40"/>
+              <w:left w:type="dxa" w:w="80"/>
+              <w:bottom w:type="dxa" w:w="40"/>
+              <w:right w:type="dxa" w:w="80"/>
+            </w:tcMar>
+            <w:vAlign w:val="center"/>
+          </w:tcPr>
+          <w:p>
+            <w:pPr>
+              <w:jc w:val="center"/>
+            </w:pPr>
+            <w:r>
+              <w:rPr>
+                <w:rFonts w:ascii="Arial" w:cs="Arial" w:eastAsia="Arial" w:hAnsi="Arial"/>
+                <w:color w:val="6B6B6B"/>
+                <w:sz w:val="15"/>
+                <w:szCs w:val="15"/>
+              </w:rPr>
+              <w:t xml:space="preserve">45s</w:t>
+            </w:r>
+          </w:p>
+        </w:tc>
+        <w:tc>
+          <w:tcPr>
+            <w:tcW w:type="dxa" w:w="5580"/>
+            <w:tcBorders>
+              <w:top w:val="none" w:color="FFFFFF" w:sz="0"/>
+              <w:left w:val="none" w:color="FFFFFF" w:sz="0"/>
+              <w:bottom w:val="none" w:color="FFFFFF" w:sz="0"/>
+              <w:right w:val="none" w:color="FFFFFF" w:sz="0"/>
+            </w:tcBorders>
+            <w:shd w:fill="FFF5F5" w:color="auto" w:val="clear"/>
+            <w:tcMar>
+              <w:top w:type="dxa" w:w="40"/>
+              <w:left w:type="dxa" w:w="80"/>
+              <w:bottom w:type="dxa" w:w="40"/>
+              <w:right w:type="dxa" w:w="80"/>
+            </w:tcMar>
+            <w:vAlign w:val="center"/>
+          </w:tcPr>
+          <w:p>
+            <w:r>
+              <w:rPr>
+                <w:rFonts w:ascii="Arial" w:cs="Arial" w:eastAsia="Arial" w:hAnsi="Arial"/>
+                <w:color w:val="6B6B6B"/>
+                <w:sz w:val="17"/>
+                <w:szCs w:val="17"/>
+              </w:rPr>
+              <w:t xml:space="preserve">Squeeze shoulder blades, control the return.</w:t>
+            </w:r>
+          </w:p>
+        </w:tc>
+      </w:tr>
+    </w:tbl>
+    <w:p>
+      <w:pPr>
+        <w:spacing w:after="100"/>
+      </w:pPr>
+    </w:p>
+    <w:p>
+      <w:pPr>
+        <w:spacing w:after="60" w:before="120"/>
+      </w:pPr>
+      <w:r>
+        <w:rPr>
+          <w:rFonts w:ascii="Arial" w:cs="Arial" w:eastAsia="Arial" w:hAnsi="Arial"/>
+          <w:b/>
+          <w:bCs/>
+          <w:color w:val="C9A227"/>
+          <w:sz w:val="17"/>
+          <w:szCs w:val="17"/>
+        </w:rPr>
+        <w:t xml:space="preserve">B — PRIMARY COMPOUND — SEATED OH PRESS</w:t>
+      </w:r>
+    </w:p>
+    <w:p>
+      <w:pPr>
+        <w:spacing w:after="80"/>
+      </w:pPr>
+      <w:r>
+        <w:rPr>
+          <w:rFonts w:ascii="Arial" w:cs="Arial" w:eastAsia="Arial" w:hAnsi="Arial"/>
+          <w:b/>
+          <w:bCs/>
+          <w:color w:val="C9A227"/>
+          <w:sz w:val="17"/>
+          <w:szCs w:val="17"/>
+        </w:rPr>
+        <w:t xml:space="preserve">Shoulder Note:  </w:t>
+      </w:r>
+      <w:r>
+        <w:rPr>
+          <w:rFonts w:ascii="Arial" w:cs="Arial" w:eastAsia="Arial" w:hAnsi="Arial"/>
+          <w:color w:val="2C2C2C"/>
+          <w:sz w:val="17"/>
+          <w:szCs w:val="17"/>
+        </w:rPr>
+        <w:t xml:space="preserve">Right shoulder leads every set at a reduced, controlled load — see clinical flag on page 1. If the day calls for a press variation, rotate between: a half-kneeling single-arm DB press (right arm leads, reduced load) or a landmine press (the shoulder-friendly arc) — both live inside the same controlled-load rule, and heavy bilateral overhead loading stays off the menu until the deficit is reassessed. The seated press stays the movement we track.</w:t>
+      </w:r>
+    </w:p>
+    <w:tbl>
+      <w:tblPr>
+        <w:tblW w:type="dxa" w:w="10440"/>
+        <w:tblBorders>
+          <w:top w:val="none" w:color="FFFFFF" w:sz="0"/>
+          <w:left w:val="none" w:color="FFFFFF" w:sz="0"/>
+          <w:bottom w:val="none" w:color="FFFFFF" w:sz="0"/>
+          <w:right w:val="none" w:color="FFFFFF" w:sz="0"/>
+          <w:insideH w:val="single" w:color="auto" w:sz="4"/>
+          <w:insideV w:val="single" w:color="auto" w:sz="4"/>
+        </w:tblBorders>
+      </w:tblPr>
+      <w:tblGrid>
+        <w:gridCol w:w="2400"/>
+        <w:gridCol w:w="380"/>
+        <w:gridCol w:w="420"/>
+        <w:gridCol w:w="680"/>
+        <w:gridCol w:w="540"/>
+        <w:gridCol w:w="440"/>
+        <w:gridCol w:w="5580"/>
+      </w:tblGrid>
+      <w:tr>
+        <w:tc>
+          <w:tcPr>
+            <w:tcW w:type="dxa" w:w="2400"/>
+            <w:tcBorders>
+              <w:top w:val="none" w:color="FFFFFF" w:sz="0"/>
+              <w:left w:val="none" w:color="FFFFFF" w:sz="0"/>
+              <w:bottom w:val="none" w:color="FFFFFF" w:sz="0"/>
+              <w:right w:val="none" w:color="FFFFFF" w:sz="0"/>
+            </w:tcBorders>
             <w:shd w:fill="F5E8C0" w:color="auto" w:val="clear"/>
             <w:tcMar>
               <w:top w:type="dxa" w:w="40"/>
@@ -11346,7 +10976,20 @@
                 <w:sz w:val="18"/>
                 <w:szCs w:val="18"/>
               </w:rPr>
-              <w:t xml:space="preserve">DB Farmer Carry</w:t>
+              <w:t xml:space="preserve">Seated DB OH Press</w:t>
+            </w:r>
+          </w:p>
+          <w:p>
+            <w:r>
+              <w:rPr>
+                <w:rFonts w:ascii="Arial" w:cs="Arial" w:eastAsia="Arial" w:hAnsi="Arial"/>
+                <w:i/>
+                <w:iCs/>
+                <w:color w:val="B71C1C"/>
+                <w:sz w:val="14"/>
+                <w:szCs w:val="14"/>
+              </w:rPr>
+              <w:t xml:space="preserve">Right shoulder leads at reduced load — strict tempo.</w:t>
             </w:r>
           </w:p>
         </w:tc>
@@ -11412,7 +11055,7 @@
                 <w:sz w:val="15"/>
                 <w:szCs w:val="15"/>
               </w:rPr>
-              <w:t xml:space="preserve">25 yd each hand</w:t>
+              <w:t xml:space="preserve">5</w:t>
             </w:r>
           </w:p>
         </w:tc>
@@ -11445,7 +11088,7 @@
                 <w:sz w:val="15"/>
                 <w:szCs w:val="15"/>
               </w:rPr>
-              <w:t xml:space="preserve">25–27.5 lb</w:t>
+              <w:t xml:space="preserve">12–13 lb</w:t>
             </w:r>
           </w:p>
         </w:tc>
@@ -11478,7 +11121,7 @@
                 <w:sz w:val="15"/>
                 <w:szCs w:val="15"/>
               </w:rPr>
-              <w:t xml:space="preserve">—</w:t>
+              <w:t xml:space="preserve">2-0-2</w:t>
             </w:r>
           </w:p>
         </w:tc>
@@ -11511,7 +11154,7 @@
                 <w:sz w:val="15"/>
                 <w:szCs w:val="15"/>
               </w:rPr>
-              <w:t xml:space="preserve">60s</w:t>
+              <w:t xml:space="preserve">90s</w:t>
             </w:r>
           </w:p>
         </w:tc>
@@ -11541,7 +11184,1696 @@
                 <w:sz w:val="17"/>
                 <w:szCs w:val="17"/>
               </w:rPr>
+              <w:t xml:space="preserve">Right arm first. Ribs down, straight overhead path.</w:t>
+            </w:r>
+            <w:r>
+              <w:rPr>
+                <w:rFonts w:ascii="Arial" w:cs="Arial" w:eastAsia="Arial" w:hAnsi="Arial"/>
+                <w:i/>
+                <w:iCs/>
+                <w:color w:val="00695C"/>
+                <w:sz w:val="14"/>
+                <w:szCs w:val="14"/>
+              </w:rPr>
+              <w:t xml:space="preserve">  2 RIR</w:t>
+            </w:r>
+          </w:p>
+        </w:tc>
+      </w:tr>
+    </w:tbl>
+    <w:p>
+      <w:pPr>
+        <w:spacing w:after="100"/>
+      </w:pPr>
+    </w:p>
+    <w:p>
+      <w:pPr>
+        <w:spacing w:after="60" w:before="120"/>
+      </w:pPr>
+      <w:r>
+        <w:rPr>
+          <w:rFonts w:ascii="Arial" w:cs="Arial" w:eastAsia="Arial" w:hAnsi="Arial"/>
+          <w:b/>
+          <w:bCs/>
+          <w:color w:val="C9A227"/>
+          <w:sz w:val="17"/>
+          <w:szCs w:val="17"/>
+        </w:rPr>
+        <w:t xml:space="preserve">C — ACCESSORY — INCLINE PUSH-UP</w:t>
+      </w:r>
+    </w:p>
+    <w:p>
+      <w:pPr>
+        <w:spacing w:after="80"/>
+      </w:pPr>
+      <w:r>
+        <w:rPr>
+          <w:rFonts w:ascii="Arial" w:cs="Arial" w:eastAsia="Arial" w:hAnsi="Arial"/>
+          <w:b/>
+          <w:bCs/>
+          <w:color w:val="C9A227"/>
+          <w:sz w:val="17"/>
+          <w:szCs w:val="17"/>
+        </w:rPr>
+        <w:t xml:space="preserve">Load Target:  </w:t>
+      </w:r>
+      <w:r>
+        <w:rPr>
+          <w:rFonts w:ascii="Arial" w:cs="Arial" w:eastAsia="Arial" w:hAnsi="Arial"/>
+          <w:color w:val="2C2C2C"/>
+          <w:sz w:val="17"/>
+          <w:szCs w:val="17"/>
+        </w:rPr>
+        <w:t xml:space="preserve">The muscle-building press accessory behind the day's primary — worked hard in a controlled, non-overhead range that respects the shoulder protocol.</w:t>
+      </w:r>
+    </w:p>
+    <w:tbl>
+      <w:tblPr>
+        <w:tblW w:type="dxa" w:w="10440"/>
+        <w:tblBorders>
+          <w:top w:val="none" w:color="FFFFFF" w:sz="0"/>
+          <w:left w:val="none" w:color="FFFFFF" w:sz="0"/>
+          <w:bottom w:val="none" w:color="FFFFFF" w:sz="0"/>
+          <w:right w:val="none" w:color="FFFFFF" w:sz="0"/>
+          <w:insideH w:val="single" w:color="auto" w:sz="4"/>
+          <w:insideV w:val="single" w:color="auto" w:sz="4"/>
+        </w:tblBorders>
+      </w:tblPr>
+      <w:tblGrid>
+        <w:gridCol w:w="2400"/>
+        <w:gridCol w:w="380"/>
+        <w:gridCol w:w="420"/>
+        <w:gridCol w:w="680"/>
+        <w:gridCol w:w="540"/>
+        <w:gridCol w:w="440"/>
+        <w:gridCol w:w="5580"/>
+      </w:tblGrid>
+      <w:tr>
+        <w:tc>
+          <w:tcPr>
+            <w:tcW w:type="dxa" w:w="2400"/>
+            <w:tcBorders>
+              <w:top w:val="none" w:color="FFFFFF" w:sz="0"/>
+              <w:left w:val="none" w:color="FFFFFF" w:sz="0"/>
+              <w:bottom w:val="none" w:color="FFFFFF" w:sz="0"/>
+              <w:right w:val="none" w:color="FFFFFF" w:sz="0"/>
+            </w:tcBorders>
+            <w:shd w:fill="F5E8C0" w:color="auto" w:val="clear"/>
+            <w:tcMar>
+              <w:top w:type="dxa" w:w="40"/>
+              <w:left w:type="dxa" w:w="80"/>
+              <w:bottom w:type="dxa" w:w="40"/>
+              <w:right w:type="dxa" w:w="80"/>
+            </w:tcMar>
+            <w:vAlign w:val="center"/>
+          </w:tcPr>
+          <w:p>
+            <w:pPr>
+              <w:jc w:val="left"/>
+            </w:pPr>
+            <w:r>
+              <w:rPr>
+                <w:rFonts w:ascii="Arial" w:cs="Arial" w:eastAsia="Arial" w:hAnsi="Arial"/>
+                <w:b/>
+                <w:bCs/>
+                <w:color w:val="C9A227"/>
+                <w:sz w:val="15"/>
+                <w:szCs w:val="15"/>
+              </w:rPr>
+              <w:t xml:space="preserve">EXERCISE</w:t>
+            </w:r>
+          </w:p>
+        </w:tc>
+        <w:tc>
+          <w:tcPr>
+            <w:tcW w:type="dxa" w:w="380"/>
+            <w:tcBorders>
+              <w:top w:val="none" w:color="FFFFFF" w:sz="0"/>
+              <w:left w:val="none" w:color="FFFFFF" w:sz="0"/>
+              <w:bottom w:val="none" w:color="FFFFFF" w:sz="0"/>
+              <w:right w:val="none" w:color="FFFFFF" w:sz="0"/>
+            </w:tcBorders>
+            <w:shd w:fill="F5E8C0" w:color="auto" w:val="clear"/>
+            <w:tcMar>
+              <w:top w:type="dxa" w:w="40"/>
+              <w:left w:type="dxa" w:w="80"/>
+              <w:bottom w:type="dxa" w:w="40"/>
+              <w:right w:type="dxa" w:w="80"/>
+            </w:tcMar>
+            <w:vAlign w:val="center"/>
+          </w:tcPr>
+          <w:p>
+            <w:pPr>
+              <w:jc w:val="center"/>
+            </w:pPr>
+            <w:r>
+              <w:rPr>
+                <w:rFonts w:ascii="Arial" w:cs="Arial" w:eastAsia="Arial" w:hAnsi="Arial"/>
+                <w:b/>
+                <w:bCs/>
+                <w:color w:val="C9A227"/>
+                <w:sz w:val="13"/>
+                <w:szCs w:val="13"/>
+              </w:rPr>
+              <w:t xml:space="preserve">SETS</w:t>
+            </w:r>
+          </w:p>
+        </w:tc>
+        <w:tc>
+          <w:tcPr>
+            <w:tcW w:type="dxa" w:w="420"/>
+            <w:tcBorders>
+              <w:top w:val="none" w:color="FFFFFF" w:sz="0"/>
+              <w:left w:val="none" w:color="FFFFFF" w:sz="0"/>
+              <w:bottom w:val="none" w:color="FFFFFF" w:sz="0"/>
+              <w:right w:val="none" w:color="FFFFFF" w:sz="0"/>
+            </w:tcBorders>
+            <w:shd w:fill="F5E8C0" w:color="auto" w:val="clear"/>
+            <w:tcMar>
+              <w:top w:type="dxa" w:w="40"/>
+              <w:left w:type="dxa" w:w="80"/>
+              <w:bottom w:type="dxa" w:w="40"/>
+              <w:right w:type="dxa" w:w="80"/>
+            </w:tcMar>
+            <w:vAlign w:val="center"/>
+          </w:tcPr>
+          <w:p>
+            <w:pPr>
+              <w:jc w:val="center"/>
+            </w:pPr>
+            <w:r>
+              <w:rPr>
+                <w:rFonts w:ascii="Arial" w:cs="Arial" w:eastAsia="Arial" w:hAnsi="Arial"/>
+                <w:b/>
+                <w:bCs/>
+                <w:color w:val="C9A227"/>
+                <w:sz w:val="13"/>
+                <w:szCs w:val="13"/>
+              </w:rPr>
+              <w:t xml:space="preserve">REPS</w:t>
+            </w:r>
+          </w:p>
+        </w:tc>
+        <w:tc>
+          <w:tcPr>
+            <w:tcW w:type="dxa" w:w="680"/>
+            <w:tcBorders>
+              <w:top w:val="none" w:color="FFFFFF" w:sz="0"/>
+              <w:left w:val="none" w:color="FFFFFF" w:sz="0"/>
+              <w:bottom w:val="none" w:color="FFFFFF" w:sz="0"/>
+              <w:right w:val="none" w:color="FFFFFF" w:sz="0"/>
+            </w:tcBorders>
+            <w:shd w:fill="F5E8C0" w:color="auto" w:val="clear"/>
+            <w:tcMar>
+              <w:top w:type="dxa" w:w="40"/>
+              <w:left w:type="dxa" w:w="80"/>
+              <w:bottom w:type="dxa" w:w="40"/>
+              <w:right w:type="dxa" w:w="80"/>
+            </w:tcMar>
+            <w:vAlign w:val="center"/>
+          </w:tcPr>
+          <w:p>
+            <w:pPr>
+              <w:jc w:val="center"/>
+            </w:pPr>
+            <w:r>
+              <w:rPr>
+                <w:rFonts w:ascii="Arial" w:cs="Arial" w:eastAsia="Arial" w:hAnsi="Arial"/>
+                <w:b/>
+                <w:bCs/>
+                <w:color w:val="C9A227"/>
+                <w:sz w:val="13"/>
+                <w:szCs w:val="13"/>
+              </w:rPr>
+              <w:t xml:space="preserve">LOAD</w:t>
+            </w:r>
+          </w:p>
+        </w:tc>
+        <w:tc>
+          <w:tcPr>
+            <w:tcW w:type="dxa" w:w="540"/>
+            <w:tcBorders>
+              <w:top w:val="none" w:color="FFFFFF" w:sz="0"/>
+              <w:left w:val="none" w:color="FFFFFF" w:sz="0"/>
+              <w:bottom w:val="none" w:color="FFFFFF" w:sz="0"/>
+              <w:right w:val="none" w:color="FFFFFF" w:sz="0"/>
+            </w:tcBorders>
+            <w:shd w:fill="F5E8C0" w:color="auto" w:val="clear"/>
+            <w:tcMar>
+              <w:top w:type="dxa" w:w="40"/>
+              <w:left w:type="dxa" w:w="80"/>
+              <w:bottom w:type="dxa" w:w="40"/>
+              <w:right w:type="dxa" w:w="80"/>
+            </w:tcMar>
+            <w:vAlign w:val="center"/>
+          </w:tcPr>
+          <w:p>
+            <w:pPr>
+              <w:jc w:val="center"/>
+            </w:pPr>
+            <w:r>
+              <w:rPr>
+                <w:rFonts w:ascii="Arial" w:cs="Arial" w:eastAsia="Arial" w:hAnsi="Arial"/>
+                <w:b/>
+                <w:bCs/>
+                <w:color w:val="C9A227"/>
+                <w:sz w:val="13"/>
+                <w:szCs w:val="13"/>
+              </w:rPr>
+              <w:t xml:space="preserve">TEMPO</w:t>
+            </w:r>
+          </w:p>
+        </w:tc>
+        <w:tc>
+          <w:tcPr>
+            <w:tcW w:type="dxa" w:w="440"/>
+            <w:tcBorders>
+              <w:top w:val="none" w:color="FFFFFF" w:sz="0"/>
+              <w:left w:val="none" w:color="FFFFFF" w:sz="0"/>
+              <w:bottom w:val="none" w:color="FFFFFF" w:sz="0"/>
+              <w:right w:val="none" w:color="FFFFFF" w:sz="0"/>
+            </w:tcBorders>
+            <w:shd w:fill="F5E8C0" w:color="auto" w:val="clear"/>
+            <w:tcMar>
+              <w:top w:type="dxa" w:w="40"/>
+              <w:left w:type="dxa" w:w="80"/>
+              <w:bottom w:type="dxa" w:w="40"/>
+              <w:right w:type="dxa" w:w="80"/>
+            </w:tcMar>
+            <w:vAlign w:val="center"/>
+          </w:tcPr>
+          <w:p>
+            <w:pPr>
+              <w:jc w:val="center"/>
+            </w:pPr>
+            <w:r>
+              <w:rPr>
+                <w:rFonts w:ascii="Arial" w:cs="Arial" w:eastAsia="Arial" w:hAnsi="Arial"/>
+                <w:b/>
+                <w:bCs/>
+                <w:color w:val="C9A227"/>
+                <w:sz w:val="13"/>
+                <w:szCs w:val="13"/>
+              </w:rPr>
+              <w:t xml:space="preserve">REST</w:t>
+            </w:r>
+          </w:p>
+        </w:tc>
+        <w:tc>
+          <w:tcPr>
+            <w:tcW w:type="dxa" w:w="5580"/>
+            <w:tcBorders>
+              <w:top w:val="none" w:color="FFFFFF" w:sz="0"/>
+              <w:left w:val="none" w:color="FFFFFF" w:sz="0"/>
+              <w:bottom w:val="none" w:color="FFFFFF" w:sz="0"/>
+              <w:right w:val="none" w:color="FFFFFF" w:sz="0"/>
+            </w:tcBorders>
+            <w:shd w:fill="F5E8C0" w:color="auto" w:val="clear"/>
+            <w:tcMar>
+              <w:top w:type="dxa" w:w="40"/>
+              <w:left w:type="dxa" w:w="80"/>
+              <w:bottom w:type="dxa" w:w="40"/>
+              <w:right w:type="dxa" w:w="80"/>
+            </w:tcMar>
+            <w:vAlign w:val="center"/>
+          </w:tcPr>
+          <w:p>
+            <w:pPr>
+              <w:jc w:val="left"/>
+            </w:pPr>
+            <w:r>
+              <w:rPr>
+                <w:rFonts w:ascii="Arial" w:cs="Arial" w:eastAsia="Arial" w:hAnsi="Arial"/>
+                <w:b/>
+                <w:bCs/>
+                <w:color w:val="C9A227"/>
+                <w:sz w:val="15"/>
+                <w:szCs w:val="15"/>
+              </w:rPr>
+              <w:t xml:space="preserve">COACHING CUE</w:t>
+            </w:r>
+          </w:p>
+        </w:tc>
+      </w:tr>
+      <w:tr>
+        <w:tc>
+          <w:tcPr>
+            <w:tcW w:type="dxa" w:w="2400"/>
+            <w:tcBorders>
+              <w:top w:val="none" w:color="FFFFFF" w:sz="0"/>
+              <w:left w:val="none" w:color="FFFFFF" w:sz="0"/>
+              <w:bottom w:val="none" w:color="FFFFFF" w:sz="0"/>
+              <w:right w:val="none" w:color="FFFFFF" w:sz="0"/>
+            </w:tcBorders>
+            <w:shd w:fill="FAF3E0" w:color="auto" w:val="clear"/>
+            <w:tcMar>
+              <w:top w:type="dxa" w:w="40"/>
+              <w:left w:type="dxa" w:w="80"/>
+              <w:bottom w:type="dxa" w:w="40"/>
+              <w:right w:type="dxa" w:w="80"/>
+            </w:tcMar>
+            <w:vAlign w:val="center"/>
+          </w:tcPr>
+          <w:p>
+            <w:r>
+              <w:rPr>
+                <w:rFonts w:ascii="Arial" w:cs="Arial" w:eastAsia="Arial" w:hAnsi="Arial"/>
+                <w:b/>
+                <w:bCs/>
+                <w:color w:val="2C2C2C"/>
+                <w:sz w:val="18"/>
+                <w:szCs w:val="18"/>
+              </w:rPr>
+              <w:t xml:space="preserve">Incline Push-Up</w:t>
+            </w:r>
+          </w:p>
+        </w:tc>
+        <w:tc>
+          <w:tcPr>
+            <w:tcW w:type="dxa" w:w="380"/>
+            <w:tcBorders>
+              <w:top w:val="none" w:color="FFFFFF" w:sz="0"/>
+              <w:left w:val="none" w:color="FFFFFF" w:sz="0"/>
+              <w:bottom w:val="none" w:color="FFFFFF" w:sz="0"/>
+              <w:right w:val="none" w:color="FFFFFF" w:sz="0"/>
+            </w:tcBorders>
+            <w:shd w:fill="FAF3E0" w:color="auto" w:val="clear"/>
+            <w:tcMar>
+              <w:top w:type="dxa" w:w="40"/>
+              <w:left w:type="dxa" w:w="80"/>
+              <w:bottom w:type="dxa" w:w="40"/>
+              <w:right w:type="dxa" w:w="80"/>
+            </w:tcMar>
+            <w:vAlign w:val="center"/>
+          </w:tcPr>
+          <w:p>
+            <w:pPr>
+              <w:jc w:val="center"/>
+            </w:pPr>
+            <w:r>
+              <w:rPr>
+                <w:rFonts w:ascii="Arial" w:cs="Arial" w:eastAsia="Arial" w:hAnsi="Arial"/>
+                <w:color w:val="6B6B6B"/>
+                <w:sz w:val="15"/>
+                <w:szCs w:val="15"/>
+              </w:rPr>
+              <w:t xml:space="preserve">3</w:t>
+            </w:r>
+          </w:p>
+        </w:tc>
+        <w:tc>
+          <w:tcPr>
+            <w:tcW w:type="dxa" w:w="420"/>
+            <w:tcBorders>
+              <w:top w:val="none" w:color="FFFFFF" w:sz="0"/>
+              <w:left w:val="none" w:color="FFFFFF" w:sz="0"/>
+              <w:bottom w:val="none" w:color="FFFFFF" w:sz="0"/>
+              <w:right w:val="none" w:color="FFFFFF" w:sz="0"/>
+            </w:tcBorders>
+            <w:shd w:fill="FAF3E0" w:color="auto" w:val="clear"/>
+            <w:tcMar>
+              <w:top w:type="dxa" w:w="40"/>
+              <w:left w:type="dxa" w:w="80"/>
+              <w:bottom w:type="dxa" w:w="40"/>
+              <w:right w:type="dxa" w:w="80"/>
+            </w:tcMar>
+            <w:vAlign w:val="center"/>
+          </w:tcPr>
+          <w:p>
+            <w:pPr>
+              <w:jc w:val="center"/>
+            </w:pPr>
+            <w:r>
+              <w:rPr>
+                <w:rFonts w:ascii="Arial" w:cs="Arial" w:eastAsia="Arial" w:hAnsi="Arial"/>
+                <w:color w:val="6B6B6B"/>
+                <w:sz w:val="15"/>
+                <w:szCs w:val="15"/>
+              </w:rPr>
+              <w:t xml:space="preserve">6–8</w:t>
+            </w:r>
+          </w:p>
+        </w:tc>
+        <w:tc>
+          <w:tcPr>
+            <w:tcW w:type="dxa" w:w="680"/>
+            <w:tcBorders>
+              <w:top w:val="none" w:color="FFFFFF" w:sz="0"/>
+              <w:left w:val="none" w:color="FFFFFF" w:sz="0"/>
+              <w:bottom w:val="none" w:color="FFFFFF" w:sz="0"/>
+              <w:right w:val="none" w:color="FFFFFF" w:sz="0"/>
+            </w:tcBorders>
+            <w:shd w:fill="FAF3E0" w:color="auto" w:val="clear"/>
+            <w:tcMar>
+              <w:top w:type="dxa" w:w="40"/>
+              <w:left w:type="dxa" w:w="80"/>
+              <w:bottom w:type="dxa" w:w="40"/>
+              <w:right w:type="dxa" w:w="80"/>
+            </w:tcMar>
+            <w:vAlign w:val="center"/>
+          </w:tcPr>
+          <w:p>
+            <w:pPr>
+              <w:jc w:val="center"/>
+            </w:pPr>
+            <w:r>
+              <w:rPr>
+                <w:rFonts w:ascii="Arial" w:cs="Arial" w:eastAsia="Arial" w:hAnsi="Arial"/>
+                <w:color w:val="6B6B6B"/>
+                <w:sz w:val="15"/>
+                <w:szCs w:val="15"/>
+              </w:rPr>
+              <w:t xml:space="preserve">BW, bench</w:t>
+            </w:r>
+          </w:p>
+        </w:tc>
+        <w:tc>
+          <w:tcPr>
+            <w:tcW w:type="dxa" w:w="540"/>
+            <w:tcBorders>
+              <w:top w:val="none" w:color="FFFFFF" w:sz="0"/>
+              <w:left w:val="none" w:color="FFFFFF" w:sz="0"/>
+              <w:bottom w:val="none" w:color="FFFFFF" w:sz="0"/>
+              <w:right w:val="none" w:color="FFFFFF" w:sz="0"/>
+            </w:tcBorders>
+            <w:shd w:fill="FAF3E0" w:color="auto" w:val="clear"/>
+            <w:tcMar>
+              <w:top w:type="dxa" w:w="40"/>
+              <w:left w:type="dxa" w:w="80"/>
+              <w:bottom w:type="dxa" w:w="40"/>
+              <w:right w:type="dxa" w:w="80"/>
+            </w:tcMar>
+            <w:vAlign w:val="center"/>
+          </w:tcPr>
+          <w:p>
+            <w:pPr>
+              <w:jc w:val="center"/>
+            </w:pPr>
+            <w:r>
+              <w:rPr>
+                <w:rFonts w:ascii="Arial" w:cs="Arial" w:eastAsia="Arial" w:hAnsi="Arial"/>
+                <w:color w:val="6B6B6B"/>
+                <w:sz w:val="15"/>
+                <w:szCs w:val="15"/>
+              </w:rPr>
+              <w:t xml:space="preserve">3-0-1</w:t>
+            </w:r>
+          </w:p>
+        </w:tc>
+        <w:tc>
+          <w:tcPr>
+            <w:tcW w:type="dxa" w:w="440"/>
+            <w:tcBorders>
+              <w:top w:val="none" w:color="FFFFFF" w:sz="0"/>
+              <w:left w:val="none" w:color="FFFFFF" w:sz="0"/>
+              <w:bottom w:val="none" w:color="FFFFFF" w:sz="0"/>
+              <w:right w:val="none" w:color="FFFFFF" w:sz="0"/>
+            </w:tcBorders>
+            <w:shd w:fill="FAF3E0" w:color="auto" w:val="clear"/>
+            <w:tcMar>
+              <w:top w:type="dxa" w:w="40"/>
+              <w:left w:type="dxa" w:w="80"/>
+              <w:bottom w:type="dxa" w:w="40"/>
+              <w:right w:type="dxa" w:w="80"/>
+            </w:tcMar>
+            <w:vAlign w:val="center"/>
+          </w:tcPr>
+          <w:p>
+            <w:pPr>
+              <w:jc w:val="center"/>
+            </w:pPr>
+            <w:r>
+              <w:rPr>
+                <w:rFonts w:ascii="Arial" w:cs="Arial" w:eastAsia="Arial" w:hAnsi="Arial"/>
+                <w:color w:val="6B6B6B"/>
+                <w:sz w:val="15"/>
+                <w:szCs w:val="15"/>
+              </w:rPr>
+              <w:t xml:space="preserve">60s</w:t>
+            </w:r>
+          </w:p>
+        </w:tc>
+        <w:tc>
+          <w:tcPr>
+            <w:tcW w:type="dxa" w:w="5580"/>
+            <w:tcBorders>
+              <w:top w:val="none" w:color="FFFFFF" w:sz="0"/>
+              <w:left w:val="none" w:color="FFFFFF" w:sz="0"/>
+              <w:bottom w:val="none" w:color="FFFFFF" w:sz="0"/>
+              <w:right w:val="none" w:color="FFFFFF" w:sz="0"/>
+            </w:tcBorders>
+            <w:shd w:fill="FAF3E0" w:color="auto" w:val="clear"/>
+            <w:tcMar>
+              <w:top w:type="dxa" w:w="40"/>
+              <w:left w:type="dxa" w:w="80"/>
+              <w:bottom w:type="dxa" w:w="40"/>
+              <w:right w:type="dxa" w:w="80"/>
+            </w:tcMar>
+            <w:vAlign w:val="center"/>
+          </w:tcPr>
+          <w:p>
+            <w:r>
+              <w:rPr>
+                <w:rFonts w:ascii="Arial" w:cs="Arial" w:eastAsia="Arial" w:hAnsi="Arial"/>
+                <w:color w:val="6B6B6B"/>
+                <w:sz w:val="17"/>
+                <w:szCs w:val="17"/>
+              </w:rPr>
+              <w:t xml:space="preserve">Lower bench height only if form holds clean.</w:t>
+            </w:r>
+            <w:r>
+              <w:rPr>
+                <w:rFonts w:ascii="Arial" w:cs="Arial" w:eastAsia="Arial" w:hAnsi="Arial"/>
+                <w:i/>
+                <w:iCs/>
+                <w:color w:val="00695C"/>
+                <w:sz w:val="14"/>
+                <w:szCs w:val="14"/>
+              </w:rPr>
+              <w:t xml:space="preserve">  1 RIR</w:t>
+            </w:r>
+          </w:p>
+        </w:tc>
+      </w:tr>
+    </w:tbl>
+    <w:p>
+      <w:pPr>
+        <w:spacing w:after="100"/>
+      </w:pPr>
+    </w:p>
+    <w:p>
+      <w:pPr>
+        <w:spacing w:after="60" w:before="120"/>
+      </w:pPr>
+      <w:r>
+        <w:rPr>
+          <w:rFonts w:ascii="Arial" w:cs="Arial" w:eastAsia="Arial" w:hAnsi="Arial"/>
+          <w:b/>
+          <w:bCs/>
+          <w:color w:val="C9A227"/>
+          <w:sz w:val="17"/>
+          <w:szCs w:val="17"/>
+        </w:rPr>
+        <w:t xml:space="preserve">D — SECONDARY COMPOUND — SINGLE-ARM ROW</w:t>
+      </w:r>
+    </w:p>
+    <w:p>
+      <w:pPr>
+        <w:spacing w:after="80"/>
+      </w:pPr>
+      <w:r>
+        <w:rPr>
+          <w:rFonts w:ascii="Arial" w:cs="Arial" w:eastAsia="Arial" w:hAnsi="Arial"/>
+          <w:b/>
+          <w:bCs/>
+          <w:color w:val="C9A227"/>
+          <w:sz w:val="17"/>
+          <w:szCs w:val="17"/>
+        </w:rPr>
+        <w:t xml:space="preserve">Why:  </w:t>
+      </w:r>
+      <w:r>
+        <w:rPr>
+          <w:rFonts w:ascii="Arial" w:cs="Arial" w:eastAsia="Arial" w:hAnsi="Arial"/>
+          <w:color w:val="2C2C2C"/>
+          <w:sz w:val="17"/>
+          <w:szCs w:val="17"/>
+        </w:rPr>
+        <w:t xml:space="preserve">The day's second compound pattern — pulling, rotating off the pressing above. Single-arm row trains the weaker right shoulder unilaterally under full control. If the day calls for a row variation, rotate between: a chest-supported row, a Kieser row, or a band row — right arm leads on every option, at the same controlled load. The single-arm DB row stays the movement we track.</w:t>
+      </w:r>
+    </w:p>
+    <w:tbl>
+      <w:tblPr>
+        <w:tblW w:type="dxa" w:w="10440"/>
+        <w:tblBorders>
+          <w:top w:val="none" w:color="FFFFFF" w:sz="0"/>
+          <w:left w:val="none" w:color="FFFFFF" w:sz="0"/>
+          <w:bottom w:val="none" w:color="FFFFFF" w:sz="0"/>
+          <w:right w:val="none" w:color="FFFFFF" w:sz="0"/>
+          <w:insideH w:val="single" w:color="auto" w:sz="4"/>
+          <w:insideV w:val="single" w:color="auto" w:sz="4"/>
+        </w:tblBorders>
+      </w:tblPr>
+      <w:tblGrid>
+        <w:gridCol w:w="2400"/>
+        <w:gridCol w:w="380"/>
+        <w:gridCol w:w="420"/>
+        <w:gridCol w:w="680"/>
+        <w:gridCol w:w="540"/>
+        <w:gridCol w:w="440"/>
+        <w:gridCol w:w="5580"/>
+      </w:tblGrid>
+      <w:tr>
+        <w:tc>
+          <w:tcPr>
+            <w:tcW w:type="dxa" w:w="2400"/>
+            <w:tcBorders>
+              <w:top w:val="none" w:color="FFFFFF" w:sz="0"/>
+              <w:left w:val="none" w:color="FFFFFF" w:sz="0"/>
+              <w:bottom w:val="none" w:color="FFFFFF" w:sz="0"/>
+              <w:right w:val="none" w:color="FFFFFF" w:sz="0"/>
+            </w:tcBorders>
+            <w:shd w:fill="F5E8C0" w:color="auto" w:val="clear"/>
+            <w:tcMar>
+              <w:top w:type="dxa" w:w="40"/>
+              <w:left w:type="dxa" w:w="80"/>
+              <w:bottom w:type="dxa" w:w="40"/>
+              <w:right w:type="dxa" w:w="80"/>
+            </w:tcMar>
+            <w:vAlign w:val="center"/>
+          </w:tcPr>
+          <w:p>
+            <w:pPr>
+              <w:jc w:val="left"/>
+            </w:pPr>
+            <w:r>
+              <w:rPr>
+                <w:rFonts w:ascii="Arial" w:cs="Arial" w:eastAsia="Arial" w:hAnsi="Arial"/>
+                <w:b/>
+                <w:bCs/>
+                <w:color w:val="C9A227"/>
+                <w:sz w:val="15"/>
+                <w:szCs w:val="15"/>
+              </w:rPr>
+              <w:t xml:space="preserve">EXERCISE</w:t>
+            </w:r>
+          </w:p>
+        </w:tc>
+        <w:tc>
+          <w:tcPr>
+            <w:tcW w:type="dxa" w:w="380"/>
+            <w:tcBorders>
+              <w:top w:val="none" w:color="FFFFFF" w:sz="0"/>
+              <w:left w:val="none" w:color="FFFFFF" w:sz="0"/>
+              <w:bottom w:val="none" w:color="FFFFFF" w:sz="0"/>
+              <w:right w:val="none" w:color="FFFFFF" w:sz="0"/>
+            </w:tcBorders>
+            <w:shd w:fill="F5E8C0" w:color="auto" w:val="clear"/>
+            <w:tcMar>
+              <w:top w:type="dxa" w:w="40"/>
+              <w:left w:type="dxa" w:w="80"/>
+              <w:bottom w:type="dxa" w:w="40"/>
+              <w:right w:type="dxa" w:w="80"/>
+            </w:tcMar>
+            <w:vAlign w:val="center"/>
+          </w:tcPr>
+          <w:p>
+            <w:pPr>
+              <w:jc w:val="center"/>
+            </w:pPr>
+            <w:r>
+              <w:rPr>
+                <w:rFonts w:ascii="Arial" w:cs="Arial" w:eastAsia="Arial" w:hAnsi="Arial"/>
+                <w:b/>
+                <w:bCs/>
+                <w:color w:val="C9A227"/>
+                <w:sz w:val="13"/>
+                <w:szCs w:val="13"/>
+              </w:rPr>
+              <w:t xml:space="preserve">SETS</w:t>
+            </w:r>
+          </w:p>
+        </w:tc>
+        <w:tc>
+          <w:tcPr>
+            <w:tcW w:type="dxa" w:w="420"/>
+            <w:tcBorders>
+              <w:top w:val="none" w:color="FFFFFF" w:sz="0"/>
+              <w:left w:val="none" w:color="FFFFFF" w:sz="0"/>
+              <w:bottom w:val="none" w:color="FFFFFF" w:sz="0"/>
+              <w:right w:val="none" w:color="FFFFFF" w:sz="0"/>
+            </w:tcBorders>
+            <w:shd w:fill="F5E8C0" w:color="auto" w:val="clear"/>
+            <w:tcMar>
+              <w:top w:type="dxa" w:w="40"/>
+              <w:left w:type="dxa" w:w="80"/>
+              <w:bottom w:type="dxa" w:w="40"/>
+              <w:right w:type="dxa" w:w="80"/>
+            </w:tcMar>
+            <w:vAlign w:val="center"/>
+          </w:tcPr>
+          <w:p>
+            <w:pPr>
+              <w:jc w:val="center"/>
+            </w:pPr>
+            <w:r>
+              <w:rPr>
+                <w:rFonts w:ascii="Arial" w:cs="Arial" w:eastAsia="Arial" w:hAnsi="Arial"/>
+                <w:b/>
+                <w:bCs/>
+                <w:color w:val="C9A227"/>
+                <w:sz w:val="13"/>
+                <w:szCs w:val="13"/>
+              </w:rPr>
+              <w:t xml:space="preserve">REPS</w:t>
+            </w:r>
+          </w:p>
+        </w:tc>
+        <w:tc>
+          <w:tcPr>
+            <w:tcW w:type="dxa" w:w="680"/>
+            <w:tcBorders>
+              <w:top w:val="none" w:color="FFFFFF" w:sz="0"/>
+              <w:left w:val="none" w:color="FFFFFF" w:sz="0"/>
+              <w:bottom w:val="none" w:color="FFFFFF" w:sz="0"/>
+              <w:right w:val="none" w:color="FFFFFF" w:sz="0"/>
+            </w:tcBorders>
+            <w:shd w:fill="F5E8C0" w:color="auto" w:val="clear"/>
+            <w:tcMar>
+              <w:top w:type="dxa" w:w="40"/>
+              <w:left w:type="dxa" w:w="80"/>
+              <w:bottom w:type="dxa" w:w="40"/>
+              <w:right w:type="dxa" w:w="80"/>
+            </w:tcMar>
+            <w:vAlign w:val="center"/>
+          </w:tcPr>
+          <w:p>
+            <w:pPr>
+              <w:jc w:val="center"/>
+            </w:pPr>
+            <w:r>
+              <w:rPr>
+                <w:rFonts w:ascii="Arial" w:cs="Arial" w:eastAsia="Arial" w:hAnsi="Arial"/>
+                <w:b/>
+                <w:bCs/>
+                <w:color w:val="C9A227"/>
+                <w:sz w:val="13"/>
+                <w:szCs w:val="13"/>
+              </w:rPr>
+              <w:t xml:space="preserve">LOAD</w:t>
+            </w:r>
+          </w:p>
+        </w:tc>
+        <w:tc>
+          <w:tcPr>
+            <w:tcW w:type="dxa" w:w="540"/>
+            <w:tcBorders>
+              <w:top w:val="none" w:color="FFFFFF" w:sz="0"/>
+              <w:left w:val="none" w:color="FFFFFF" w:sz="0"/>
+              <w:bottom w:val="none" w:color="FFFFFF" w:sz="0"/>
+              <w:right w:val="none" w:color="FFFFFF" w:sz="0"/>
+            </w:tcBorders>
+            <w:shd w:fill="F5E8C0" w:color="auto" w:val="clear"/>
+            <w:tcMar>
+              <w:top w:type="dxa" w:w="40"/>
+              <w:left w:type="dxa" w:w="80"/>
+              <w:bottom w:type="dxa" w:w="40"/>
+              <w:right w:type="dxa" w:w="80"/>
+            </w:tcMar>
+            <w:vAlign w:val="center"/>
+          </w:tcPr>
+          <w:p>
+            <w:pPr>
+              <w:jc w:val="center"/>
+            </w:pPr>
+            <w:r>
+              <w:rPr>
+                <w:rFonts w:ascii="Arial" w:cs="Arial" w:eastAsia="Arial" w:hAnsi="Arial"/>
+                <w:b/>
+                <w:bCs/>
+                <w:color w:val="C9A227"/>
+                <w:sz w:val="13"/>
+                <w:szCs w:val="13"/>
+              </w:rPr>
+              <w:t xml:space="preserve">TEMPO</w:t>
+            </w:r>
+          </w:p>
+        </w:tc>
+        <w:tc>
+          <w:tcPr>
+            <w:tcW w:type="dxa" w:w="440"/>
+            <w:tcBorders>
+              <w:top w:val="none" w:color="FFFFFF" w:sz="0"/>
+              <w:left w:val="none" w:color="FFFFFF" w:sz="0"/>
+              <w:bottom w:val="none" w:color="FFFFFF" w:sz="0"/>
+              <w:right w:val="none" w:color="FFFFFF" w:sz="0"/>
+            </w:tcBorders>
+            <w:shd w:fill="F5E8C0" w:color="auto" w:val="clear"/>
+            <w:tcMar>
+              <w:top w:type="dxa" w:w="40"/>
+              <w:left w:type="dxa" w:w="80"/>
+              <w:bottom w:type="dxa" w:w="40"/>
+              <w:right w:type="dxa" w:w="80"/>
+            </w:tcMar>
+            <w:vAlign w:val="center"/>
+          </w:tcPr>
+          <w:p>
+            <w:pPr>
+              <w:jc w:val="center"/>
+            </w:pPr>
+            <w:r>
+              <w:rPr>
+                <w:rFonts w:ascii="Arial" w:cs="Arial" w:eastAsia="Arial" w:hAnsi="Arial"/>
+                <w:b/>
+                <w:bCs/>
+                <w:color w:val="C9A227"/>
+                <w:sz w:val="13"/>
+                <w:szCs w:val="13"/>
+              </w:rPr>
+              <w:t xml:space="preserve">REST</w:t>
+            </w:r>
+          </w:p>
+        </w:tc>
+        <w:tc>
+          <w:tcPr>
+            <w:tcW w:type="dxa" w:w="5580"/>
+            <w:tcBorders>
+              <w:top w:val="none" w:color="FFFFFF" w:sz="0"/>
+              <w:left w:val="none" w:color="FFFFFF" w:sz="0"/>
+              <w:bottom w:val="none" w:color="FFFFFF" w:sz="0"/>
+              <w:right w:val="none" w:color="FFFFFF" w:sz="0"/>
+            </w:tcBorders>
+            <w:shd w:fill="F5E8C0" w:color="auto" w:val="clear"/>
+            <w:tcMar>
+              <w:top w:type="dxa" w:w="40"/>
+              <w:left w:type="dxa" w:w="80"/>
+              <w:bottom w:type="dxa" w:w="40"/>
+              <w:right w:type="dxa" w:w="80"/>
+            </w:tcMar>
+            <w:vAlign w:val="center"/>
+          </w:tcPr>
+          <w:p>
+            <w:pPr>
+              <w:jc w:val="left"/>
+            </w:pPr>
+            <w:r>
+              <w:rPr>
+                <w:rFonts w:ascii="Arial" w:cs="Arial" w:eastAsia="Arial" w:hAnsi="Arial"/>
+                <w:b/>
+                <w:bCs/>
+                <w:color w:val="C9A227"/>
+                <w:sz w:val="15"/>
+                <w:szCs w:val="15"/>
+              </w:rPr>
+              <w:t xml:space="preserve">COACHING CUE</w:t>
+            </w:r>
+          </w:p>
+        </w:tc>
+      </w:tr>
+      <w:tr>
+        <w:tc>
+          <w:tcPr>
+            <w:tcW w:type="dxa" w:w="2400"/>
+            <w:tcBorders>
+              <w:top w:val="none" w:color="FFFFFF" w:sz="0"/>
+              <w:left w:val="none" w:color="FFFFFF" w:sz="0"/>
+              <w:bottom w:val="none" w:color="FFFFFF" w:sz="0"/>
+              <w:right w:val="none" w:color="FFFFFF" w:sz="0"/>
+            </w:tcBorders>
+            <w:shd w:fill="FAF3E0" w:color="auto" w:val="clear"/>
+            <w:tcMar>
+              <w:top w:type="dxa" w:w="40"/>
+              <w:left w:type="dxa" w:w="80"/>
+              <w:bottom w:type="dxa" w:w="40"/>
+              <w:right w:type="dxa" w:w="80"/>
+            </w:tcMar>
+            <w:vAlign w:val="center"/>
+          </w:tcPr>
+          <w:p>
+            <w:r>
+              <w:rPr>
+                <w:rFonts w:ascii="Arial" w:cs="Arial" w:eastAsia="Arial" w:hAnsi="Arial"/>
+                <w:b/>
+                <w:bCs/>
+                <w:color w:val="2C2C2C"/>
+                <w:sz w:val="18"/>
+                <w:szCs w:val="18"/>
+              </w:rPr>
+              <w:t xml:space="preserve">Single-Arm DB Row</w:t>
+            </w:r>
+          </w:p>
+          <w:p>
+            <w:r>
+              <w:rPr>
+                <w:rFonts w:ascii="Arial" w:cs="Arial" w:eastAsia="Arial" w:hAnsi="Arial"/>
+                <w:i/>
+                <w:iCs/>
+                <w:color w:val="B71C1C"/>
+                <w:sz w:val="14"/>
+                <w:szCs w:val="14"/>
+              </w:rPr>
+              <w:t xml:space="preserve">Right arm leads — log load L vs R separately.</w:t>
+            </w:r>
+          </w:p>
+        </w:tc>
+        <w:tc>
+          <w:tcPr>
+            <w:tcW w:type="dxa" w:w="380"/>
+            <w:tcBorders>
+              <w:top w:val="none" w:color="FFFFFF" w:sz="0"/>
+              <w:left w:val="none" w:color="FFFFFF" w:sz="0"/>
+              <w:bottom w:val="none" w:color="FFFFFF" w:sz="0"/>
+              <w:right w:val="none" w:color="FFFFFF" w:sz="0"/>
+            </w:tcBorders>
+            <w:shd w:fill="FAF3E0" w:color="auto" w:val="clear"/>
+            <w:tcMar>
+              <w:top w:type="dxa" w:w="40"/>
+              <w:left w:type="dxa" w:w="80"/>
+              <w:bottom w:type="dxa" w:w="40"/>
+              <w:right w:type="dxa" w:w="80"/>
+            </w:tcMar>
+            <w:vAlign w:val="center"/>
+          </w:tcPr>
+          <w:p>
+            <w:pPr>
+              <w:jc w:val="center"/>
+            </w:pPr>
+            <w:r>
+              <w:rPr>
+                <w:rFonts w:ascii="Arial" w:cs="Arial" w:eastAsia="Arial" w:hAnsi="Arial"/>
+                <w:color w:val="6B6B6B"/>
+                <w:sz w:val="15"/>
+                <w:szCs w:val="15"/>
+              </w:rPr>
+              <w:t xml:space="preserve">3</w:t>
+            </w:r>
+          </w:p>
+        </w:tc>
+        <w:tc>
+          <w:tcPr>
+            <w:tcW w:type="dxa" w:w="420"/>
+            <w:tcBorders>
+              <w:top w:val="none" w:color="FFFFFF" w:sz="0"/>
+              <w:left w:val="none" w:color="FFFFFF" w:sz="0"/>
+              <w:bottom w:val="none" w:color="FFFFFF" w:sz="0"/>
+              <w:right w:val="none" w:color="FFFFFF" w:sz="0"/>
+            </w:tcBorders>
+            <w:shd w:fill="FAF3E0" w:color="auto" w:val="clear"/>
+            <w:tcMar>
+              <w:top w:type="dxa" w:w="40"/>
+              <w:left w:type="dxa" w:w="80"/>
+              <w:bottom w:type="dxa" w:w="40"/>
+              <w:right w:type="dxa" w:w="80"/>
+            </w:tcMar>
+            <w:vAlign w:val="center"/>
+          </w:tcPr>
+          <w:p>
+            <w:pPr>
+              <w:jc w:val="center"/>
+            </w:pPr>
+            <w:r>
+              <w:rPr>
+                <w:rFonts w:ascii="Arial" w:cs="Arial" w:eastAsia="Arial" w:hAnsi="Arial"/>
+                <w:color w:val="6B6B6B"/>
+                <w:sz w:val="15"/>
+                <w:szCs w:val="15"/>
+              </w:rPr>
+              <w:t xml:space="preserve">6 each arm</w:t>
+            </w:r>
+          </w:p>
+        </w:tc>
+        <w:tc>
+          <w:tcPr>
+            <w:tcW w:type="dxa" w:w="680"/>
+            <w:tcBorders>
+              <w:top w:val="none" w:color="FFFFFF" w:sz="0"/>
+              <w:left w:val="none" w:color="FFFFFF" w:sz="0"/>
+              <w:bottom w:val="none" w:color="FFFFFF" w:sz="0"/>
+              <w:right w:val="none" w:color="FFFFFF" w:sz="0"/>
+            </w:tcBorders>
+            <w:shd w:fill="FAF3E0" w:color="auto" w:val="clear"/>
+            <w:tcMar>
+              <w:top w:type="dxa" w:w="40"/>
+              <w:left w:type="dxa" w:w="80"/>
+              <w:bottom w:type="dxa" w:w="40"/>
+              <w:right w:type="dxa" w:w="80"/>
+            </w:tcMar>
+            <w:vAlign w:val="center"/>
+          </w:tcPr>
+          <w:p>
+            <w:pPr>
+              <w:jc w:val="center"/>
+            </w:pPr>
+            <w:r>
+              <w:rPr>
+                <w:rFonts w:ascii="Arial" w:cs="Arial" w:eastAsia="Arial" w:hAnsi="Arial"/>
+                <w:color w:val="6B6B6B"/>
+                <w:sz w:val="15"/>
+                <w:szCs w:val="15"/>
+              </w:rPr>
+              <w:t xml:space="preserve">15–17.5 lb</w:t>
+            </w:r>
+          </w:p>
+        </w:tc>
+        <w:tc>
+          <w:tcPr>
+            <w:tcW w:type="dxa" w:w="540"/>
+            <w:tcBorders>
+              <w:top w:val="none" w:color="FFFFFF" w:sz="0"/>
+              <w:left w:val="none" w:color="FFFFFF" w:sz="0"/>
+              <w:bottom w:val="none" w:color="FFFFFF" w:sz="0"/>
+              <w:right w:val="none" w:color="FFFFFF" w:sz="0"/>
+            </w:tcBorders>
+            <w:shd w:fill="FAF3E0" w:color="auto" w:val="clear"/>
+            <w:tcMar>
+              <w:top w:type="dxa" w:w="40"/>
+              <w:left w:type="dxa" w:w="80"/>
+              <w:bottom w:type="dxa" w:w="40"/>
+              <w:right w:type="dxa" w:w="80"/>
+            </w:tcMar>
+            <w:vAlign w:val="center"/>
+          </w:tcPr>
+          <w:p>
+            <w:pPr>
+              <w:jc w:val="center"/>
+            </w:pPr>
+            <w:r>
+              <w:rPr>
+                <w:rFonts w:ascii="Arial" w:cs="Arial" w:eastAsia="Arial" w:hAnsi="Arial"/>
+                <w:color w:val="6B6B6B"/>
+                <w:sz w:val="15"/>
+                <w:szCs w:val="15"/>
+              </w:rPr>
+              <w:t xml:space="preserve">2-1-1</w:t>
+            </w:r>
+          </w:p>
+        </w:tc>
+        <w:tc>
+          <w:tcPr>
+            <w:tcW w:type="dxa" w:w="440"/>
+            <w:tcBorders>
+              <w:top w:val="none" w:color="FFFFFF" w:sz="0"/>
+              <w:left w:val="none" w:color="FFFFFF" w:sz="0"/>
+              <w:bottom w:val="none" w:color="FFFFFF" w:sz="0"/>
+              <w:right w:val="none" w:color="FFFFFF" w:sz="0"/>
+            </w:tcBorders>
+            <w:shd w:fill="FAF3E0" w:color="auto" w:val="clear"/>
+            <w:tcMar>
+              <w:top w:type="dxa" w:w="40"/>
+              <w:left w:type="dxa" w:w="80"/>
+              <w:bottom w:type="dxa" w:w="40"/>
+              <w:right w:type="dxa" w:w="80"/>
+            </w:tcMar>
+            <w:vAlign w:val="center"/>
+          </w:tcPr>
+          <w:p>
+            <w:pPr>
+              <w:jc w:val="center"/>
+            </w:pPr>
+            <w:r>
+              <w:rPr>
+                <w:rFonts w:ascii="Arial" w:cs="Arial" w:eastAsia="Arial" w:hAnsi="Arial"/>
+                <w:color w:val="6B6B6B"/>
+                <w:sz w:val="15"/>
+                <w:szCs w:val="15"/>
+              </w:rPr>
+              <w:t xml:space="preserve">75s</w:t>
+            </w:r>
+          </w:p>
+        </w:tc>
+        <w:tc>
+          <w:tcPr>
+            <w:tcW w:type="dxa" w:w="5580"/>
+            <w:tcBorders>
+              <w:top w:val="none" w:color="FFFFFF" w:sz="0"/>
+              <w:left w:val="none" w:color="FFFFFF" w:sz="0"/>
+              <w:bottom w:val="none" w:color="FFFFFF" w:sz="0"/>
+              <w:right w:val="none" w:color="FFFFFF" w:sz="0"/>
+            </w:tcBorders>
+            <w:shd w:fill="FAF3E0" w:color="auto" w:val="clear"/>
+            <w:tcMar>
+              <w:top w:type="dxa" w:w="40"/>
+              <w:left w:type="dxa" w:w="80"/>
+              <w:bottom w:type="dxa" w:w="40"/>
+              <w:right w:type="dxa" w:w="80"/>
+            </w:tcMar>
+            <w:vAlign w:val="center"/>
+          </w:tcPr>
+          <w:p>
+            <w:r>
+              <w:rPr>
+                <w:rFonts w:ascii="Arial" w:cs="Arial" w:eastAsia="Arial" w:hAnsi="Arial"/>
+                <w:color w:val="6B6B6B"/>
+                <w:sz w:val="17"/>
+                <w:szCs w:val="17"/>
+              </w:rPr>
+              <w:t xml:space="preserve">Right first. Flat back, pull elbow to hip.</w:t>
+            </w:r>
+            <w:r>
+              <w:rPr>
+                <w:rFonts w:ascii="Arial" w:cs="Arial" w:eastAsia="Arial" w:hAnsi="Arial"/>
+                <w:i/>
+                <w:iCs/>
+                <w:color w:val="00695C"/>
+                <w:sz w:val="14"/>
+                <w:szCs w:val="14"/>
+              </w:rPr>
+              <w:t xml:space="preserve">  2 RIR</w:t>
+            </w:r>
+          </w:p>
+        </w:tc>
+      </w:tr>
+    </w:tbl>
+    <w:p>
+      <w:pPr>
+        <w:spacing w:after="100"/>
+      </w:pPr>
+    </w:p>
+    <w:p>
+      <w:pPr>
+        <w:spacing w:after="60" w:before="120"/>
+      </w:pPr>
+      <w:r>
+        <w:rPr>
+          <w:rFonts w:ascii="Arial" w:cs="Arial" w:eastAsia="Arial" w:hAnsi="Arial"/>
+          <w:b/>
+          <w:bCs/>
+          <w:color w:val="C9A227"/>
+          <w:sz w:val="17"/>
+          <w:szCs w:val="17"/>
+        </w:rPr>
+        <w:t xml:space="preserve">E — FULL-BODY INTEGRATION — CARRY &amp; CORE</w:t>
+      </w:r>
+    </w:p>
+    <w:p>
+      <w:pPr>
+        <w:spacing w:after="80"/>
+      </w:pPr>
+      <w:r>
+        <w:rPr>
+          <w:rFonts w:ascii="Arial" w:cs="Arial" w:eastAsia="Arial" w:hAnsi="Arial"/>
+          <w:b/>
+          <w:bCs/>
+          <w:color w:val="C9A227"/>
+          <w:sz w:val="17"/>
+          <w:szCs w:val="17"/>
+        </w:rPr>
+        <w:t xml:space="preserve">Why:  </w:t>
+      </w:r>
+      <w:r>
+        <w:rPr>
+          <w:rFonts w:ascii="Arial" w:cs="Arial" w:eastAsia="Arial" w:hAnsi="Arial"/>
+          <w:color w:val="2C2C2C"/>
+          <w:sz w:val="17"/>
+          <w:szCs w:val="17"/>
+        </w:rPr>
+        <w:t xml:space="preserve">The session's closing compound work — the day's pressing posture, pulling strength, and grip pulled together under gait, then core under load. Distance and quality govern the carry, not a rep count.</w:t>
+      </w:r>
+    </w:p>
+    <w:tbl>
+      <w:tblPr>
+        <w:tblW w:type="dxa" w:w="10440"/>
+        <w:tblBorders>
+          <w:top w:val="none" w:color="FFFFFF" w:sz="0"/>
+          <w:left w:val="none" w:color="FFFFFF" w:sz="0"/>
+          <w:bottom w:val="none" w:color="FFFFFF" w:sz="0"/>
+          <w:right w:val="none" w:color="FFFFFF" w:sz="0"/>
+          <w:insideH w:val="single" w:color="auto" w:sz="4"/>
+          <w:insideV w:val="single" w:color="auto" w:sz="4"/>
+        </w:tblBorders>
+      </w:tblPr>
+      <w:tblGrid>
+        <w:gridCol w:w="2400"/>
+        <w:gridCol w:w="380"/>
+        <w:gridCol w:w="420"/>
+        <w:gridCol w:w="680"/>
+        <w:gridCol w:w="540"/>
+        <w:gridCol w:w="440"/>
+        <w:gridCol w:w="5580"/>
+      </w:tblGrid>
+      <w:tr>
+        <w:tc>
+          <w:tcPr>
+            <w:tcW w:type="dxa" w:w="2400"/>
+            <w:tcBorders>
+              <w:top w:val="none" w:color="FFFFFF" w:sz="0"/>
+              <w:left w:val="none" w:color="FFFFFF" w:sz="0"/>
+              <w:bottom w:val="none" w:color="FFFFFF" w:sz="0"/>
+              <w:right w:val="none" w:color="FFFFFF" w:sz="0"/>
+            </w:tcBorders>
+            <w:shd w:fill="F5E8C0" w:color="auto" w:val="clear"/>
+            <w:tcMar>
+              <w:top w:type="dxa" w:w="40"/>
+              <w:left w:type="dxa" w:w="80"/>
+              <w:bottom w:type="dxa" w:w="40"/>
+              <w:right w:type="dxa" w:w="80"/>
+            </w:tcMar>
+            <w:vAlign w:val="center"/>
+          </w:tcPr>
+          <w:p>
+            <w:pPr>
+              <w:jc w:val="left"/>
+            </w:pPr>
+            <w:r>
+              <w:rPr>
+                <w:rFonts w:ascii="Arial" w:cs="Arial" w:eastAsia="Arial" w:hAnsi="Arial"/>
+                <w:b/>
+                <w:bCs/>
+                <w:color w:val="C9A227"/>
+                <w:sz w:val="15"/>
+                <w:szCs w:val="15"/>
+              </w:rPr>
+              <w:t xml:space="preserve">EXERCISE</w:t>
+            </w:r>
+          </w:p>
+        </w:tc>
+        <w:tc>
+          <w:tcPr>
+            <w:tcW w:type="dxa" w:w="380"/>
+            <w:tcBorders>
+              <w:top w:val="none" w:color="FFFFFF" w:sz="0"/>
+              <w:left w:val="none" w:color="FFFFFF" w:sz="0"/>
+              <w:bottom w:val="none" w:color="FFFFFF" w:sz="0"/>
+              <w:right w:val="none" w:color="FFFFFF" w:sz="0"/>
+            </w:tcBorders>
+            <w:shd w:fill="F5E8C0" w:color="auto" w:val="clear"/>
+            <w:tcMar>
+              <w:top w:type="dxa" w:w="40"/>
+              <w:left w:type="dxa" w:w="80"/>
+              <w:bottom w:type="dxa" w:w="40"/>
+              <w:right w:type="dxa" w:w="80"/>
+            </w:tcMar>
+            <w:vAlign w:val="center"/>
+          </w:tcPr>
+          <w:p>
+            <w:pPr>
+              <w:jc w:val="center"/>
+            </w:pPr>
+            <w:r>
+              <w:rPr>
+                <w:rFonts w:ascii="Arial" w:cs="Arial" w:eastAsia="Arial" w:hAnsi="Arial"/>
+                <w:b/>
+                <w:bCs/>
+                <w:color w:val="C9A227"/>
+                <w:sz w:val="13"/>
+                <w:szCs w:val="13"/>
+              </w:rPr>
+              <w:t xml:space="preserve">SETS</w:t>
+            </w:r>
+          </w:p>
+        </w:tc>
+        <w:tc>
+          <w:tcPr>
+            <w:tcW w:type="dxa" w:w="420"/>
+            <w:tcBorders>
+              <w:top w:val="none" w:color="FFFFFF" w:sz="0"/>
+              <w:left w:val="none" w:color="FFFFFF" w:sz="0"/>
+              <w:bottom w:val="none" w:color="FFFFFF" w:sz="0"/>
+              <w:right w:val="none" w:color="FFFFFF" w:sz="0"/>
+            </w:tcBorders>
+            <w:shd w:fill="F5E8C0" w:color="auto" w:val="clear"/>
+            <w:tcMar>
+              <w:top w:type="dxa" w:w="40"/>
+              <w:left w:type="dxa" w:w="80"/>
+              <w:bottom w:type="dxa" w:w="40"/>
+              <w:right w:type="dxa" w:w="80"/>
+            </w:tcMar>
+            <w:vAlign w:val="center"/>
+          </w:tcPr>
+          <w:p>
+            <w:pPr>
+              <w:jc w:val="center"/>
+            </w:pPr>
+            <w:r>
+              <w:rPr>
+                <w:rFonts w:ascii="Arial" w:cs="Arial" w:eastAsia="Arial" w:hAnsi="Arial"/>
+                <w:b/>
+                <w:bCs/>
+                <w:color w:val="C9A227"/>
+                <w:sz w:val="13"/>
+                <w:szCs w:val="13"/>
+              </w:rPr>
+              <w:t xml:space="preserve">REPS</w:t>
+            </w:r>
+          </w:p>
+        </w:tc>
+        <w:tc>
+          <w:tcPr>
+            <w:tcW w:type="dxa" w:w="680"/>
+            <w:tcBorders>
+              <w:top w:val="none" w:color="FFFFFF" w:sz="0"/>
+              <w:left w:val="none" w:color="FFFFFF" w:sz="0"/>
+              <w:bottom w:val="none" w:color="FFFFFF" w:sz="0"/>
+              <w:right w:val="none" w:color="FFFFFF" w:sz="0"/>
+            </w:tcBorders>
+            <w:shd w:fill="F5E8C0" w:color="auto" w:val="clear"/>
+            <w:tcMar>
+              <w:top w:type="dxa" w:w="40"/>
+              <w:left w:type="dxa" w:w="80"/>
+              <w:bottom w:type="dxa" w:w="40"/>
+              <w:right w:type="dxa" w:w="80"/>
+            </w:tcMar>
+            <w:vAlign w:val="center"/>
+          </w:tcPr>
+          <w:p>
+            <w:pPr>
+              <w:jc w:val="center"/>
+            </w:pPr>
+            <w:r>
+              <w:rPr>
+                <w:rFonts w:ascii="Arial" w:cs="Arial" w:eastAsia="Arial" w:hAnsi="Arial"/>
+                <w:b/>
+                <w:bCs/>
+                <w:color w:val="C9A227"/>
+                <w:sz w:val="13"/>
+                <w:szCs w:val="13"/>
+              </w:rPr>
+              <w:t xml:space="preserve">LOAD</w:t>
+            </w:r>
+          </w:p>
+        </w:tc>
+        <w:tc>
+          <w:tcPr>
+            <w:tcW w:type="dxa" w:w="540"/>
+            <w:tcBorders>
+              <w:top w:val="none" w:color="FFFFFF" w:sz="0"/>
+              <w:left w:val="none" w:color="FFFFFF" w:sz="0"/>
+              <w:bottom w:val="none" w:color="FFFFFF" w:sz="0"/>
+              <w:right w:val="none" w:color="FFFFFF" w:sz="0"/>
+            </w:tcBorders>
+            <w:shd w:fill="F5E8C0" w:color="auto" w:val="clear"/>
+            <w:tcMar>
+              <w:top w:type="dxa" w:w="40"/>
+              <w:left w:type="dxa" w:w="80"/>
+              <w:bottom w:type="dxa" w:w="40"/>
+              <w:right w:type="dxa" w:w="80"/>
+            </w:tcMar>
+            <w:vAlign w:val="center"/>
+          </w:tcPr>
+          <w:p>
+            <w:pPr>
+              <w:jc w:val="center"/>
+            </w:pPr>
+            <w:r>
+              <w:rPr>
+                <w:rFonts w:ascii="Arial" w:cs="Arial" w:eastAsia="Arial" w:hAnsi="Arial"/>
+                <w:b/>
+                <w:bCs/>
+                <w:color w:val="C9A227"/>
+                <w:sz w:val="13"/>
+                <w:szCs w:val="13"/>
+              </w:rPr>
+              <w:t xml:space="preserve">TEMPO</w:t>
+            </w:r>
+          </w:p>
+        </w:tc>
+        <w:tc>
+          <w:tcPr>
+            <w:tcW w:type="dxa" w:w="440"/>
+            <w:tcBorders>
+              <w:top w:val="none" w:color="FFFFFF" w:sz="0"/>
+              <w:left w:val="none" w:color="FFFFFF" w:sz="0"/>
+              <w:bottom w:val="none" w:color="FFFFFF" w:sz="0"/>
+              <w:right w:val="none" w:color="FFFFFF" w:sz="0"/>
+            </w:tcBorders>
+            <w:shd w:fill="F5E8C0" w:color="auto" w:val="clear"/>
+            <w:tcMar>
+              <w:top w:type="dxa" w:w="40"/>
+              <w:left w:type="dxa" w:w="80"/>
+              <w:bottom w:type="dxa" w:w="40"/>
+              <w:right w:type="dxa" w:w="80"/>
+            </w:tcMar>
+            <w:vAlign w:val="center"/>
+          </w:tcPr>
+          <w:p>
+            <w:pPr>
+              <w:jc w:val="center"/>
+            </w:pPr>
+            <w:r>
+              <w:rPr>
+                <w:rFonts w:ascii="Arial" w:cs="Arial" w:eastAsia="Arial" w:hAnsi="Arial"/>
+                <w:b/>
+                <w:bCs/>
+                <w:color w:val="C9A227"/>
+                <w:sz w:val="13"/>
+                <w:szCs w:val="13"/>
+              </w:rPr>
+              <w:t xml:space="preserve">REST</w:t>
+            </w:r>
+          </w:p>
+        </w:tc>
+        <w:tc>
+          <w:tcPr>
+            <w:tcW w:type="dxa" w:w="5580"/>
+            <w:tcBorders>
+              <w:top w:val="none" w:color="FFFFFF" w:sz="0"/>
+              <w:left w:val="none" w:color="FFFFFF" w:sz="0"/>
+              <w:bottom w:val="none" w:color="FFFFFF" w:sz="0"/>
+              <w:right w:val="none" w:color="FFFFFF" w:sz="0"/>
+            </w:tcBorders>
+            <w:shd w:fill="F5E8C0" w:color="auto" w:val="clear"/>
+            <w:tcMar>
+              <w:top w:type="dxa" w:w="40"/>
+              <w:left w:type="dxa" w:w="80"/>
+              <w:bottom w:type="dxa" w:w="40"/>
+              <w:right w:type="dxa" w:w="80"/>
+            </w:tcMar>
+            <w:vAlign w:val="center"/>
+          </w:tcPr>
+          <w:p>
+            <w:pPr>
+              <w:jc w:val="left"/>
+            </w:pPr>
+            <w:r>
+              <w:rPr>
+                <w:rFonts w:ascii="Arial" w:cs="Arial" w:eastAsia="Arial" w:hAnsi="Arial"/>
+                <w:b/>
+                <w:bCs/>
+                <w:color w:val="C9A227"/>
+                <w:sz w:val="15"/>
+                <w:szCs w:val="15"/>
+              </w:rPr>
+              <w:t xml:space="preserve">COACHING CUE</w:t>
+            </w:r>
+          </w:p>
+        </w:tc>
+      </w:tr>
+      <w:tr>
+        <w:tc>
+          <w:tcPr>
+            <w:tcW w:type="dxa" w:w="2400"/>
+            <w:tcBorders>
+              <w:top w:val="none" w:color="FFFFFF" w:sz="0"/>
+              <w:left w:val="none" w:color="FFFFFF" w:sz="0"/>
+              <w:bottom w:val="none" w:color="FFFFFF" w:sz="0"/>
+              <w:right w:val="none" w:color="FFFFFF" w:sz="0"/>
+            </w:tcBorders>
+            <w:shd w:fill="FAF3E0" w:color="auto" w:val="clear"/>
+            <w:tcMar>
+              <w:top w:type="dxa" w:w="40"/>
+              <w:left w:type="dxa" w:w="80"/>
+              <w:bottom w:type="dxa" w:w="40"/>
+              <w:right w:type="dxa" w:w="80"/>
+            </w:tcMar>
+            <w:vAlign w:val="center"/>
+          </w:tcPr>
+          <w:p>
+            <w:r>
+              <w:rPr>
+                <w:rFonts w:ascii="Arial" w:cs="Arial" w:eastAsia="Arial" w:hAnsi="Arial"/>
+                <w:b/>
+                <w:bCs/>
+                <w:color w:val="2C2C2C"/>
+                <w:sz w:val="18"/>
+                <w:szCs w:val="18"/>
+              </w:rPr>
+              <w:t xml:space="preserve">DB Farmer Carry</w:t>
+            </w:r>
+          </w:p>
+        </w:tc>
+        <w:tc>
+          <w:tcPr>
+            <w:tcW w:type="dxa" w:w="380"/>
+            <w:tcBorders>
+              <w:top w:val="none" w:color="FFFFFF" w:sz="0"/>
+              <w:left w:val="none" w:color="FFFFFF" w:sz="0"/>
+              <w:bottom w:val="none" w:color="FFFFFF" w:sz="0"/>
+              <w:right w:val="none" w:color="FFFFFF" w:sz="0"/>
+            </w:tcBorders>
+            <w:shd w:fill="FAF3E0" w:color="auto" w:val="clear"/>
+            <w:tcMar>
+              <w:top w:type="dxa" w:w="40"/>
+              <w:left w:type="dxa" w:w="80"/>
+              <w:bottom w:type="dxa" w:w="40"/>
+              <w:right w:type="dxa" w:w="80"/>
+            </w:tcMar>
+            <w:vAlign w:val="center"/>
+          </w:tcPr>
+          <w:p>
+            <w:pPr>
+              <w:jc w:val="center"/>
+            </w:pPr>
+            <w:r>
+              <w:rPr>
+                <w:rFonts w:ascii="Arial" w:cs="Arial" w:eastAsia="Arial" w:hAnsi="Arial"/>
+                <w:color w:val="6B6B6B"/>
+                <w:sz w:val="15"/>
+                <w:szCs w:val="15"/>
+              </w:rPr>
+              <w:t xml:space="preserve">3</w:t>
+            </w:r>
+          </w:p>
+        </w:tc>
+        <w:tc>
+          <w:tcPr>
+            <w:tcW w:type="dxa" w:w="420"/>
+            <w:tcBorders>
+              <w:top w:val="none" w:color="FFFFFF" w:sz="0"/>
+              <w:left w:val="none" w:color="FFFFFF" w:sz="0"/>
+              <w:bottom w:val="none" w:color="FFFFFF" w:sz="0"/>
+              <w:right w:val="none" w:color="FFFFFF" w:sz="0"/>
+            </w:tcBorders>
+            <w:shd w:fill="FAF3E0" w:color="auto" w:val="clear"/>
+            <w:tcMar>
+              <w:top w:type="dxa" w:w="40"/>
+              <w:left w:type="dxa" w:w="80"/>
+              <w:bottom w:type="dxa" w:w="40"/>
+              <w:right w:type="dxa" w:w="80"/>
+            </w:tcMar>
+            <w:vAlign w:val="center"/>
+          </w:tcPr>
+          <w:p>
+            <w:pPr>
+              <w:jc w:val="center"/>
+            </w:pPr>
+            <w:r>
+              <w:rPr>
+                <w:rFonts w:ascii="Arial" w:cs="Arial" w:eastAsia="Arial" w:hAnsi="Arial"/>
+                <w:color w:val="6B6B6B"/>
+                <w:sz w:val="15"/>
+                <w:szCs w:val="15"/>
+              </w:rPr>
+              <w:t xml:space="preserve">25 yd each hand</w:t>
+            </w:r>
+          </w:p>
+        </w:tc>
+        <w:tc>
+          <w:tcPr>
+            <w:tcW w:type="dxa" w:w="680"/>
+            <w:tcBorders>
+              <w:top w:val="none" w:color="FFFFFF" w:sz="0"/>
+              <w:left w:val="none" w:color="FFFFFF" w:sz="0"/>
+              <w:bottom w:val="none" w:color="FFFFFF" w:sz="0"/>
+              <w:right w:val="none" w:color="FFFFFF" w:sz="0"/>
+            </w:tcBorders>
+            <w:shd w:fill="FAF3E0" w:color="auto" w:val="clear"/>
+            <w:tcMar>
+              <w:top w:type="dxa" w:w="40"/>
+              <w:left w:type="dxa" w:w="80"/>
+              <w:bottom w:type="dxa" w:w="40"/>
+              <w:right w:type="dxa" w:w="80"/>
+            </w:tcMar>
+            <w:vAlign w:val="center"/>
+          </w:tcPr>
+          <w:p>
+            <w:pPr>
+              <w:jc w:val="center"/>
+            </w:pPr>
+            <w:r>
+              <w:rPr>
+                <w:rFonts w:ascii="Arial" w:cs="Arial" w:eastAsia="Arial" w:hAnsi="Arial"/>
+                <w:color w:val="6B6B6B"/>
+                <w:sz w:val="15"/>
+                <w:szCs w:val="15"/>
+              </w:rPr>
+              <w:t xml:space="preserve">25–27.5 lb</w:t>
+            </w:r>
+          </w:p>
+        </w:tc>
+        <w:tc>
+          <w:tcPr>
+            <w:tcW w:type="dxa" w:w="540"/>
+            <w:tcBorders>
+              <w:top w:val="none" w:color="FFFFFF" w:sz="0"/>
+              <w:left w:val="none" w:color="FFFFFF" w:sz="0"/>
+              <w:bottom w:val="none" w:color="FFFFFF" w:sz="0"/>
+              <w:right w:val="none" w:color="FFFFFF" w:sz="0"/>
+            </w:tcBorders>
+            <w:shd w:fill="FAF3E0" w:color="auto" w:val="clear"/>
+            <w:tcMar>
+              <w:top w:type="dxa" w:w="40"/>
+              <w:left w:type="dxa" w:w="80"/>
+              <w:bottom w:type="dxa" w:w="40"/>
+              <w:right w:type="dxa" w:w="80"/>
+            </w:tcMar>
+            <w:vAlign w:val="center"/>
+          </w:tcPr>
+          <w:p>
+            <w:pPr>
+              <w:jc w:val="center"/>
+            </w:pPr>
+            <w:r>
+              <w:rPr>
+                <w:rFonts w:ascii="Arial" w:cs="Arial" w:eastAsia="Arial" w:hAnsi="Arial"/>
+                <w:color w:val="6B6B6B"/>
+                <w:sz w:val="15"/>
+                <w:szCs w:val="15"/>
+              </w:rPr>
+              <w:t xml:space="preserve">—</w:t>
+            </w:r>
+          </w:p>
+        </w:tc>
+        <w:tc>
+          <w:tcPr>
+            <w:tcW w:type="dxa" w:w="440"/>
+            <w:tcBorders>
+              <w:top w:val="none" w:color="FFFFFF" w:sz="0"/>
+              <w:left w:val="none" w:color="FFFFFF" w:sz="0"/>
+              <w:bottom w:val="none" w:color="FFFFFF" w:sz="0"/>
+              <w:right w:val="none" w:color="FFFFFF" w:sz="0"/>
+            </w:tcBorders>
+            <w:shd w:fill="FAF3E0" w:color="auto" w:val="clear"/>
+            <w:tcMar>
+              <w:top w:type="dxa" w:w="40"/>
+              <w:left w:type="dxa" w:w="80"/>
+              <w:bottom w:type="dxa" w:w="40"/>
+              <w:right w:type="dxa" w:w="80"/>
+            </w:tcMar>
+            <w:vAlign w:val="center"/>
+          </w:tcPr>
+          <w:p>
+            <w:pPr>
+              <w:jc w:val="center"/>
+            </w:pPr>
+            <w:r>
+              <w:rPr>
+                <w:rFonts w:ascii="Arial" w:cs="Arial" w:eastAsia="Arial" w:hAnsi="Arial"/>
+                <w:color w:val="6B6B6B"/>
+                <w:sz w:val="15"/>
+                <w:szCs w:val="15"/>
+              </w:rPr>
+              <w:t xml:space="preserve">60s</w:t>
+            </w:r>
+          </w:p>
+        </w:tc>
+        <w:tc>
+          <w:tcPr>
+            <w:tcW w:type="dxa" w:w="5580"/>
+            <w:tcBorders>
+              <w:top w:val="none" w:color="FFFFFF" w:sz="0"/>
+              <w:left w:val="none" w:color="FFFFFF" w:sz="0"/>
+              <w:bottom w:val="none" w:color="FFFFFF" w:sz="0"/>
+              <w:right w:val="none" w:color="FFFFFF" w:sz="0"/>
+            </w:tcBorders>
+            <w:shd w:fill="FAF3E0" w:color="auto" w:val="clear"/>
+            <w:tcMar>
+              <w:top w:type="dxa" w:w="40"/>
+              <w:left w:type="dxa" w:w="80"/>
+              <w:bottom w:type="dxa" w:w="40"/>
+              <w:right w:type="dxa" w:w="80"/>
+            </w:tcMar>
+            <w:vAlign w:val="center"/>
+          </w:tcPr>
+          <w:p>
+            <w:r>
+              <w:rPr>
+                <w:rFonts w:ascii="Arial" w:cs="Arial" w:eastAsia="Arial" w:hAnsi="Arial"/>
+                <w:color w:val="6B6B6B"/>
+                <w:sz w:val="17"/>
+                <w:szCs w:val="17"/>
+              </w:rPr>
               <w:t xml:space="preserve">Tall posture, ribs stacked, quiet shoulders.</w:t>
+            </w:r>
+            <w:r>
+              <w:rPr>
+                <w:rFonts w:ascii="Arial" w:cs="Arial" w:eastAsia="Arial" w:hAnsi="Arial"/>
+                <w:i/>
+                <w:iCs/>
+                <w:color w:val="00695C"/>
+                <w:sz w:val="14"/>
+                <w:szCs w:val="14"/>
+              </w:rPr>
+              <w:t xml:space="preserve">  Distance &amp; quality governed — no RIR target</w:t>
             </w:r>
           </w:p>
         </w:tc>
@@ -12701,7 +14033,7 @@
           <w:sz w:val="17"/>
           <w:szCs w:val="17"/>
         </w:rPr>
-        <w:t xml:space="preserve">Squat 40–42.5 lb × 5 @ 2 RIR. Hip thrust 55–60 lb × 5. Plank 60s. Right shoulder unilateral load within 20% of left on single-arm row.</w:t>
+        <w:t xml:space="preserve">Squat 40–42.5 lb × 5 @ 2 RIR. Hip thrust 55–60 lb × 5. Plank 60s. Right shoulder unilateral load within 20% of left on single-arm row. Week 4 closes with the strength check; the planned lighter week that follows (Week 5, flexible — see the note above) consolidates before Weeks 6-8 rebuild.</w:t>
       </w:r>
     </w:p>
     <w:p>
@@ -12726,7 +14058,7 @@
           <w:sz w:val="17"/>
           <w:szCs w:val="17"/>
         </w:rPr>
-        <w:t xml:space="preserve">Squat 45–50 lb × 5 @ 2 RIR. Deadlift and lunge baselines established and progressing. Plank 70–75s. Left/right leg LST gap reduced from 0.7 lbs.</w:t>
+        <w:t xml:space="preserve">Squat 45–50 lb × 5 @ 2 RIR (reached through the Wk4 check, the flexible Week 5 lighter week, and the Weeks 6-8 rebuild). Deadlift and lunge baselines established and progressing. Plank 70–75s. Left/right leg LST gap reduced from 0.7 lbs.</w:t>
       </w:r>
     </w:p>
     <w:p>
@@ -12751,7 +14083,7 @@
           <w:sz w:val="17"/>
           <w:szCs w:val="17"/>
         </w:rPr>
-        <w:t xml:space="preserve">Rebook Styku scan at 8 weeks. Track: ALST Index trend toward 5.5 kg/m², body fat % direction, left/right leg LST gap, and right shoulder force output vs. left on the extension test.</w:t>
+        <w:t xml:space="preserve">Two clocks run here: strength is re-checked every 4 weeks (the Week 4 check, then the Week 8 retest at the end of the rebuild), while the Styku body-composition scan runs on its own 8-12-week cadence — book one in that window. Track: ALST Index trend toward 5.5 kg/m², body fat % direction, left/right leg LST gap, and right shoulder force output vs. left on the extension test.</w:t>
       </w:r>
     </w:p>
     <w:p>

</xml_diff>